<commit_message>
strip example column with client data from FT template
</commit_message>
<xml_diff>
--- a/lib/briefing/templates/FT.docx
+++ b/lib/briefing/templates/FT.docx
@@ -1556,7 +1556,6 @@
                             <w:tblGrid>
                               <w:gridCol w:w="2693"/>
                               <w:gridCol w:w="6508"/>
-                              <w:gridCol w:w="6508"/>
                             </w:tblGrid>
                             <w:tr>
                               <w:trPr>
@@ -1620,154 +1619,6 @@
                                     </w:rPr>
                                     <w:fldChar w:fldCharType="begin"/>
                                     <w:t xml:space="preserve">+++opdrachtgever+++</w:t>
-                                  </w:r>
-                                </w:p>
-                              </w:tc>
-                              <w:tc>
-                                <w:tcPr>
-                                  <w:tcW w:w="6508" w:type="dxa"/>
-                                  <w:tcBorders>
-                                    <w:top w:val="single" w:sz="4" w:space="0" w:color="auto"/>
-                                  </w:tcBorders>
-                                  <w:shd w:val="clear" w:color="auto" w:fill="FFFFFF" w:themeFill="background1"/>
-                                  <w:vAlign w:val="center"/>
-                                </w:tcPr>
-                                <w:p>
-                                  <w:pPr>
-                                    <w:pStyle w:val="Geenafstand"/>
-                                    <w:jc w:val="both"/>
-                                    <w:cnfStyle w:val="000000000000" w:firstRow="0" w:lastRow="0" w:firstColumn="0" w:lastColumn="0" w:oddVBand="0" w:evenVBand="0" w:oddHBand="0" w:evenHBand="0" w:firstRowFirstColumn="0" w:firstRowLastColumn="0" w:lastRowFirstColumn="0" w:lastRowLastColumn="0"/>
-                                    <w:rPr>
-                                      <w:rFonts w:ascii="Calibri" w:eastAsia="Noto Sans JP Regular" w:hAnsi="Calibri" w:cs="Calibri"/>
-                                      <w:sz w:val="25"/>
-                                      <w:szCs w:val="25"/>
-                                      <w:highlight w:val="yellow"/>
-                                    </w:rPr>
-                                  </w:pPr>
-                                  <w:r>
-                                    <w:rPr>
-                                      <w:rFonts w:ascii="Calibri" w:eastAsia="Noto Sans JP Regular" w:hAnsi="Calibri" w:cs="Calibri"/>
-                                      <w:sz w:val="25"/>
-                                      <w:szCs w:val="25"/>
-                                    </w:rPr>
-                                    <w:t>C</w:t>
-                                  </w:r>
-                                  <w:r>
-                                    <w:rPr>
-                                      <w:rFonts w:ascii="Calibri" w:eastAsia="Noto Sans JP Regular" w:hAnsi="Calibri" w:cs="Calibri"/>
-                                      <w:sz w:val="25"/>
-                                      <w:szCs w:val="25"/>
-                                    </w:rPr>
-                                    <w:t xml:space="preserve">oöperatie </w:t>
-                                  </w:r>
-                                  <w:proofErr w:type="spellStart"/>
-                                  <w:r>
-                                    <w:rPr>
-                                      <w:rFonts w:ascii="Calibri" w:eastAsia="Noto Sans JP Regular" w:hAnsi="Calibri" w:cs="Calibri"/>
-                                      <w:sz w:val="25"/>
-                                      <w:szCs w:val="25"/>
-                                    </w:rPr>
-                                    <w:t>Dela</w:t>
-                                  </w:r>
-                                  <w:proofErr w:type="spellEnd"/>
-                                </w:p>
-                              </w:tc>
-                            </w:tr>
-                            <w:tr>
-                              <w:trPr>
-                                <w:cnfStyle w:val="100000000000" w:firstRow="1" w:lastRow="0" w:firstColumn="0" w:lastColumn="0" w:oddVBand="0" w:evenVBand="0" w:oddHBand="0" w:evenHBand="0" w:firstRowFirstColumn="0" w:firstRowLastColumn="0" w:lastRowFirstColumn="0" w:lastRowLastColumn="0"/>
-                                <w:trHeight w:val="539"/>
-                              </w:trPr>
-                              <w:tc>
-                                <w:tcPr>
-                                  <w:cnfStyle w:val="001000000000" w:firstRow="0" w:lastRow="0" w:firstColumn="1" w:lastColumn="0" w:oddVBand="0" w:evenVBand="0" w:oddHBand="0" w:evenHBand="0" w:firstRowFirstColumn="0" w:firstRowLastColumn="0" w:lastRowFirstColumn="0" w:lastRowLastColumn="0"/>
-                                  <w:tcW w:w="2693" w:type="dxa"/>
-                                  <w:tcBorders>
-                                    <w:bottom w:val="single" w:sz="4" w:space="0" w:color="auto"/>
-                                  </w:tcBorders>
-                                  <w:shd w:val="clear" w:color="auto" w:fill="F2F2F2" w:themeFill="background1" w:themeFillShade="F2"/>
-                                  <w:vAlign w:val="center"/>
-                                </w:tcPr>
-                                <w:p>
-                                  <w:pPr>
-                                    <w:pStyle w:val="Geenafstand"/>
-                                    <w:jc w:val="both"/>
-                                    <w:rPr>
-                                      <w:rFonts w:ascii="Calibri" w:eastAsia="Noto Sans JP Regular" w:hAnsi="Calibri" w:cs="Calibri"/>
-                                      <w:sz w:val="25"/>
-                                      <w:szCs w:val="25"/>
-                                    </w:rPr>
-                                  </w:pPr>
-                                  <w:r>
-                                    <w:rPr>
-                                      <w:rFonts w:ascii="Calibri" w:eastAsia="Noto Sans JP Regular" w:hAnsi="Calibri" w:cs="Calibri"/>
-                                      <w:sz w:val="25"/>
-                                      <w:szCs w:val="25"/>
-                                    </w:rPr>
-                                    <w:t xml:space="preserve">Training</w:t>
-                                  </w:r>
-                                </w:p>
-                              </w:tc>
-                              <w:tc>
-                                <w:tcPr>
-                                  <w:tcW w:w="6508" w:type="dxa"/>
-                                  <w:tcBorders>
-                                    <w:bottom w:val="single" w:sz="4" w:space="0" w:color="auto"/>
-                                  </w:tcBorders>
-                                  <w:shd w:val="clear" w:color="auto" w:fill="FFFFFF" w:themeFill="background1"/>
-                                  <w:vAlign w:val="center"/>
-                                </w:tcPr>
-                                <w:p>
-                                  <w:pPr>
-                                    <w:pStyle w:val="Geenafstand"/>
-                                    <w:jc w:val="both"/>
-                                    <w:cnfStyle w:val="100000000000" w:firstRow="1" w:lastRow="0" w:firstColumn="0" w:lastColumn="0" w:oddVBand="0" w:evenVBand="0" w:oddHBand="0" w:evenHBand="0" w:firstRowFirstColumn="0" w:firstRowLastColumn="0" w:lastRowFirstColumn="0" w:lastRowLastColumn="0"/>
-                                    <w:rPr>
-                                      <w:rFonts w:ascii="Calibri" w:eastAsia="Noto Sans JP Regular" w:hAnsi="Calibri" w:cs="Calibri"/>
-                                      <w:sz w:val="25"/>
-                                      <w:szCs w:val="25"/>
-                                    </w:rPr>
-                                  </w:pPr>
-                                  <w:r>
-                                    <w:rPr>
-                                      <w:rFonts w:ascii="Calibri" w:eastAsia="Noto Sans JP Regular" w:hAnsi="Calibri" w:cs="Calibri"/>
-                                      <w:sz w:val="25"/>
-                                      <w:szCs w:val="25"/>
-                                    </w:rPr>
-                                    <w:fldChar w:fldCharType="begin"/>
-                                    <w:t xml:space="preserve">+++thema+++</w:t>
-                                  </w:r>
-                                </w:p>
-                              </w:tc>
-                              <w:tc>
-                                <w:tcPr>
-                                  <w:tcW w:w="6508" w:type="dxa"/>
-                                  <w:tcBorders>
-                                    <w:bottom w:val="single" w:sz="4" w:space="0" w:color="auto"/>
-                                  </w:tcBorders>
-                                  <w:shd w:val="clear" w:color="auto" w:fill="FFFFFF" w:themeFill="background1"/>
-                                  <w:vAlign w:val="center"/>
-                                </w:tcPr>
-                                <w:p>
-                                  <w:pPr>
-                                    <w:pStyle w:val="Geenafstand"/>
-                                    <w:jc w:val="both"/>
-                                    <w:cnfStyle w:val="100000000000" w:firstRow="1" w:lastRow="0" w:firstColumn="0" w:lastColumn="0" w:oddVBand="0" w:evenVBand="0" w:oddHBand="0" w:evenHBand="0" w:firstRowFirstColumn="0" w:firstRowLastColumn="0" w:lastRowFirstColumn="0" w:lastRowLastColumn="0"/>
-                                    <w:rPr>
-                                      <w:rFonts w:ascii="Calibri" w:eastAsia="Noto Sans JP Regular" w:hAnsi="Calibri" w:cs="Calibri"/>
-                                      <w:b w:val="0"/>
-                                      <w:bCs w:val="0"/>
-                                      <w:sz w:val="25"/>
-                                      <w:szCs w:val="25"/>
-                                    </w:rPr>
-                                  </w:pPr>
-                                  <w:r>
-                                    <w:rPr>
-                                      <w:rFonts w:ascii="Calibri" w:eastAsia="Noto Sans JP Regular" w:hAnsi="Calibri" w:cs="Calibri"/>
-                                      <w:sz w:val="25"/>
-                                      <w:szCs w:val="25"/>
-                                    </w:rPr>
-                                    <w:t>Ontdek elkaars kantoor DNA</w:t>
                                   </w:r>
                                 </w:p>
                               </w:tc>
@@ -1803,7 +1654,7 @@
                                       <w:sz w:val="25"/>
                                       <w:szCs w:val="25"/>
                                     </w:rPr>
-                                    <w:t xml:space="preserve">Klanttitel</w:t>
+                                    <w:t xml:space="preserve">Training</w:t>
                                   </w:r>
                                 </w:p>
                               </w:tc>
@@ -1834,495 +1685,7 @@
                                       <w:szCs w:val="25"/>
                                     </w:rPr>
                                     <w:fldChar w:fldCharType="begin"/>
-                                    <w:t xml:space="preserve">+++klanttitel+++</w:t>
-                                  </w:r>
-                                </w:p>
-                              </w:tc>
-                              <w:tc>
-                                <w:tcPr>
-                                  <w:tcW w:w="6508" w:type="dxa"/>
-                                  <w:tcBorders>
-                                    <w:bottom w:val="single" w:sz="4" w:space="0" w:color="auto"/>
-                                  </w:tcBorders>
-                                  <w:shd w:val="clear" w:color="auto" w:fill="FFFFFF" w:themeFill="background1"/>
-                                  <w:vAlign w:val="center"/>
-                                </w:tcPr>
-                                <w:p>
-                                  <w:pPr>
-                                    <w:pStyle w:val="Geenafstand"/>
-                                    <w:jc w:val="both"/>
-                                    <w:cnfStyle w:val="100000000000" w:firstRow="1" w:lastRow="0" w:firstColumn="0" w:lastColumn="0" w:oddVBand="0" w:evenVBand="0" w:oddHBand="0" w:evenHBand="0" w:firstRowFirstColumn="0" w:firstRowLastColumn="0" w:lastRowFirstColumn="0" w:lastRowLastColumn="0"/>
-                                    <w:rPr>
-                                      <w:rFonts w:ascii="Calibri" w:eastAsia="Noto Sans JP Regular" w:hAnsi="Calibri" w:cs="Calibri"/>
-                                      <w:b w:val="0"/>
-                                      <w:bCs w:val="0"/>
-                                      <w:sz w:val="25"/>
-                                      <w:szCs w:val="25"/>
-                                    </w:rPr>
-                                  </w:pPr>
-                                  <w:r>
-                                    <w:rPr>
-                                      <w:rFonts w:ascii="Calibri" w:eastAsia="Noto Sans JP Regular" w:hAnsi="Calibri" w:cs="Calibri"/>
-                                      <w:sz w:val="25"/>
-                                      <w:szCs w:val="25"/>
-                                    </w:rPr>
-                                    <w:t>Ontdek elkaars kantoor DNA</w:t>
-                                  </w:r>
-                                </w:p>
-                              </w:tc>
-                            </w:tr>
-                            <w:tr>
-                              <w:trPr>
-                                <w:cnfStyle w:val="000000100000" w:firstRow="0" w:lastRow="0" w:firstColumn="0" w:lastColumn="0" w:oddVBand="0" w:evenVBand="0" w:oddHBand="1" w:evenHBand="0" w:firstRowFirstColumn="0" w:firstRowLastColumn="0" w:lastRowFirstColumn="0" w:lastRowLastColumn="0"/>
-                                <w:trHeight w:val="539"/>
-                              </w:trPr>
-                              <w:tc>
-                                <w:tcPr>
-                                  <w:cnfStyle w:val="001000000000" w:firstRow="0" w:lastRow="0" w:firstColumn="1" w:lastColumn="0" w:oddVBand="0" w:evenVBand="0" w:oddHBand="0" w:evenHBand="0" w:firstRowFirstColumn="0" w:firstRowLastColumn="0" w:lastRowFirstColumn="0" w:lastRowLastColumn="0"/>
-                                  <w:tcW w:w="2693" w:type="dxa"/>
-                                  <w:tcBorders>
-                                    <w:top w:val="single" w:sz="4" w:space="0" w:color="auto"/>
-                                  </w:tcBorders>
-                                  <w:vAlign w:val="center"/>
-                                </w:tcPr>
-                                <w:p>
-                                  <w:pPr>
-                                    <w:pStyle w:val="Geenafstand"/>
-                                    <w:jc w:val="both"/>
-                                    <w:rPr>
-                                      <w:rFonts w:ascii="Calibri" w:eastAsia="Noto Sans JP Regular" w:hAnsi="Calibri" w:cs="Calibri"/>
-                                      <w:sz w:val="25"/>
-                                      <w:szCs w:val="25"/>
-                                    </w:rPr>
-                                  </w:pPr>
-                                  <w:r>
-                                    <w:rPr>
-                                      <w:rFonts w:ascii="Calibri" w:eastAsia="Noto Sans JP Regular" w:hAnsi="Calibri" w:cs="Calibri"/>
-                                      <w:sz w:val="25"/>
-                                      <w:szCs w:val="25"/>
-                                    </w:rPr>
-                                    <w:t xml:space="preserve">Duur</w:t>
-                                  </w:r>
-                                </w:p>
-                              </w:tc>
-                              <w:tc>
-                                <w:tcPr>
-                                  <w:tcW w:w="6508" w:type="dxa"/>
-                                  <w:tcBorders>
-                                    <w:top w:val="single" w:sz="4" w:space="0" w:color="auto"/>
-                                  </w:tcBorders>
-                                  <w:shd w:val="clear" w:color="auto" w:fill="FFFFFF" w:themeFill="background1"/>
-                                  <w:vAlign w:val="center"/>
-                                </w:tcPr>
-                                <w:p>
-                                  <w:pPr>
-                                    <w:pStyle w:val="Geenafstand"/>
-                                    <w:jc w:val="both"/>
-                                    <w:cnfStyle w:val="000000100000" w:firstRow="0" w:lastRow="0" w:firstColumn="0" w:lastColumn="0" w:oddVBand="0" w:evenVBand="0" w:oddHBand="1" w:evenHBand="0" w:firstRowFirstColumn="0" w:firstRowLastColumn="0" w:lastRowFirstColumn="0" w:lastRowLastColumn="0"/>
-                                    <w:rPr>
-                                      <w:rFonts w:ascii="Calibri" w:eastAsia="Noto Sans JP Regular" w:hAnsi="Calibri" w:cs="Calibri"/>
-                                      <w:sz w:val="25"/>
-                                      <w:szCs w:val="25"/>
-                                    </w:rPr>
-                                  </w:pPr>
-                                  <w:r>
-                                    <w:rPr>
-                                      <w:rFonts w:ascii="Calibri" w:eastAsia="Noto Sans JP Regular" w:hAnsi="Calibri" w:cs="Calibri"/>
-                                      <w:sz w:val="25"/>
-                                      <w:szCs w:val="25"/>
-                                    </w:rPr>
-                                    <w:fldChar w:fldCharType="begin"/>
-                                    <w:t xml:space="preserve">+++duur+++</w:t>
-                                  </w:r>
-                                </w:p>
-                              </w:tc>
-                              <w:tc>
-                                <w:tcPr>
-                                  <w:tcW w:w="6508" w:type="dxa"/>
-                                  <w:tcBorders>
-                                    <w:top w:val="single" w:sz="4" w:space="0" w:color="auto"/>
-                                  </w:tcBorders>
-                                  <w:shd w:val="clear" w:color="auto" w:fill="FFFFFF" w:themeFill="background1"/>
-                                  <w:vAlign w:val="center"/>
-                                </w:tcPr>
-                                <w:p>
-                                  <w:pPr>
-                                    <w:pStyle w:val="Geenafstand"/>
-                                    <w:jc w:val="both"/>
-                                    <w:cnfStyle w:val="000000100000" w:firstRow="0" w:lastRow="0" w:firstColumn="0" w:lastColumn="0" w:oddVBand="0" w:evenVBand="0" w:oddHBand="1" w:evenHBand="0" w:firstRowFirstColumn="0" w:firstRowLastColumn="0" w:lastRowFirstColumn="0" w:lastRowLastColumn="0"/>
-                                    <w:rPr>
-                                      <w:rFonts w:ascii="Calibri" w:eastAsia="Noto Sans JP Regular" w:hAnsi="Calibri" w:cs="Calibri"/>
-                                      <w:sz w:val="25"/>
-                                      <w:szCs w:val="25"/>
-                                    </w:rPr>
-                                  </w:pPr>
-                                  <w:r>
-                                    <w:rPr>
-                                      <w:rFonts w:ascii="Calibri" w:eastAsia="Noto Sans JP Regular" w:hAnsi="Calibri" w:cs="Calibri"/>
-                                      <w:sz w:val="25"/>
-                                      <w:szCs w:val="25"/>
-                                    </w:rPr>
-                                    <w:t xml:space="preserve">Beide trainingen duren vier uur </w:t>
-                                  </w:r>
-                                </w:p>
-                              </w:tc>
-                            </w:tr>
-                            <w:tr>
-                              <w:trPr>
-                                <w:trHeight w:val="539"/>
-                              </w:trPr>
-                              <w:tc>
-                                <w:tcPr>
-                                  <w:cnfStyle w:val="001000000000" w:firstRow="0" w:lastRow="0" w:firstColumn="1" w:lastColumn="0" w:oddVBand="0" w:evenVBand="0" w:oddHBand="0" w:evenHBand="0" w:firstRowFirstColumn="0" w:firstRowLastColumn="0" w:lastRowFirstColumn="0" w:lastRowLastColumn="0"/>
-                                  <w:tcW w:w="2693" w:type="dxa"/>
-                                  <w:shd w:val="clear" w:color="auto" w:fill="F2F2F2" w:themeFill="background1" w:themeFillShade="F2"/>
-                                  <w:vAlign w:val="center"/>
-                                </w:tcPr>
-                                <w:p>
-                                  <w:pPr>
-                                    <w:pStyle w:val="Geenafstand"/>
-                                    <w:jc w:val="both"/>
-                                    <w:rPr>
-                                      <w:rFonts w:ascii="Calibri" w:eastAsia="Noto Sans JP Regular" w:hAnsi="Calibri" w:cs="Calibri"/>
-                                      <w:sz w:val="25"/>
-                                      <w:szCs w:val="25"/>
-                                    </w:rPr>
-                                  </w:pPr>
-                                  <w:r>
-                                    <w:rPr>
-                                      <w:rFonts w:ascii="Calibri" w:eastAsia="Noto Sans JP Regular" w:hAnsi="Calibri" w:cs="Calibri"/>
-                                      <w:sz w:val="25"/>
-                                      <w:szCs w:val="25"/>
-                                    </w:rPr>
-                                    <w:t xml:space="preserve">Datum &amp; tijd</w:t>
-                                  </w:r>
-                                </w:p>
-                              </w:tc>
-                              <w:tc>
-                                <w:tcPr>
-                                  <w:tcW w:w="6508" w:type="dxa"/>
-                                  <w:shd w:val="clear" w:color="auto" w:fill="FFFFFF" w:themeFill="background1"/>
-                                  <w:vAlign w:val="center"/>
-                                </w:tcPr>
-                                <w:p>
-                                  <w:pPr>
-                                    <w:pStyle w:val="Geenafstand"/>
-                                    <w:cnfStyle w:val="000000000000" w:firstRow="0" w:lastRow="0" w:firstColumn="0" w:lastColumn="0" w:oddVBand="0" w:evenVBand="0" w:oddHBand="0" w:evenHBand="0" w:firstRowFirstColumn="0" w:firstRowLastColumn="0" w:lastRowFirstColumn="0" w:lastRowLastColumn="0"/>
-                                    <w:rPr>
-                                      <w:rFonts w:ascii="Calibri" w:eastAsia="Noto Sans JP Regular" w:hAnsi="Calibri" w:cs="Calibri"/>
-                                      <w:sz w:val="25"/>
-                                      <w:szCs w:val="25"/>
-                                    </w:rPr>
-                                  </w:pPr>
-                                  <w:r>
-                                    <w:rPr>
-                                      <w:rFonts w:ascii="Calibri" w:eastAsia="Noto Sans JP Regular" w:hAnsi="Calibri" w:cs="Calibri"/>
-                                      <w:sz w:val="25"/>
-                                      <w:szCs w:val="25"/>
-                                    </w:rPr>
-                                    <w:fldChar w:fldCharType="begin"/>
-                                    <w:t xml:space="preserve">+++datumTijd+++</w:t>
-                                  </w:r>
-                                </w:p>
-                              </w:tc>
-                              <w:tc>
-                                <w:tcPr>
-                                  <w:tcW w:w="6508" w:type="dxa"/>
-                                  <w:shd w:val="clear" w:color="auto" w:fill="FFFFFF" w:themeFill="background1"/>
-                                  <w:vAlign w:val="center"/>
-                                </w:tcPr>
-                                <w:p>
-                                  <w:pPr>
-                                    <w:pStyle w:val="Geenafstand"/>
-                                    <w:cnfStyle w:val="000000000000" w:firstRow="0" w:lastRow="0" w:firstColumn="0" w:lastColumn="0" w:oddVBand="0" w:evenVBand="0" w:oddHBand="0" w:evenHBand="0" w:firstRowFirstColumn="0" w:firstRowLastColumn="0" w:lastRowFirstColumn="0" w:lastRowLastColumn="0"/>
-                                    <w:rPr>
-                                      <w:rFonts w:ascii="Calibri" w:eastAsia="Noto Sans JP Regular" w:hAnsi="Calibri" w:cs="Calibri"/>
-                                      <w:sz w:val="25"/>
-                                      <w:szCs w:val="25"/>
-                                    </w:rPr>
-                                  </w:pPr>
-                                  <w:r>
-                                    <w:rPr>
-                                      <w:rFonts w:ascii="Calibri" w:eastAsia="Noto Sans JP Regular" w:hAnsi="Calibri" w:cs="Calibri"/>
-                                      <w:sz w:val="25"/>
-                                      <w:szCs w:val="25"/>
-                                    </w:rPr>
-                                    <w:t>Sessie 1: 10 februari 2026 van 9:00 uur tot 13:00</w:t>
-                                  </w:r>
-                                  <w:r>
-                                    <w:rPr>
-                                      <w:rFonts w:ascii="Calibri" w:eastAsia="Noto Sans JP Regular" w:hAnsi="Calibri" w:cs="Calibri"/>
-                                      <w:sz w:val="25"/>
-                                      <w:szCs w:val="25"/>
-                                    </w:rPr>
-                                    <w:br/>
-                                    <w:t>Sessie 2: 3 maart 2026 van 9:00 uur tot 13:00 uur</w:t>
-                                  </w:r>
-                                </w:p>
-                              </w:tc>
-                            </w:tr>
-                            <w:tr>
-                              <w:trPr>
-                                <w:cnfStyle w:val="000000100000" w:firstRow="0" w:lastRow="0" w:firstColumn="0" w:lastColumn="0" w:oddVBand="0" w:evenVBand="0" w:oddHBand="1" w:evenHBand="0" w:firstRowFirstColumn="0" w:firstRowLastColumn="0" w:lastRowFirstColumn="0" w:lastRowLastColumn="0"/>
-                                <w:trHeight w:val="539"/>
-                              </w:trPr>
-                              <w:tc>
-                                <w:tcPr>
-                                  <w:cnfStyle w:val="001000000000" w:firstRow="0" w:lastRow="0" w:firstColumn="1" w:lastColumn="0" w:oddVBand="0" w:evenVBand="0" w:oddHBand="0" w:evenHBand="0" w:firstRowFirstColumn="0" w:firstRowLastColumn="0" w:lastRowFirstColumn="0" w:lastRowLastColumn="0"/>
-                                  <w:tcW w:w="2693" w:type="dxa"/>
-                                  <w:vAlign w:val="center"/>
-                                </w:tcPr>
-                                <w:p>
-                                  <w:pPr>
-                                    <w:pStyle w:val="Geenafstand"/>
-                                    <w:jc w:val="both"/>
-                                    <w:rPr>
-                                      <w:rFonts w:ascii="Calibri" w:eastAsia="Noto Sans JP Regular" w:hAnsi="Calibri" w:cs="Calibri"/>
-                                      <w:sz w:val="25"/>
-                                      <w:szCs w:val="25"/>
-                                    </w:rPr>
-                                  </w:pPr>
-                                  <w:r>
-                                    <w:rPr>
-                                      <w:rFonts w:ascii="Calibri" w:eastAsia="Noto Sans JP Regular" w:hAnsi="Calibri" w:cs="Calibri"/>
-                                      <w:sz w:val="25"/>
-                                      <w:szCs w:val="25"/>
-                                    </w:rPr>
-                                    <w:t xml:space="preserve">Groepsgrootte</w:t>
-                                  </w:r>
-                                </w:p>
-                              </w:tc>
-                              <w:tc>
-                                <w:tcPr>
-                                  <w:tcW w:w="6508" w:type="dxa"/>
-                                  <w:shd w:val="clear" w:color="auto" w:fill="FFFFFF" w:themeFill="background1"/>
-                                  <w:vAlign w:val="center"/>
-                                </w:tcPr>
-                                <w:p>
-                                  <w:pPr>
-                                    <w:pStyle w:val="Geenafstand"/>
-                                    <w:jc w:val="both"/>
-                                    <w:cnfStyle w:val="000000100000" w:firstRow="0" w:lastRow="0" w:firstColumn="0" w:lastColumn="0" w:oddVBand="0" w:evenVBand="0" w:oddHBand="1" w:evenHBand="0" w:firstRowFirstColumn="0" w:firstRowLastColumn="0" w:lastRowFirstColumn="0" w:lastRowLastColumn="0"/>
-                                    <w:rPr>
-                                      <w:rFonts w:ascii="Calibri" w:eastAsia="Noto Sans JP Regular" w:hAnsi="Calibri" w:cs="Calibri"/>
-                                      <w:sz w:val="25"/>
-                                      <w:szCs w:val="25"/>
-                                    </w:rPr>
-                                  </w:pPr>
-                                  <w:r>
-                                    <w:rPr>
-                                      <w:rFonts w:ascii="Calibri" w:eastAsia="Noto Sans JP Regular" w:hAnsi="Calibri" w:cs="Calibri"/>
-                                      <w:sz w:val="25"/>
-                                      <w:szCs w:val="25"/>
-                                    </w:rPr>
-                                    <w:fldChar w:fldCharType="begin"/>
-                                    <w:t xml:space="preserve">+++groepsgrootte+++</w:t>
-                                  </w:r>
-                                </w:p>
-                              </w:tc>
-                              <w:tc>
-                                <w:tcPr>
-                                  <w:tcW w:w="6508" w:type="dxa"/>
-                                  <w:shd w:val="clear" w:color="auto" w:fill="FFFFFF" w:themeFill="background1"/>
-                                  <w:vAlign w:val="center"/>
-                                </w:tcPr>
-                                <w:p>
-                                  <w:pPr>
-                                    <w:pStyle w:val="Geenafstand"/>
-                                    <w:jc w:val="both"/>
-                                    <w:cnfStyle w:val="000000100000" w:firstRow="0" w:lastRow="0" w:firstColumn="0" w:lastColumn="0" w:oddVBand="0" w:evenVBand="0" w:oddHBand="1" w:evenHBand="0" w:firstRowFirstColumn="0" w:firstRowLastColumn="0" w:lastRowFirstColumn="0" w:lastRowLastColumn="0"/>
-                                    <w:rPr>
-                                      <w:rFonts w:ascii="Calibri" w:eastAsia="Noto Sans JP Regular" w:hAnsi="Calibri" w:cs="Calibri"/>
-                                      <w:sz w:val="25"/>
-                                      <w:szCs w:val="25"/>
-                                    </w:rPr>
-                                  </w:pPr>
-                                  <w:r>
-                                    <w:rPr>
-                                      <w:rFonts w:ascii="Calibri" w:eastAsia="Noto Sans JP Regular" w:hAnsi="Calibri" w:cs="Calibri"/>
-                                      <w:sz w:val="25"/>
-                                      <w:szCs w:val="25"/>
-                                    </w:rPr>
-                                    <w:t xml:space="preserve">Beide trainingen hebben zes deelnemers </w:t>
-                                  </w:r>
-                                </w:p>
-                              </w:tc>
-                            </w:tr>
-                            <w:tr>
-                              <w:trPr>
-                                <w:trHeight w:val="539"/>
-                              </w:trPr>
-                              <w:tc>
-                                <w:tcPr>
-                                  <w:cnfStyle w:val="001000000000" w:firstRow="0" w:lastRow="0" w:firstColumn="1" w:lastColumn="0" w:oddVBand="0" w:evenVBand="0" w:oddHBand="0" w:evenHBand="0" w:firstRowFirstColumn="0" w:firstRowLastColumn="0" w:lastRowFirstColumn="0" w:lastRowLastColumn="0"/>
-                                  <w:tcW w:w="2693" w:type="dxa"/>
-                                  <w:shd w:val="clear" w:color="auto" w:fill="F2F2F2" w:themeFill="background1" w:themeFillShade="F2"/>
-                                  <w:vAlign w:val="center"/>
-                                </w:tcPr>
-                                <w:p>
-                                  <w:pPr>
-                                    <w:pStyle w:val="Geenafstand"/>
-                                    <w:jc w:val="both"/>
-                                    <w:rPr>
-                                      <w:rFonts w:ascii="Calibri" w:eastAsia="Noto Sans JP Regular" w:hAnsi="Calibri" w:cs="Calibri"/>
-                                      <w:sz w:val="25"/>
-                                      <w:szCs w:val="25"/>
-                                    </w:rPr>
-                                  </w:pPr>
-                                  <w:r>
-                                    <w:rPr>
-                                      <w:rFonts w:ascii="Calibri" w:eastAsia="Noto Sans JP Regular" w:hAnsi="Calibri" w:cs="Calibri"/>
-                                      <w:sz w:val="25"/>
-                                      <w:szCs w:val="25"/>
-                                    </w:rPr>
-                                    <w:t xml:space="preserve">Trainingslocatie</w:t>
-                                  </w:r>
-                                </w:p>
-                              </w:tc>
-                              <w:tc>
-                                <w:tcPr>
-                                  <w:tcW w:w="6508" w:type="dxa"/>
-                                  <w:vAlign w:val="center"/>
-                                </w:tcPr>
-                                <w:p>
-                                  <w:pPr>
-                                    <w:pStyle w:val="Geenafstand"/>
-                                    <w:jc w:val="both"/>
-                                    <w:cnfStyle w:val="000000000000" w:firstRow="0" w:lastRow="0" w:firstColumn="0" w:lastColumn="0" w:oddVBand="0" w:evenVBand="0" w:oddHBand="0" w:evenHBand="0" w:firstRowFirstColumn="0" w:firstRowLastColumn="0" w:lastRowFirstColumn="0" w:lastRowLastColumn="0"/>
-                                    <w:rPr>
-                                      <w:rFonts w:ascii="Calibri" w:eastAsia="Noto Sans JP Regular" w:hAnsi="Calibri" w:cs="Calibri"/>
-                                      <w:sz w:val="25"/>
-                                      <w:szCs w:val="25"/>
-                                    </w:rPr>
-                                  </w:pPr>
-                                  <w:r>
-                                    <w:rPr>
-                                      <w:rFonts w:ascii="Calibri" w:eastAsia="Noto Sans JP Regular" w:hAnsi="Calibri" w:cs="Calibri"/>
-                                      <w:sz w:val="25"/>
-                                      <w:szCs w:val="25"/>
-                                    </w:rPr>
-                                    <w:fldChar w:fldCharType="begin"/>
-                                    <w:t xml:space="preserve">+++locatie+++</w:t>
-                                  </w:r>
-                                </w:p>
-                              </w:tc>
-                              <w:tc>
-                                <w:tcPr>
-                                  <w:tcW w:w="6508" w:type="dxa"/>
-                                  <w:vAlign w:val="center"/>
-                                </w:tcPr>
-                                <w:p>
-                                  <w:pPr>
-                                    <w:pStyle w:val="Geenafstand"/>
-                                    <w:jc w:val="both"/>
-                                    <w:cnfStyle w:val="000000000000" w:firstRow="0" w:lastRow="0" w:firstColumn="0" w:lastColumn="0" w:oddVBand="0" w:evenVBand="0" w:oddHBand="0" w:evenHBand="0" w:firstRowFirstColumn="0" w:firstRowLastColumn="0" w:lastRowFirstColumn="0" w:lastRowLastColumn="0"/>
-                                    <w:rPr>
-                                      <w:rFonts w:ascii="Calibri" w:eastAsia="Noto Sans JP Regular" w:hAnsi="Calibri" w:cs="Calibri"/>
-                                      <w:sz w:val="25"/>
-                                      <w:szCs w:val="25"/>
-                                    </w:rPr>
-                                  </w:pPr>
-                                  <w:r>
-                                    <w:rPr>
-                                      <w:rFonts w:ascii="Calibri" w:eastAsia="Noto Sans JP Regular" w:hAnsi="Calibri" w:cs="Calibri"/>
-                                      <w:sz w:val="25"/>
-                                      <w:szCs w:val="25"/>
-                                    </w:rPr>
-                                    <w:t>Oude Stadsgracht 1, 5611 DD Eindhoven</w:t>
-                                  </w:r>
-                                </w:p>
-                              </w:tc>
-                            </w:tr>
-                            <w:tr>
-                              <w:trPr>
-                                <w:cnfStyle w:val="000000100000" w:firstRow="0" w:lastRow="0" w:firstColumn="0" w:lastColumn="0" w:oddVBand="0" w:evenVBand="0" w:oddHBand="1" w:evenHBand="0" w:firstRowFirstColumn="0" w:firstRowLastColumn="0" w:lastRowFirstColumn="0" w:lastRowLastColumn="0"/>
-                                <w:trHeight w:val="539"/>
-                              </w:trPr>
-                              <w:tc>
-                                <w:tcPr>
-                                  <w:cnfStyle w:val="001000000000" w:firstRow="0" w:lastRow="0" w:firstColumn="1" w:lastColumn="0" w:oddVBand="0" w:evenVBand="0" w:oddHBand="0" w:evenHBand="0" w:firstRowFirstColumn="0" w:firstRowLastColumn="0" w:lastRowFirstColumn="0" w:lastRowLastColumn="0"/>
-                                  <w:tcW w:w="2693" w:type="dxa"/>
-                                  <w:tcBorders>
-                                    <w:bottom w:val="single" w:sz="4" w:space="0" w:color="auto"/>
-                                  </w:tcBorders>
-                                  <w:vAlign w:val="center"/>
-                                </w:tcPr>
-                                <w:p>
-                                  <w:pPr>
-                                    <w:pStyle w:val="Geenafstand"/>
-                                    <w:jc w:val="both"/>
-                                    <w:rPr>
-                                      <w:rFonts w:ascii="Calibri" w:eastAsia="Noto Sans JP Regular" w:hAnsi="Calibri" w:cs="Calibri"/>
-                                      <w:sz w:val="25"/>
-                                      <w:szCs w:val="25"/>
-                                    </w:rPr>
-                                  </w:pPr>
-                                  <w:r>
-                                    <w:rPr>
-                                      <w:rFonts w:ascii="Calibri" w:eastAsia="Noto Sans JP Regular" w:hAnsi="Calibri" w:cs="Calibri"/>
-                                      <w:sz w:val="25"/>
-                                      <w:szCs w:val="25"/>
-                                    </w:rPr>
-                                    <w:t xml:space="preserve">Voertaal</w:t>
-                                  </w:r>
-                                </w:p>
-                              </w:tc>
-                              <w:tc>
-                                <w:tcPr>
-                                  <w:tcW w:w="6508" w:type="dxa"/>
-                                  <w:tcBorders>
-                                    <w:bottom w:val="single" w:sz="4" w:space="0" w:color="auto"/>
-                                  </w:tcBorders>
-                                  <w:vAlign w:val="center"/>
-                                </w:tcPr>
-                                <w:p>
-                                  <w:pPr>
-                                    <w:pStyle w:val="Geenafstand"/>
-                                    <w:jc w:val="both"/>
-                                    <w:cnfStyle w:val="000000100000" w:firstRow="0" w:lastRow="0" w:firstColumn="0" w:lastColumn="0" w:oddVBand="0" w:evenVBand="0" w:oddHBand="1" w:evenHBand="0" w:firstRowFirstColumn="0" w:firstRowLastColumn="0" w:lastRowFirstColumn="0" w:lastRowLastColumn="0"/>
-                                    <w:rPr>
-                                      <w:rFonts w:ascii="Calibri" w:eastAsia="Noto Sans JP Regular" w:hAnsi="Calibri" w:cs="Calibri"/>
-                                      <w:sz w:val="25"/>
-                                      <w:szCs w:val="25"/>
-                                    </w:rPr>
-                                  </w:pPr>
-                                  <w:r>
-                                    <w:rPr>
-                                      <w:rFonts w:ascii="Calibri" w:eastAsia="Noto Sans JP Regular" w:hAnsi="Calibri" w:cs="Calibri"/>
-                                      <w:sz w:val="25"/>
-                                      <w:szCs w:val="25"/>
-                                      <w:highlight w:val="yellow"/>
-                                    </w:rPr>
-                                    <w:t xml:space="preserve">+++voertaal+++</w:t>
-                                  </w:r>
-                                </w:p>
-                              </w:tc>
-                              <w:tc>
-                                <w:tcPr>
-                                  <w:tcW w:w="6508" w:type="dxa"/>
-                                  <w:tcBorders>
-                                    <w:bottom w:val="single" w:sz="4" w:space="0" w:color="auto"/>
-                                  </w:tcBorders>
-                                  <w:vAlign w:val="center"/>
-                                </w:tcPr>
-                                <w:p>
-                                  <w:pPr>
-                                    <w:pStyle w:val="Geenafstand"/>
-                                    <w:jc w:val="both"/>
-                                    <w:cnfStyle w:val="000000100000" w:firstRow="0" w:lastRow="0" w:firstColumn="0" w:lastColumn="0" w:oddVBand="0" w:evenVBand="0" w:oddHBand="1" w:evenHBand="0" w:firstRowFirstColumn="0" w:firstRowLastColumn="0" w:lastRowFirstColumn="0" w:lastRowLastColumn="0"/>
-                                    <w:rPr>
-                                      <w:rFonts w:ascii="Calibri" w:eastAsia="Noto Sans JP Regular" w:hAnsi="Calibri" w:cs="Calibri"/>
-                                      <w:sz w:val="25"/>
-                                      <w:szCs w:val="25"/>
-                                    </w:rPr>
-                                  </w:pPr>
-                                  <w:r>
-                                    <w:rPr>
-                                      <w:rFonts w:ascii="Calibri" w:eastAsia="Noto Sans JP Regular" w:hAnsi="Calibri" w:cs="Calibri"/>
-                                      <w:sz w:val="25"/>
-                                      <w:szCs w:val="25"/>
-                                    </w:rPr>
-                                    <w:t xml:space="preserve">Nederlands </w:t>
+                                    <w:t xml:space="preserve">+++thema+++</w:t>
                                   </w:r>
                                 </w:p>
                               </w:tc>
@@ -2358,6 +1721,382 @@
                                       <w:sz w:val="25"/>
                                       <w:szCs w:val="25"/>
                                     </w:rPr>
+                                    <w:t xml:space="preserve">Klanttitel</w:t>
+                                  </w:r>
+                                </w:p>
+                              </w:tc>
+                              <w:tc>
+                                <w:tcPr>
+                                  <w:tcW w:w="6508" w:type="dxa"/>
+                                  <w:tcBorders>
+                                    <w:bottom w:val="single" w:sz="4" w:space="0" w:color="auto"/>
+                                  </w:tcBorders>
+                                  <w:shd w:val="clear" w:color="auto" w:fill="FFFFFF" w:themeFill="background1"/>
+                                  <w:vAlign w:val="center"/>
+                                </w:tcPr>
+                                <w:p>
+                                  <w:pPr>
+                                    <w:pStyle w:val="Geenafstand"/>
+                                    <w:jc w:val="both"/>
+                                    <w:cnfStyle w:val="100000000000" w:firstRow="1" w:lastRow="0" w:firstColumn="0" w:lastColumn="0" w:oddVBand="0" w:evenVBand="0" w:oddHBand="0" w:evenHBand="0" w:firstRowFirstColumn="0" w:firstRowLastColumn="0" w:lastRowFirstColumn="0" w:lastRowLastColumn="0"/>
+                                    <w:rPr>
+                                      <w:rFonts w:ascii="Calibri" w:eastAsia="Noto Sans JP Regular" w:hAnsi="Calibri" w:cs="Calibri"/>
+                                      <w:sz w:val="25"/>
+                                      <w:szCs w:val="25"/>
+                                    </w:rPr>
+                                  </w:pPr>
+                                  <w:r>
+                                    <w:rPr>
+                                      <w:rFonts w:ascii="Calibri" w:eastAsia="Noto Sans JP Regular" w:hAnsi="Calibri" w:cs="Calibri"/>
+                                      <w:sz w:val="25"/>
+                                      <w:szCs w:val="25"/>
+                                    </w:rPr>
+                                    <w:fldChar w:fldCharType="begin"/>
+                                    <w:t xml:space="preserve">+++klanttitel+++</w:t>
+                                  </w:r>
+                                </w:p>
+                              </w:tc>
+                            </w:tr>
+                            <w:tr>
+                              <w:trPr>
+                                <w:cnfStyle w:val="000000100000" w:firstRow="0" w:lastRow="0" w:firstColumn="0" w:lastColumn="0" w:oddVBand="0" w:evenVBand="0" w:oddHBand="1" w:evenHBand="0" w:firstRowFirstColumn="0" w:firstRowLastColumn="0" w:lastRowFirstColumn="0" w:lastRowLastColumn="0"/>
+                                <w:trHeight w:val="539"/>
+                              </w:trPr>
+                              <w:tc>
+                                <w:tcPr>
+                                  <w:cnfStyle w:val="001000000000" w:firstRow="0" w:lastRow="0" w:firstColumn="1" w:lastColumn="0" w:oddVBand="0" w:evenVBand="0" w:oddHBand="0" w:evenHBand="0" w:firstRowFirstColumn="0" w:firstRowLastColumn="0" w:lastRowFirstColumn="0" w:lastRowLastColumn="0"/>
+                                  <w:tcW w:w="2693" w:type="dxa"/>
+                                  <w:tcBorders>
+                                    <w:top w:val="single" w:sz="4" w:space="0" w:color="auto"/>
+                                  </w:tcBorders>
+                                  <w:vAlign w:val="center"/>
+                                </w:tcPr>
+                                <w:p>
+                                  <w:pPr>
+                                    <w:pStyle w:val="Geenafstand"/>
+                                    <w:jc w:val="both"/>
+                                    <w:rPr>
+                                      <w:rFonts w:ascii="Calibri" w:eastAsia="Noto Sans JP Regular" w:hAnsi="Calibri" w:cs="Calibri"/>
+                                      <w:sz w:val="25"/>
+                                      <w:szCs w:val="25"/>
+                                    </w:rPr>
+                                  </w:pPr>
+                                  <w:r>
+                                    <w:rPr>
+                                      <w:rFonts w:ascii="Calibri" w:eastAsia="Noto Sans JP Regular" w:hAnsi="Calibri" w:cs="Calibri"/>
+                                      <w:sz w:val="25"/>
+                                      <w:szCs w:val="25"/>
+                                    </w:rPr>
+                                    <w:t xml:space="preserve">Duur</w:t>
+                                  </w:r>
+                                </w:p>
+                              </w:tc>
+                              <w:tc>
+                                <w:tcPr>
+                                  <w:tcW w:w="6508" w:type="dxa"/>
+                                  <w:tcBorders>
+                                    <w:top w:val="single" w:sz="4" w:space="0" w:color="auto"/>
+                                  </w:tcBorders>
+                                  <w:shd w:val="clear" w:color="auto" w:fill="FFFFFF" w:themeFill="background1"/>
+                                  <w:vAlign w:val="center"/>
+                                </w:tcPr>
+                                <w:p>
+                                  <w:pPr>
+                                    <w:pStyle w:val="Geenafstand"/>
+                                    <w:jc w:val="both"/>
+                                    <w:cnfStyle w:val="000000100000" w:firstRow="0" w:lastRow="0" w:firstColumn="0" w:lastColumn="0" w:oddVBand="0" w:evenVBand="0" w:oddHBand="1" w:evenHBand="0" w:firstRowFirstColumn="0" w:firstRowLastColumn="0" w:lastRowFirstColumn="0" w:lastRowLastColumn="0"/>
+                                    <w:rPr>
+                                      <w:rFonts w:ascii="Calibri" w:eastAsia="Noto Sans JP Regular" w:hAnsi="Calibri" w:cs="Calibri"/>
+                                      <w:sz w:val="25"/>
+                                      <w:szCs w:val="25"/>
+                                    </w:rPr>
+                                  </w:pPr>
+                                  <w:r>
+                                    <w:rPr>
+                                      <w:rFonts w:ascii="Calibri" w:eastAsia="Noto Sans JP Regular" w:hAnsi="Calibri" w:cs="Calibri"/>
+                                      <w:sz w:val="25"/>
+                                      <w:szCs w:val="25"/>
+                                    </w:rPr>
+                                    <w:fldChar w:fldCharType="begin"/>
+                                    <w:t xml:space="preserve">+++duur+++</w:t>
+                                  </w:r>
+                                </w:p>
+                              </w:tc>
+                            </w:tr>
+                            <w:tr>
+                              <w:trPr>
+                                <w:trHeight w:val="539"/>
+                              </w:trPr>
+                              <w:tc>
+                                <w:tcPr>
+                                  <w:cnfStyle w:val="001000000000" w:firstRow="0" w:lastRow="0" w:firstColumn="1" w:lastColumn="0" w:oddVBand="0" w:evenVBand="0" w:oddHBand="0" w:evenHBand="0" w:firstRowFirstColumn="0" w:firstRowLastColumn="0" w:lastRowFirstColumn="0" w:lastRowLastColumn="0"/>
+                                  <w:tcW w:w="2693" w:type="dxa"/>
+                                  <w:shd w:val="clear" w:color="auto" w:fill="F2F2F2" w:themeFill="background1" w:themeFillShade="F2"/>
+                                  <w:vAlign w:val="center"/>
+                                </w:tcPr>
+                                <w:p>
+                                  <w:pPr>
+                                    <w:pStyle w:val="Geenafstand"/>
+                                    <w:jc w:val="both"/>
+                                    <w:rPr>
+                                      <w:rFonts w:ascii="Calibri" w:eastAsia="Noto Sans JP Regular" w:hAnsi="Calibri" w:cs="Calibri"/>
+                                      <w:sz w:val="25"/>
+                                      <w:szCs w:val="25"/>
+                                    </w:rPr>
+                                  </w:pPr>
+                                  <w:r>
+                                    <w:rPr>
+                                      <w:rFonts w:ascii="Calibri" w:eastAsia="Noto Sans JP Regular" w:hAnsi="Calibri" w:cs="Calibri"/>
+                                      <w:sz w:val="25"/>
+                                      <w:szCs w:val="25"/>
+                                    </w:rPr>
+                                    <w:t xml:space="preserve">Datum &amp; tijd</w:t>
+                                  </w:r>
+                                </w:p>
+                              </w:tc>
+                              <w:tc>
+                                <w:tcPr>
+                                  <w:tcW w:w="6508" w:type="dxa"/>
+                                  <w:shd w:val="clear" w:color="auto" w:fill="FFFFFF" w:themeFill="background1"/>
+                                  <w:vAlign w:val="center"/>
+                                </w:tcPr>
+                                <w:p>
+                                  <w:pPr>
+                                    <w:pStyle w:val="Geenafstand"/>
+                                    <w:cnfStyle w:val="000000000000" w:firstRow="0" w:lastRow="0" w:firstColumn="0" w:lastColumn="0" w:oddVBand="0" w:evenVBand="0" w:oddHBand="0" w:evenHBand="0" w:firstRowFirstColumn="0" w:firstRowLastColumn="0" w:lastRowFirstColumn="0" w:lastRowLastColumn="0"/>
+                                    <w:rPr>
+                                      <w:rFonts w:ascii="Calibri" w:eastAsia="Noto Sans JP Regular" w:hAnsi="Calibri" w:cs="Calibri"/>
+                                      <w:sz w:val="25"/>
+                                      <w:szCs w:val="25"/>
+                                    </w:rPr>
+                                  </w:pPr>
+                                  <w:r>
+                                    <w:rPr>
+                                      <w:rFonts w:ascii="Calibri" w:eastAsia="Noto Sans JP Regular" w:hAnsi="Calibri" w:cs="Calibri"/>
+                                      <w:sz w:val="25"/>
+                                      <w:szCs w:val="25"/>
+                                    </w:rPr>
+                                    <w:fldChar w:fldCharType="begin"/>
+                                    <w:t xml:space="preserve">+++datumTijd+++</w:t>
+                                  </w:r>
+                                </w:p>
+                              </w:tc>
+                            </w:tr>
+                            <w:tr>
+                              <w:trPr>
+                                <w:cnfStyle w:val="000000100000" w:firstRow="0" w:lastRow="0" w:firstColumn="0" w:lastColumn="0" w:oddVBand="0" w:evenVBand="0" w:oddHBand="1" w:evenHBand="0" w:firstRowFirstColumn="0" w:firstRowLastColumn="0" w:lastRowFirstColumn="0" w:lastRowLastColumn="0"/>
+                                <w:trHeight w:val="539"/>
+                              </w:trPr>
+                              <w:tc>
+                                <w:tcPr>
+                                  <w:cnfStyle w:val="001000000000" w:firstRow="0" w:lastRow="0" w:firstColumn="1" w:lastColumn="0" w:oddVBand="0" w:evenVBand="0" w:oddHBand="0" w:evenHBand="0" w:firstRowFirstColumn="0" w:firstRowLastColumn="0" w:lastRowFirstColumn="0" w:lastRowLastColumn="0"/>
+                                  <w:tcW w:w="2693" w:type="dxa"/>
+                                  <w:vAlign w:val="center"/>
+                                </w:tcPr>
+                                <w:p>
+                                  <w:pPr>
+                                    <w:pStyle w:val="Geenafstand"/>
+                                    <w:jc w:val="both"/>
+                                    <w:rPr>
+                                      <w:rFonts w:ascii="Calibri" w:eastAsia="Noto Sans JP Regular" w:hAnsi="Calibri" w:cs="Calibri"/>
+                                      <w:sz w:val="25"/>
+                                      <w:szCs w:val="25"/>
+                                    </w:rPr>
+                                  </w:pPr>
+                                  <w:r>
+                                    <w:rPr>
+                                      <w:rFonts w:ascii="Calibri" w:eastAsia="Noto Sans JP Regular" w:hAnsi="Calibri" w:cs="Calibri"/>
+                                      <w:sz w:val="25"/>
+                                      <w:szCs w:val="25"/>
+                                    </w:rPr>
+                                    <w:t xml:space="preserve">Groepsgrootte</w:t>
+                                  </w:r>
+                                </w:p>
+                              </w:tc>
+                              <w:tc>
+                                <w:tcPr>
+                                  <w:tcW w:w="6508" w:type="dxa"/>
+                                  <w:shd w:val="clear" w:color="auto" w:fill="FFFFFF" w:themeFill="background1"/>
+                                  <w:vAlign w:val="center"/>
+                                </w:tcPr>
+                                <w:p>
+                                  <w:pPr>
+                                    <w:pStyle w:val="Geenafstand"/>
+                                    <w:jc w:val="both"/>
+                                    <w:cnfStyle w:val="000000100000" w:firstRow="0" w:lastRow="0" w:firstColumn="0" w:lastColumn="0" w:oddVBand="0" w:evenVBand="0" w:oddHBand="1" w:evenHBand="0" w:firstRowFirstColumn="0" w:firstRowLastColumn="0" w:lastRowFirstColumn="0" w:lastRowLastColumn="0"/>
+                                    <w:rPr>
+                                      <w:rFonts w:ascii="Calibri" w:eastAsia="Noto Sans JP Regular" w:hAnsi="Calibri" w:cs="Calibri"/>
+                                      <w:sz w:val="25"/>
+                                      <w:szCs w:val="25"/>
+                                    </w:rPr>
+                                  </w:pPr>
+                                  <w:r>
+                                    <w:rPr>
+                                      <w:rFonts w:ascii="Calibri" w:eastAsia="Noto Sans JP Regular" w:hAnsi="Calibri" w:cs="Calibri"/>
+                                      <w:sz w:val="25"/>
+                                      <w:szCs w:val="25"/>
+                                    </w:rPr>
+                                    <w:fldChar w:fldCharType="begin"/>
+                                    <w:t xml:space="preserve">+++groepsgrootte+++</w:t>
+                                  </w:r>
+                                </w:p>
+                              </w:tc>
+                            </w:tr>
+                            <w:tr>
+                              <w:trPr>
+                                <w:trHeight w:val="539"/>
+                              </w:trPr>
+                              <w:tc>
+                                <w:tcPr>
+                                  <w:cnfStyle w:val="001000000000" w:firstRow="0" w:lastRow="0" w:firstColumn="1" w:lastColumn="0" w:oddVBand="0" w:evenVBand="0" w:oddHBand="0" w:evenHBand="0" w:firstRowFirstColumn="0" w:firstRowLastColumn="0" w:lastRowFirstColumn="0" w:lastRowLastColumn="0"/>
+                                  <w:tcW w:w="2693" w:type="dxa"/>
+                                  <w:shd w:val="clear" w:color="auto" w:fill="F2F2F2" w:themeFill="background1" w:themeFillShade="F2"/>
+                                  <w:vAlign w:val="center"/>
+                                </w:tcPr>
+                                <w:p>
+                                  <w:pPr>
+                                    <w:pStyle w:val="Geenafstand"/>
+                                    <w:jc w:val="both"/>
+                                    <w:rPr>
+                                      <w:rFonts w:ascii="Calibri" w:eastAsia="Noto Sans JP Regular" w:hAnsi="Calibri" w:cs="Calibri"/>
+                                      <w:sz w:val="25"/>
+                                      <w:szCs w:val="25"/>
+                                    </w:rPr>
+                                  </w:pPr>
+                                  <w:r>
+                                    <w:rPr>
+                                      <w:rFonts w:ascii="Calibri" w:eastAsia="Noto Sans JP Regular" w:hAnsi="Calibri" w:cs="Calibri"/>
+                                      <w:sz w:val="25"/>
+                                      <w:szCs w:val="25"/>
+                                    </w:rPr>
+                                    <w:t xml:space="preserve">Trainingslocatie</w:t>
+                                  </w:r>
+                                </w:p>
+                              </w:tc>
+                              <w:tc>
+                                <w:tcPr>
+                                  <w:tcW w:w="6508" w:type="dxa"/>
+                                  <w:vAlign w:val="center"/>
+                                </w:tcPr>
+                                <w:p>
+                                  <w:pPr>
+                                    <w:pStyle w:val="Geenafstand"/>
+                                    <w:jc w:val="both"/>
+                                    <w:cnfStyle w:val="000000000000" w:firstRow="0" w:lastRow="0" w:firstColumn="0" w:lastColumn="0" w:oddVBand="0" w:evenVBand="0" w:oddHBand="0" w:evenHBand="0" w:firstRowFirstColumn="0" w:firstRowLastColumn="0" w:lastRowFirstColumn="0" w:lastRowLastColumn="0"/>
+                                    <w:rPr>
+                                      <w:rFonts w:ascii="Calibri" w:eastAsia="Noto Sans JP Regular" w:hAnsi="Calibri" w:cs="Calibri"/>
+                                      <w:sz w:val="25"/>
+                                      <w:szCs w:val="25"/>
+                                    </w:rPr>
+                                  </w:pPr>
+                                  <w:r>
+                                    <w:rPr>
+                                      <w:rFonts w:ascii="Calibri" w:eastAsia="Noto Sans JP Regular" w:hAnsi="Calibri" w:cs="Calibri"/>
+                                      <w:sz w:val="25"/>
+                                      <w:szCs w:val="25"/>
+                                    </w:rPr>
+                                    <w:fldChar w:fldCharType="begin"/>
+                                    <w:t xml:space="preserve">+++locatie+++</w:t>
+                                  </w:r>
+                                </w:p>
+                              </w:tc>
+                            </w:tr>
+                            <w:tr>
+                              <w:trPr>
+                                <w:cnfStyle w:val="000000100000" w:firstRow="0" w:lastRow="0" w:firstColumn="0" w:lastColumn="0" w:oddVBand="0" w:evenVBand="0" w:oddHBand="1" w:evenHBand="0" w:firstRowFirstColumn="0" w:firstRowLastColumn="0" w:lastRowFirstColumn="0" w:lastRowLastColumn="0"/>
+                                <w:trHeight w:val="539"/>
+                              </w:trPr>
+                              <w:tc>
+                                <w:tcPr>
+                                  <w:cnfStyle w:val="001000000000" w:firstRow="0" w:lastRow="0" w:firstColumn="1" w:lastColumn="0" w:oddVBand="0" w:evenVBand="0" w:oddHBand="0" w:evenHBand="0" w:firstRowFirstColumn="0" w:firstRowLastColumn="0" w:lastRowFirstColumn="0" w:lastRowLastColumn="0"/>
+                                  <w:tcW w:w="2693" w:type="dxa"/>
+                                  <w:tcBorders>
+                                    <w:bottom w:val="single" w:sz="4" w:space="0" w:color="auto"/>
+                                  </w:tcBorders>
+                                  <w:vAlign w:val="center"/>
+                                </w:tcPr>
+                                <w:p>
+                                  <w:pPr>
+                                    <w:pStyle w:val="Geenafstand"/>
+                                    <w:jc w:val="both"/>
+                                    <w:rPr>
+                                      <w:rFonts w:ascii="Calibri" w:eastAsia="Noto Sans JP Regular" w:hAnsi="Calibri" w:cs="Calibri"/>
+                                      <w:sz w:val="25"/>
+                                      <w:szCs w:val="25"/>
+                                    </w:rPr>
+                                  </w:pPr>
+                                  <w:r>
+                                    <w:rPr>
+                                      <w:rFonts w:ascii="Calibri" w:eastAsia="Noto Sans JP Regular" w:hAnsi="Calibri" w:cs="Calibri"/>
+                                      <w:sz w:val="25"/>
+                                      <w:szCs w:val="25"/>
+                                    </w:rPr>
+                                    <w:t xml:space="preserve">Voertaal</w:t>
+                                  </w:r>
+                                </w:p>
+                              </w:tc>
+                              <w:tc>
+                                <w:tcPr>
+                                  <w:tcW w:w="6508" w:type="dxa"/>
+                                  <w:tcBorders>
+                                    <w:bottom w:val="single" w:sz="4" w:space="0" w:color="auto"/>
+                                  </w:tcBorders>
+                                  <w:vAlign w:val="center"/>
+                                </w:tcPr>
+                                <w:p>
+                                  <w:pPr>
+                                    <w:pStyle w:val="Geenafstand"/>
+                                    <w:jc w:val="both"/>
+                                    <w:cnfStyle w:val="000000100000" w:firstRow="0" w:lastRow="0" w:firstColumn="0" w:lastColumn="0" w:oddVBand="0" w:evenVBand="0" w:oddHBand="1" w:evenHBand="0" w:firstRowFirstColumn="0" w:firstRowLastColumn="0" w:lastRowFirstColumn="0" w:lastRowLastColumn="0"/>
+                                    <w:rPr>
+                                      <w:rFonts w:ascii="Calibri" w:eastAsia="Noto Sans JP Regular" w:hAnsi="Calibri" w:cs="Calibri"/>
+                                      <w:sz w:val="25"/>
+                                      <w:szCs w:val="25"/>
+                                    </w:rPr>
+                                  </w:pPr>
+                                  <w:r>
+                                    <w:rPr>
+                                      <w:rFonts w:ascii="Calibri" w:eastAsia="Noto Sans JP Regular" w:hAnsi="Calibri" w:cs="Calibri"/>
+                                      <w:sz w:val="25"/>
+                                      <w:szCs w:val="25"/>
+                                      <w:highlight w:val="yellow"/>
+                                    </w:rPr>
+                                    <w:t xml:space="preserve">+++voertaal+++</w:t>
+                                  </w:r>
+                                </w:p>
+                              </w:tc>
+                            </w:tr>
+                            <w:tr>
+                              <w:trPr>
+                                <w:cnfStyle w:val="100000000000" w:firstRow="1" w:lastRow="0" w:firstColumn="0" w:lastColumn="0" w:oddVBand="0" w:evenVBand="0" w:oddHBand="0" w:evenHBand="0" w:firstRowFirstColumn="0" w:firstRowLastColumn="0" w:lastRowFirstColumn="0" w:lastRowLastColumn="0"/>
+                                <w:trHeight w:val="539"/>
+                              </w:trPr>
+                              <w:tc>
+                                <w:tcPr>
+                                  <w:cnfStyle w:val="001000000000" w:firstRow="0" w:lastRow="0" w:firstColumn="1" w:lastColumn="0" w:oddVBand="0" w:evenVBand="0" w:oddHBand="0" w:evenHBand="0" w:firstRowFirstColumn="0" w:firstRowLastColumn="0" w:lastRowFirstColumn="0" w:lastRowLastColumn="0"/>
+                                  <w:tcW w:w="2693" w:type="dxa"/>
+                                  <w:tcBorders>
+                                    <w:bottom w:val="single" w:sz="4" w:space="0" w:color="auto"/>
+                                  </w:tcBorders>
+                                  <w:shd w:val="clear" w:color="auto" w:fill="F2F2F2" w:themeFill="background1" w:themeFillShade="F2"/>
+                                  <w:vAlign w:val="center"/>
+                                </w:tcPr>
+                                <w:p>
+                                  <w:pPr>
+                                    <w:pStyle w:val="Geenafstand"/>
+                                    <w:jc w:val="both"/>
+                                    <w:rPr>
+                                      <w:rFonts w:ascii="Calibri" w:eastAsia="Noto Sans JP Regular" w:hAnsi="Calibri" w:cs="Calibri"/>
+                                      <w:sz w:val="25"/>
+                                      <w:szCs w:val="25"/>
+                                    </w:rPr>
+                                  </w:pPr>
+                                  <w:r>
+                                    <w:rPr>
+                                      <w:rFonts w:ascii="Calibri" w:eastAsia="Noto Sans JP Regular" w:hAnsi="Calibri" w:cs="Calibri"/>
+                                      <w:sz w:val="25"/>
+                                      <w:szCs w:val="25"/>
+                                    </w:rPr>
                                     <w:t xml:space="preserve">Materialen uiterlijk op</w:t>
                                   </w:r>
                                 </w:p>
@@ -2390,38 +2129,6 @@
                                     </w:rPr>
                                     <w:fldChar w:fldCharType="begin"/>
                                     <w:t xml:space="preserve">+++materialenDeadline+++</w:t>
-                                  </w:r>
-                                </w:p>
-                              </w:tc>
-                              <w:tc>
-                                <w:tcPr>
-                                  <w:tcW w:w="6508" w:type="dxa"/>
-                                  <w:tcBorders>
-                                    <w:bottom w:val="single" w:sz="4" w:space="0" w:color="auto"/>
-                                  </w:tcBorders>
-                                  <w:shd w:val="clear" w:color="auto" w:fill="FFFFFF" w:themeFill="background1"/>
-                                  <w:vAlign w:val="center"/>
-                                </w:tcPr>
-                                <w:p>
-                                  <w:pPr>
-                                    <w:pStyle w:val="Geenafstand"/>
-                                    <w:jc w:val="both"/>
-                                    <w:cnfStyle w:val="100000000000" w:firstRow="1" w:lastRow="0" w:firstColumn="0" w:lastColumn="0" w:oddVBand="0" w:evenVBand="0" w:oddHBand="0" w:evenHBand="0" w:firstRowFirstColumn="0" w:firstRowLastColumn="0" w:lastRowFirstColumn="0" w:lastRowLastColumn="0"/>
-                                    <w:rPr>
-                                      <w:rFonts w:ascii="Calibri" w:eastAsia="Noto Sans JP Regular" w:hAnsi="Calibri" w:cs="Calibri"/>
-                                      <w:b w:val="0"/>
-                                      <w:bCs w:val="0"/>
-                                      <w:sz w:val="25"/>
-                                      <w:szCs w:val="25"/>
-                                    </w:rPr>
-                                  </w:pPr>
-                                  <w:r>
-                                    <w:rPr>
-                                      <w:rFonts w:ascii="Calibri" w:eastAsia="Noto Sans JP Regular" w:hAnsi="Calibri" w:cs="Calibri"/>
-                                      <w:sz w:val="25"/>
-                                      <w:szCs w:val="25"/>
-                                    </w:rPr>
-                                    <w:t>Ontdek elkaars kantoor DNA</w:t>
                                   </w:r>
                                 </w:p>
                               </w:tc>
@@ -2493,35 +2200,6 @@
                                   </w:r>
                                 </w:p>
                               </w:tc>
-                              <w:tc>
-                                <w:tcPr>
-                                  <w:tcW w:w="6508" w:type="dxa"/>
-                                  <w:tcBorders>
-                                    <w:top w:val="single" w:sz="4" w:space="0" w:color="auto"/>
-                                  </w:tcBorders>
-                                  <w:vAlign w:val="center"/>
-                                </w:tcPr>
-                                <w:p>
-                                  <w:pPr>
-                                    <w:pStyle w:val="Geenafstand"/>
-                                    <w:jc w:val="both"/>
-                                    <w:cnfStyle w:val="000000000000" w:firstRow="0" w:lastRow="0" w:firstColumn="0" w:lastColumn="0" w:oddVBand="0" w:evenVBand="0" w:oddHBand="0" w:evenHBand="0" w:firstRowFirstColumn="0" w:firstRowLastColumn="0" w:lastRowFirstColumn="0" w:lastRowLastColumn="0"/>
-                                    <w:rPr>
-                                      <w:rFonts w:eastAsia="Noto Sans JP Regular" w:cs="Calibri"/>
-                                      <w:sz w:val="25"/>
-                                      <w:szCs w:val="25"/>
-                                    </w:rPr>
-                                  </w:pPr>
-                                  <w:r>
-                                    <w:rPr>
-                                      <w:rFonts w:eastAsia="Noto Sans JP Regular" w:cs="Calibri"/>
-                                      <w:sz w:val="25"/>
-                                      <w:szCs w:val="25"/>
-                                    </w:rPr>
-                                    <w:t>Susanne Claessen / 06-42843051</w:t>
-                                  </w:r>
-                                </w:p>
-                              </w:tc>
                             </w:tr>
                             <w:tr>
                               <w:trPr>
@@ -2583,84 +2261,6 @@
                                       <w:szCs w:val="25"/>
                                     </w:rPr>
                                     <w:t xml:space="preserve">+++reis+++</w:t>
-                                  </w:r>
-                                </w:p>
-                              </w:tc>
-                              <w:tc>
-                                <w:tcPr>
-                                  <w:tcW w:w="6508" w:type="dxa"/>
-                                  <w:tcBorders>
-                                    <w:bottom w:val="single" w:sz="4" w:space="0" w:color="auto"/>
-                                  </w:tcBorders>
-                                  <w:shd w:val="clear" w:color="auto" w:fill="FFFFFF" w:themeFill="background1"/>
-                                  <w:vAlign w:val="center"/>
-                                </w:tcPr>
-                                <w:p>
-                                  <w:pPr>
-                                    <w:pStyle w:val="Geenafstand"/>
-                                    <w:jc w:val="both"/>
-                                    <w:cnfStyle w:val="000000100000" w:firstRow="0" w:lastRow="0" w:firstColumn="0" w:lastColumn="0" w:oddVBand="0" w:evenVBand="0" w:oddHBand="1" w:evenHBand="0" w:firstRowFirstColumn="0" w:firstRowLastColumn="0" w:lastRowFirstColumn="0" w:lastRowLastColumn="0"/>
-                                    <w:rPr>
-                                      <w:rFonts w:ascii="Calibri" w:eastAsia="Noto Sans JP Regular" w:hAnsi="Calibri" w:cs="Calibri"/>
-                                      <w:sz w:val="25"/>
-                                      <w:szCs w:val="25"/>
-                                    </w:rPr>
-                                  </w:pPr>
-                                  <w:r>
-                                    <w:rPr>
-                                      <w:rFonts w:ascii="Calibri" w:eastAsia="Noto Sans JP Regular" w:hAnsi="Calibri" w:cs="Calibri"/>
-                                      <w:sz w:val="25"/>
-                                      <w:szCs w:val="25"/>
-                                    </w:rPr>
-                                    <w:t xml:space="preserve">Totaal: </w:t>
-                                  </w:r>
-                                  <w:r>
-                                    <w:rPr>
-                                      <w:rFonts w:ascii="Calibri" w:eastAsia="Noto Sans JP Regular" w:hAnsi="Calibri" w:cs="Calibri"/>
-                                      <w:sz w:val="25"/>
-                                      <w:szCs w:val="25"/>
-                                    </w:rPr>
-                                    <w:t>178</w:t>
-                                  </w:r>
-                                  <w:r>
-                                    <w:rPr>
-                                      <w:rFonts w:ascii="Calibri" w:eastAsia="Noto Sans JP Regular" w:hAnsi="Calibri" w:cs="Calibri"/>
-                                      <w:sz w:val="25"/>
-                                      <w:szCs w:val="25"/>
-                                    </w:rPr>
-                                    <w:t xml:space="preserve"> km. / Totaal: </w:t>
-                                  </w:r>
-                                  <w:r>
-                                    <w:rPr>
-                                      <w:rFonts w:ascii="Calibri" w:eastAsia="Noto Sans JP Regular" w:hAnsi="Calibri" w:cs="Calibri"/>
-                                      <w:sz w:val="25"/>
-                                      <w:szCs w:val="25"/>
-                                    </w:rPr>
-                                    <w:t>190</w:t>
-                                  </w:r>
-                                  <w:r>
-                                    <w:rPr>
-                                      <w:rFonts w:ascii="Calibri" w:eastAsia="Noto Sans JP Regular" w:hAnsi="Calibri" w:cs="Calibri"/>
-                                      <w:sz w:val="25"/>
-                                      <w:szCs w:val="25"/>
-                                    </w:rPr>
-                                    <w:t xml:space="preserve"> min. (</w:t>
-                                  </w:r>
-                                  <w:r>
-                                    <w:rPr>
-                                      <w:rFonts w:ascii="Calibri" w:eastAsia="Noto Sans JP Regular" w:hAnsi="Calibri" w:cs="Calibri"/>
-                                      <w:sz w:val="25"/>
-                                      <w:szCs w:val="25"/>
-                                    </w:rPr>
-                                    <w:t>100</w:t>
-                                  </w:r>
-                                  <w:r>
-                                    <w:rPr>
-                                      <w:rFonts w:ascii="Calibri" w:eastAsia="Noto Sans JP Regular" w:hAnsi="Calibri" w:cs="Calibri"/>
-                                      <w:sz w:val="25"/>
-                                      <w:szCs w:val="25"/>
-                                    </w:rPr>
-                                    <w:t xml:space="preserve"> min. factureren)</w:t>
                                   </w:r>
                                 </w:p>
                               </w:tc>
@@ -2730,6 +2330,41 @@
                                   </w:r>
                                 </w:p>
                               </w:tc>
+                            </w:tr>
+                            <w:tr>
+                              <w:trPr>
+                                <w:trHeight w:val="539"/>
+                              </w:trPr>
+                              <w:tc>
+                                <w:tcPr>
+                                  <w:cnfStyle w:val="001000000000" w:firstRow="0" w:lastRow="0" w:firstColumn="1" w:lastColumn="0" w:oddVBand="0" w:evenVBand="0" w:oddHBand="0" w:evenHBand="0" w:firstRowFirstColumn="0" w:firstRowLastColumn="0" w:lastRowFirstColumn="0" w:lastRowLastColumn="0"/>
+                                  <w:tcW w:w="2693" w:type="dxa"/>
+                                  <w:tcBorders>
+                                    <w:bottom w:val="single" w:sz="4" w:space="0" w:color="auto"/>
+                                  </w:tcBorders>
+                                  <w:shd w:val="clear" w:color="auto" w:fill="F2F2F2" w:themeFill="background1" w:themeFillShade="F2"/>
+                                  <w:vAlign w:val="center"/>
+                                </w:tcPr>
+                                <w:p>
+                                  <w:pPr>
+                                    <w:pStyle w:val="Geenafstand"/>
+                                    <w:jc w:val="both"/>
+                                    <w:rPr>
+                                      <w:rFonts w:ascii="Calibri" w:eastAsia="Noto Sans JP Regular" w:hAnsi="Calibri" w:cs="Calibri"/>
+                                      <w:sz w:val="25"/>
+                                      <w:szCs w:val="25"/>
+                                    </w:rPr>
+                                  </w:pPr>
+                                  <w:r>
+                                    <w:rPr>
+                                      <w:rFonts w:eastAsia="Noto Sans JP Regular" w:cs="Calibri"/>
+                                      <w:sz w:val="25"/>
+                                      <w:szCs w:val="25"/>
+                                    </w:rPr>
+                                    <w:t xml:space="preserve">Klantcontactmoment</w:t>
+                                  </w:r>
+                                </w:p>
+                              </w:tc>
                               <w:tc>
                                 <w:tcPr>
                                   <w:tcW w:w="6508" w:type="dxa"/>
@@ -2741,14 +2376,46 @@
                                 </w:tcPr>
                                 <w:p>
                                   <w:pPr>
+                                    <w:cnfStyle w:val="000000000000" w:firstRow="0" w:lastRow="0" w:firstColumn="0" w:lastColumn="0" w:oddVBand="0" w:evenVBand="0" w:oddHBand="0" w:evenHBand="0" w:firstRowFirstColumn="0" w:firstRowLastColumn="0" w:lastRowFirstColumn="0" w:lastRowLastColumn="0"/>
+                                    <w:rPr>
+                                      <w:bCs/>
+                                      <w:szCs w:val="25"/>
+                                      <w:highlight w:val="yellow"/>
+                                    </w:rPr>
+                                  </w:pPr>
+                                  <w:r>
+                                    <w:rPr>
+                                      <w:bCs/>
+                                      <w:szCs w:val="25"/>
+                                      <w:highlight w:val="yellow"/>
+                                    </w:rPr>
+                                    <w:t xml:space="preserve">+++klantcontactmoment+++</w:t>
+                                  </w:r>
+                                </w:p>
+                              </w:tc>
+                            </w:tr>
+                            <w:tr>
+                              <w:trPr>
+                                <w:cnfStyle w:val="000000100000" w:firstRow="0" w:lastRow="0" w:firstColumn="0" w:lastColumn="0" w:oddVBand="0" w:evenVBand="0" w:oddHBand="1" w:evenHBand="0" w:firstRowFirstColumn="0" w:firstRowLastColumn="0" w:lastRowFirstColumn="0" w:lastRowLastColumn="0"/>
+                                <w:trHeight w:val="539"/>
+                              </w:trPr>
+                              <w:tc>
+                                <w:tcPr>
+                                  <w:cnfStyle w:val="001000000000" w:firstRow="0" w:lastRow="0" w:firstColumn="1" w:lastColumn="0" w:oddVBand="0" w:evenVBand="0" w:oddHBand="0" w:evenHBand="0" w:firstRowFirstColumn="0" w:firstRowLastColumn="0" w:lastRowFirstColumn="0" w:lastRowLastColumn="0"/>
+                                  <w:tcW w:w="2693" w:type="dxa"/>
+                                  <w:tcBorders>
+                                    <w:top w:val="single" w:sz="4" w:space="0" w:color="auto"/>
+                                  </w:tcBorders>
+                                  <w:vAlign w:val="center"/>
+                                </w:tcPr>
+                                <w:p>
+                                  <w:pPr>
                                     <w:pStyle w:val="Geenafstand"/>
                                     <w:jc w:val="both"/>
-                                    <w:cnfStyle w:val="000000100000" w:firstRow="0" w:lastRow="0" w:firstColumn="0" w:lastColumn="0" w:oddVBand="0" w:evenVBand="0" w:oddHBand="1" w:evenHBand="0" w:firstRowFirstColumn="0" w:firstRowLastColumn="0" w:lastRowFirstColumn="0" w:lastRowLastColumn="0"/>
                                     <w:rPr>
                                       <w:rFonts w:ascii="Calibri" w:eastAsia="Noto Sans JP Regular" w:hAnsi="Calibri" w:cs="Calibri"/>
                                       <w:sz w:val="25"/>
                                       <w:szCs w:val="25"/>
-                                      <w:highlight w:val="yellow"/>
                                     </w:rPr>
                                   </w:pPr>
                                   <w:r>
@@ -2757,24 +2424,37 @@
                                       <w:sz w:val="25"/>
                                       <w:szCs w:val="25"/>
                                     </w:rPr>
-                                    <w:t xml:space="preserve">Kim Sanders / </w:t>
+                                    <w:t xml:space="preserve">Evaluatie deelnemers</w:t>
                                   </w:r>
-                                  <w:r>
+                                </w:p>
+                              </w:tc>
+                              <w:tc>
+                                <w:tcPr>
+                                  <w:tcW w:w="6508" w:type="dxa"/>
+                                  <w:tcBorders>
+                                    <w:top w:val="single" w:sz="4" w:space="0" w:color="auto"/>
+                                  </w:tcBorders>
+                                  <w:shd w:val="clear" w:color="auto" w:fill="FFFFFF" w:themeFill="background1"/>
+                                  <w:vAlign w:val="center"/>
+                                </w:tcPr>
+                                <w:p>
+                                  <w:pPr>
+                                    <w:pStyle w:val="Geenafstand"/>
+                                    <w:cnfStyle w:val="000000100000" w:firstRow="0" w:lastRow="0" w:firstColumn="0" w:lastColumn="0" w:oddVBand="0" w:evenVBand="0" w:oddHBand="1" w:evenHBand="0" w:firstRowFirstColumn="0" w:firstRowLastColumn="0" w:lastRowFirstColumn="0" w:lastRowLastColumn="0"/>
                                     <w:rPr>
                                       <w:rFonts w:ascii="Calibri" w:eastAsia="Noto Sans JP Regular" w:hAnsi="Calibri" w:cs="Calibri"/>
                                       <w:sz w:val="25"/>
                                       <w:szCs w:val="25"/>
-                                      <w:highlight w:val="yellow"/>
-                                    </w:rPr>
-                                    <w:t>telefoonnummer</w:t>
-                                  </w:r>
+                                    </w:rPr>
+                                  </w:pPr>
                                   <w:r>
                                     <w:rPr>
                                       <w:rFonts w:ascii="Calibri" w:eastAsia="Noto Sans JP Regular" w:hAnsi="Calibri" w:cs="Calibri"/>
                                       <w:sz w:val="25"/>
                                       <w:szCs w:val="25"/>
-                                    </w:rPr>
-                                    <w:t xml:space="preserve"> </w:t>
+                                      <w:highlight w:val="yellow"/>
+                                    </w:rPr>
+                                    <w:t xml:space="preserve">+++evaluatie+++</w:t>
                                   </w:r>
                                 </w:p>
                               </w:tc>
@@ -2805,11 +2485,11 @@
                                   </w:pPr>
                                   <w:r>
                                     <w:rPr>
-                                      <w:rFonts w:eastAsia="Noto Sans JP Regular" w:cs="Calibri"/>
+                                      <w:rFonts w:ascii="Calibri" w:eastAsia="Noto Sans JP Regular" w:hAnsi="Calibri" w:cs="Calibri"/>
                                       <w:sz w:val="25"/>
                                       <w:szCs w:val="25"/>
                                     </w:rPr>
-                                    <w:t xml:space="preserve">Klantcontactmoment</w:t>
+                                    <w:t xml:space="preserve">IE-code</w:t>
                                   </w:r>
                                 </w:p>
                               </w:tc>
@@ -2824,47 +2504,22 @@
                                 </w:tcPr>
                                 <w:p>
                                   <w:pPr>
+                                    <w:pStyle w:val="Geenafstand"/>
                                     <w:cnfStyle w:val="000000000000" w:firstRow="0" w:lastRow="0" w:firstColumn="0" w:lastColumn="0" w:oddVBand="0" w:evenVBand="0" w:oddHBand="0" w:evenHBand="0" w:firstRowFirstColumn="0" w:firstRowLastColumn="0" w:lastRowFirstColumn="0" w:lastRowLastColumn="0"/>
                                     <w:rPr>
-                                      <w:bCs/>
-                                      <w:szCs w:val="25"/>
-                                      <w:highlight w:val="yellow"/>
+                                      <w:rFonts w:ascii="Calibri" w:eastAsia="Noto Sans JP Regular" w:hAnsi="Calibri" w:cs="Calibri"/>
+                                      <w:sz w:val="25"/>
+                                      <w:szCs w:val="25"/>
                                     </w:rPr>
                                   </w:pPr>
                                   <w:r>
                                     <w:rPr>
-                                      <w:bCs/>
-                                      <w:szCs w:val="25"/>
-                                      <w:highlight w:val="yellow"/>
-                                    </w:rPr>
-                                    <w:t xml:space="preserve">+++klantcontactmoment+++</w:t>
-                                  </w:r>
-                                </w:p>
-                              </w:tc>
-                              <w:tc>
-                                <w:tcPr>
-                                  <w:tcW w:w="6508" w:type="dxa"/>
-                                  <w:tcBorders>
-                                    <w:bottom w:val="single" w:sz="4" w:space="0" w:color="auto"/>
-                                  </w:tcBorders>
-                                  <w:shd w:val="clear" w:color="auto" w:fill="FFFFFF" w:themeFill="background1"/>
-                                  <w:vAlign w:val="center"/>
-                                </w:tcPr>
-                                <w:p>
-                                  <w:pPr>
-                                    <w:cnfStyle w:val="000000000000" w:firstRow="0" w:lastRow="0" w:firstColumn="0" w:lastColumn="0" w:oddVBand="0" w:evenVBand="0" w:oddHBand="0" w:evenHBand="0" w:firstRowFirstColumn="0" w:firstRowLastColumn="0" w:lastRowFirstColumn="0" w:lastRowLastColumn="0"/>
-                                    <w:rPr>
-                                      <w:bCs/>
-                                      <w:szCs w:val="25"/>
-                                      <w:highlight w:val="yellow"/>
-                                    </w:rPr>
-                                  </w:pPr>
-                                  <w:r>
-                                    <w:rPr>
-                                      <w:bCs/>
-                                      <w:szCs w:val="25"/>
-                                    </w:rPr>
-                                    <w:t>Contact via MS Teams</w:t>
+                                      <w:rFonts w:ascii="Calibri" w:eastAsia="Noto Sans JP Regular" w:hAnsi="Calibri" w:cs="Calibri"/>
+                                      <w:sz w:val="25"/>
+                                      <w:szCs w:val="25"/>
+                                    </w:rPr>
+                                    <w:fldChar w:fldCharType="begin"/>
+                                    <w:t xml:space="preserve">+++iecode+++</w:t>
                                   </w:r>
                                 </w:p>
                               </w:tc>
@@ -2899,211 +2554,6 @@
                                       <w:sz w:val="25"/>
                                       <w:szCs w:val="25"/>
                                     </w:rPr>
-                                    <w:t xml:space="preserve">Evaluatie deelnemers</w:t>
-                                  </w:r>
-                                </w:p>
-                              </w:tc>
-                              <w:tc>
-                                <w:tcPr>
-                                  <w:tcW w:w="6508" w:type="dxa"/>
-                                  <w:tcBorders>
-                                    <w:top w:val="single" w:sz="4" w:space="0" w:color="auto"/>
-                                  </w:tcBorders>
-                                  <w:shd w:val="clear" w:color="auto" w:fill="FFFFFF" w:themeFill="background1"/>
-                                  <w:vAlign w:val="center"/>
-                                </w:tcPr>
-                                <w:p>
-                                  <w:pPr>
-                                    <w:pStyle w:val="Geenafstand"/>
-                                    <w:cnfStyle w:val="000000100000" w:firstRow="0" w:lastRow="0" w:firstColumn="0" w:lastColumn="0" w:oddVBand="0" w:evenVBand="0" w:oddHBand="1" w:evenHBand="0" w:firstRowFirstColumn="0" w:firstRowLastColumn="0" w:lastRowFirstColumn="0" w:lastRowLastColumn="0"/>
-                                    <w:rPr>
-                                      <w:rFonts w:ascii="Calibri" w:eastAsia="Noto Sans JP Regular" w:hAnsi="Calibri" w:cs="Calibri"/>
-                                      <w:sz w:val="25"/>
-                                      <w:szCs w:val="25"/>
-                                    </w:rPr>
-                                  </w:pPr>
-                                  <w:r>
-                                    <w:rPr>
-                                      <w:rFonts w:ascii="Calibri" w:eastAsia="Noto Sans JP Regular" w:hAnsi="Calibri" w:cs="Calibri"/>
-                                      <w:sz w:val="25"/>
-                                      <w:szCs w:val="25"/>
-                                      <w:highlight w:val="yellow"/>
-                                    </w:rPr>
-                                    <w:t xml:space="preserve">+++evaluatie+++</w:t>
-                                  </w:r>
-                                </w:p>
-                              </w:tc>
-                              <w:tc>
-                                <w:tcPr>
-                                  <w:tcW w:w="6508" w:type="dxa"/>
-                                  <w:tcBorders>
-                                    <w:top w:val="single" w:sz="4" w:space="0" w:color="auto"/>
-                                  </w:tcBorders>
-                                  <w:shd w:val="clear" w:color="auto" w:fill="FFFFFF" w:themeFill="background1"/>
-                                  <w:vAlign w:val="center"/>
-                                </w:tcPr>
-                                <w:p>
-                                  <w:pPr>
-                                    <w:pStyle w:val="Geenafstand"/>
-                                    <w:cnfStyle w:val="000000100000" w:firstRow="0" w:lastRow="0" w:firstColumn="0" w:lastColumn="0" w:oddVBand="0" w:evenVBand="0" w:oddHBand="1" w:evenHBand="0" w:firstRowFirstColumn="0" w:firstRowLastColumn="0" w:lastRowFirstColumn="0" w:lastRowLastColumn="0"/>
-                                    <w:rPr>
-                                      <w:rFonts w:ascii="Calibri" w:eastAsia="Noto Sans JP Regular" w:hAnsi="Calibri" w:cs="Calibri"/>
-                                      <w:sz w:val="25"/>
-                                      <w:szCs w:val="25"/>
-                                    </w:rPr>
-                                  </w:pPr>
-                                  <w:r>
-                                    <w:rPr>
-                                      <w:rFonts w:ascii="Calibri" w:eastAsia="Noto Sans JP Regular" w:hAnsi="Calibri" w:cs="Calibri"/>
-                                      <w:sz w:val="25"/>
-                                      <w:szCs w:val="25"/>
-                                    </w:rPr>
-                                    <w:t>Ja, gebruik de QR code</w:t>
-                                  </w:r>
-                                </w:p>
-                              </w:tc>
-                            </w:tr>
-                            <w:tr>
-                              <w:trPr>
-                                <w:trHeight w:val="539"/>
-                              </w:trPr>
-                              <w:tc>
-                                <w:tcPr>
-                                  <w:cnfStyle w:val="001000000000" w:firstRow="0" w:lastRow="0" w:firstColumn="1" w:lastColumn="0" w:oddVBand="0" w:evenVBand="0" w:oddHBand="0" w:evenHBand="0" w:firstRowFirstColumn="0" w:firstRowLastColumn="0" w:lastRowFirstColumn="0" w:lastRowLastColumn="0"/>
-                                  <w:tcW w:w="2693" w:type="dxa"/>
-                                  <w:tcBorders>
-                                    <w:bottom w:val="single" w:sz="4" w:space="0" w:color="auto"/>
-                                  </w:tcBorders>
-                                  <w:shd w:val="clear" w:color="auto" w:fill="F2F2F2" w:themeFill="background1" w:themeFillShade="F2"/>
-                                  <w:vAlign w:val="center"/>
-                                </w:tcPr>
-                                <w:p>
-                                  <w:pPr>
-                                    <w:pStyle w:val="Geenafstand"/>
-                                    <w:jc w:val="both"/>
-                                    <w:rPr>
-                                      <w:rFonts w:ascii="Calibri" w:eastAsia="Noto Sans JP Regular" w:hAnsi="Calibri" w:cs="Calibri"/>
-                                      <w:sz w:val="25"/>
-                                      <w:szCs w:val="25"/>
-                                    </w:rPr>
-                                  </w:pPr>
-                                  <w:r>
-                                    <w:rPr>
-                                      <w:rFonts w:ascii="Calibri" w:eastAsia="Noto Sans JP Regular" w:hAnsi="Calibri" w:cs="Calibri"/>
-                                      <w:sz w:val="25"/>
-                                      <w:szCs w:val="25"/>
-                                    </w:rPr>
-                                    <w:t xml:space="preserve">IE-code</w:t>
-                                  </w:r>
-                                </w:p>
-                              </w:tc>
-                              <w:tc>
-                                <w:tcPr>
-                                  <w:tcW w:w="6508" w:type="dxa"/>
-                                  <w:tcBorders>
-                                    <w:bottom w:val="single" w:sz="4" w:space="0" w:color="auto"/>
-                                  </w:tcBorders>
-                                  <w:shd w:val="clear" w:color="auto" w:fill="FFFFFF" w:themeFill="background1"/>
-                                  <w:vAlign w:val="center"/>
-                                </w:tcPr>
-                                <w:p>
-                                  <w:pPr>
-                                    <w:pStyle w:val="Geenafstand"/>
-                                    <w:cnfStyle w:val="000000000000" w:firstRow="0" w:lastRow="0" w:firstColumn="0" w:lastColumn="0" w:oddVBand="0" w:evenVBand="0" w:oddHBand="0" w:evenHBand="0" w:firstRowFirstColumn="0" w:firstRowLastColumn="0" w:lastRowFirstColumn="0" w:lastRowLastColumn="0"/>
-                                    <w:rPr>
-                                      <w:rFonts w:ascii="Calibri" w:eastAsia="Noto Sans JP Regular" w:hAnsi="Calibri" w:cs="Calibri"/>
-                                      <w:sz w:val="25"/>
-                                      <w:szCs w:val="25"/>
-                                    </w:rPr>
-                                  </w:pPr>
-                                  <w:r>
-                                    <w:rPr>
-                                      <w:rFonts w:ascii="Calibri" w:eastAsia="Noto Sans JP Regular" w:hAnsi="Calibri" w:cs="Calibri"/>
-                                      <w:sz w:val="25"/>
-                                      <w:szCs w:val="25"/>
-                                    </w:rPr>
-                                    <w:fldChar w:fldCharType="begin"/>
-                                    <w:t xml:space="preserve">+++iecode+++</w:t>
-                                  </w:r>
-                                </w:p>
-                              </w:tc>
-                              <w:tc>
-                                <w:tcPr>
-                                  <w:tcW w:w="6508" w:type="dxa"/>
-                                  <w:tcBorders>
-                                    <w:bottom w:val="single" w:sz="4" w:space="0" w:color="auto"/>
-                                  </w:tcBorders>
-                                  <w:shd w:val="clear" w:color="auto" w:fill="FFFFFF" w:themeFill="background1"/>
-                                  <w:vAlign w:val="center"/>
-                                </w:tcPr>
-                                <w:p>
-                                  <w:pPr>
-                                    <w:pStyle w:val="Geenafstand"/>
-                                    <w:cnfStyle w:val="000000000000" w:firstRow="0" w:lastRow="0" w:firstColumn="0" w:lastColumn="0" w:oddVBand="0" w:evenVBand="0" w:oddHBand="0" w:evenHBand="0" w:firstRowFirstColumn="0" w:firstRowLastColumn="0" w:lastRowFirstColumn="0" w:lastRowLastColumn="0"/>
-                                    <w:rPr>
-                                      <w:rFonts w:ascii="Calibri" w:eastAsia="Noto Sans JP Regular" w:hAnsi="Calibri" w:cs="Calibri"/>
-                                      <w:sz w:val="25"/>
-                                      <w:szCs w:val="25"/>
-                                    </w:rPr>
-                                  </w:pPr>
-                                  <w:r>
-                                    <w:rPr>
-                                      <w:rFonts w:ascii="Calibri" w:eastAsia="Noto Sans JP Regular" w:hAnsi="Calibri" w:cs="Calibri"/>
-                                      <w:sz w:val="25"/>
-                                      <w:szCs w:val="25"/>
-                                    </w:rPr>
-                                    <w:t xml:space="preserve">Sessie 1: </w:t>
-                                  </w:r>
-                                  <w:r>
-                                    <w:rPr>
-                                      <w:rFonts w:ascii="Calibri" w:eastAsia="Noto Sans JP Regular" w:hAnsi="Calibri" w:cs="Calibri"/>
-                                      <w:sz w:val="25"/>
-                                      <w:szCs w:val="25"/>
-                                    </w:rPr>
-                                    <w:t>260220</w:t>
-                                  </w:r>
-                                  <w:r>
-                                    <w:rPr>
-                                      <w:rFonts w:ascii="Calibri" w:eastAsia="Noto Sans JP Regular" w:hAnsi="Calibri" w:cs="Calibri"/>
-                                      <w:sz w:val="25"/>
-                                      <w:szCs w:val="25"/>
-                                    </w:rPr>
-                                    <w:br/>
-                                    <w:t>Sessie 2: 260322</w:t>
-                                  </w:r>
-                                </w:p>
-                              </w:tc>
-                            </w:tr>
-                            <w:tr>
-                              <w:trPr>
-                                <w:cnfStyle w:val="000000100000" w:firstRow="0" w:lastRow="0" w:firstColumn="0" w:lastColumn="0" w:oddVBand="0" w:evenVBand="0" w:oddHBand="1" w:evenHBand="0" w:firstRowFirstColumn="0" w:firstRowLastColumn="0" w:lastRowFirstColumn="0" w:lastRowLastColumn="0"/>
-                                <w:trHeight w:val="539"/>
-                              </w:trPr>
-                              <w:tc>
-                                <w:tcPr>
-                                  <w:cnfStyle w:val="001000000000" w:firstRow="0" w:lastRow="0" w:firstColumn="1" w:lastColumn="0" w:oddVBand="0" w:evenVBand="0" w:oddHBand="0" w:evenHBand="0" w:firstRowFirstColumn="0" w:firstRowLastColumn="0" w:lastRowFirstColumn="0" w:lastRowLastColumn="0"/>
-                                  <w:tcW w:w="2693" w:type="dxa"/>
-                                  <w:tcBorders>
-                                    <w:top w:val="single" w:sz="4" w:space="0" w:color="auto"/>
-                                  </w:tcBorders>
-                                  <w:vAlign w:val="center"/>
-                                </w:tcPr>
-                                <w:p>
-                                  <w:pPr>
-                                    <w:pStyle w:val="Geenafstand"/>
-                                    <w:jc w:val="both"/>
-                                    <w:rPr>
-                                      <w:rFonts w:ascii="Calibri" w:eastAsia="Noto Sans JP Regular" w:hAnsi="Calibri" w:cs="Calibri"/>
-                                      <w:sz w:val="25"/>
-                                      <w:szCs w:val="25"/>
-                                    </w:rPr>
-                                  </w:pPr>
-                                  <w:r>
-                                    <w:rPr>
-                                      <w:rFonts w:ascii="Calibri" w:eastAsia="Noto Sans JP Regular" w:hAnsi="Calibri" w:cs="Calibri"/>
-                                      <w:sz w:val="25"/>
-                                      <w:szCs w:val="25"/>
-                                    </w:rPr>
                                     <w:t xml:space="preserve">Trainingscode MC</w:t>
                                   </w:r>
                                 </w:p>
@@ -3134,35 +2584,6 @@
                                     </w:rPr>
                                     <w:fldChar w:fldCharType="begin"/>
                                     <w:t xml:space="preserve">+++trainingscodeMc+++ &lt;-- Vergeet de Monday Challenges niet!</w:t>
-                                  </w:r>
-                                </w:p>
-                              </w:tc>
-                              <w:tc>
-                                <w:tcPr>
-                                  <w:tcW w:w="6508" w:type="dxa"/>
-                                  <w:tcBorders>
-                                    <w:top w:val="single" w:sz="4" w:space="0" w:color="auto"/>
-                                  </w:tcBorders>
-                                  <w:shd w:val="clear" w:color="auto" w:fill="FFFFFF" w:themeFill="background1"/>
-                                  <w:vAlign w:val="center"/>
-                                </w:tcPr>
-                                <w:p>
-                                  <w:pPr>
-                                    <w:spacing w:line="240" w:lineRule="auto"/>
-                                    <w:jc w:val="both"/>
-                                    <w:cnfStyle w:val="000000100000" w:firstRow="0" w:lastRow="0" w:firstColumn="0" w:lastColumn="0" w:oddVBand="0" w:evenVBand="0" w:oddHBand="1" w:evenHBand="0" w:firstRowFirstColumn="0" w:firstRowLastColumn="0" w:lastRowFirstColumn="0" w:lastRowLastColumn="0"/>
-                                    <w:rPr>
-                                      <w:rFonts w:ascii="Aptos Narrow" w:hAnsi="Aptos Narrow"/>
-                                      <w:color w:val="000000"/>
-                                      <w:sz w:val="24"/>
-                                    </w:rPr>
-                                  </w:pPr>
-                                  <w:r>
-                                    <w:rPr>
-                                      <w:rFonts w:eastAsia="Noto Sans JP Regular" w:cs="Calibri"/>
-                                      <w:szCs w:val="25"/>
-                                    </w:rPr>
-                                    <w:t>IT-57 &lt;-- Vergeet de Monday Challenges niet!</w:t>
                                   </w:r>
                                 </w:p>
                               </w:tc>
@@ -3418,7 +2839,6 @@
                       <w:tblGrid>
                         <w:gridCol w:w="2693"/>
                         <w:gridCol w:w="6508"/>
-                        <w:gridCol w:w="6508"/>
                       </w:tblGrid>
                       <w:tr>
                         <w:trPr>
@@ -3483,55 +2903,6 @@
                               <w:fldChar w:fldCharType="begin"/>
                               <w:t xml:space="preserve">+++opdrachtgever+++</w:t>
                             </w:r>
-                          </w:p>
-                        </w:tc>
-                        <w:tc>
-                          <w:tcPr>
-                            <w:tcW w:w="6508" w:type="dxa"/>
-                            <w:tcBorders>
-                              <w:top w:val="single" w:sz="4" w:space="0" w:color="auto"/>
-                            </w:tcBorders>
-                            <w:shd w:val="clear" w:color="auto" w:fill="FFFFFF" w:themeFill="background1"/>
-                            <w:vAlign w:val="center"/>
-                          </w:tcPr>
-                          <w:p>
-                            <w:pPr>
-                              <w:pStyle w:val="Geenafstand"/>
-                              <w:jc w:val="both"/>
-                              <w:cnfStyle w:val="000000000000" w:firstRow="0" w:lastRow="0" w:firstColumn="0" w:lastColumn="0" w:oddVBand="0" w:evenVBand="0" w:oddHBand="0" w:evenHBand="0" w:firstRowFirstColumn="0" w:firstRowLastColumn="0" w:lastRowFirstColumn="0" w:lastRowLastColumn="0"/>
-                              <w:rPr>
-                                <w:rFonts w:ascii="Calibri" w:eastAsia="Noto Sans JP Regular" w:hAnsi="Calibri" w:cs="Calibri"/>
-                                <w:sz w:val="25"/>
-                                <w:szCs w:val="25"/>
-                                <w:highlight w:val="yellow"/>
-                              </w:rPr>
-                            </w:pPr>
-                            <w:r>
-                              <w:rPr>
-                                <w:rFonts w:ascii="Calibri" w:eastAsia="Noto Sans JP Regular" w:hAnsi="Calibri" w:cs="Calibri"/>
-                                <w:sz w:val="25"/>
-                                <w:szCs w:val="25"/>
-                              </w:rPr>
-                              <w:t>C</w:t>
-                            </w:r>
-                            <w:r>
-                              <w:rPr>
-                                <w:rFonts w:ascii="Calibri" w:eastAsia="Noto Sans JP Regular" w:hAnsi="Calibri" w:cs="Calibri"/>
-                                <w:sz w:val="25"/>
-                                <w:szCs w:val="25"/>
-                              </w:rPr>
-                              <w:t xml:space="preserve">oöperatie </w:t>
-                            </w:r>
-                            <w:proofErr w:type="spellStart"/>
-                            <w:r>
-                              <w:rPr>
-                                <w:rFonts w:ascii="Calibri" w:eastAsia="Noto Sans JP Regular" w:hAnsi="Calibri" w:cs="Calibri"/>
-                                <w:sz w:val="25"/>
-                                <w:szCs w:val="25"/>
-                              </w:rPr>
-                              <w:t>Dela</w:t>
-                            </w:r>
-                            <w:proofErr w:type="spellEnd"/>
                           </w:p>
                         </w:tc>
                       </w:tr>
@@ -3601,6 +2972,42 @@
                             </w:r>
                           </w:p>
                         </w:tc>
+                      </w:tr>
+                      <w:tr>
+                        <w:trPr>
+                          <w:cnfStyle w:val="100000000000" w:firstRow="1" w:lastRow="0" w:firstColumn="0" w:lastColumn="0" w:oddVBand="0" w:evenVBand="0" w:oddHBand="0" w:evenHBand="0" w:firstRowFirstColumn="0" w:firstRowLastColumn="0" w:lastRowFirstColumn="0" w:lastRowLastColumn="0"/>
+                          <w:trHeight w:val="539"/>
+                        </w:trPr>
+                        <w:tc>
+                          <w:tcPr>
+                            <w:cnfStyle w:val="001000000000" w:firstRow="0" w:lastRow="0" w:firstColumn="1" w:lastColumn="0" w:oddVBand="0" w:evenVBand="0" w:oddHBand="0" w:evenHBand="0" w:firstRowFirstColumn="0" w:firstRowLastColumn="0" w:lastRowFirstColumn="0" w:lastRowLastColumn="0"/>
+                            <w:tcW w:w="2693" w:type="dxa"/>
+                            <w:tcBorders>
+                              <w:bottom w:val="single" w:sz="4" w:space="0" w:color="auto"/>
+                            </w:tcBorders>
+                            <w:shd w:val="clear" w:color="auto" w:fill="F2F2F2" w:themeFill="background1" w:themeFillShade="F2"/>
+                            <w:vAlign w:val="center"/>
+                          </w:tcPr>
+                          <w:p>
+                            <w:pPr>
+                              <w:pStyle w:val="Geenafstand"/>
+                              <w:jc w:val="both"/>
+                              <w:rPr>
+                                <w:rFonts w:ascii="Calibri" w:eastAsia="Noto Sans JP Regular" w:hAnsi="Calibri" w:cs="Calibri"/>
+                                <w:sz w:val="25"/>
+                                <w:szCs w:val="25"/>
+                              </w:rPr>
+                            </w:pPr>
+                            <w:r>
+                              <w:rPr>
+                                <w:rFonts w:ascii="Calibri" w:eastAsia="Noto Sans JP Regular" w:hAnsi="Calibri" w:cs="Calibri"/>
+                                <w:sz w:val="25"/>
+                                <w:szCs w:val="25"/>
+                              </w:rPr>
+                              <w:t xml:space="preserve">Klanttitel</w:t>
+                            </w:r>
+                          </w:p>
+                        </w:tc>
                         <w:tc>
                           <w:tcPr>
                             <w:tcW w:w="6508" w:type="dxa"/>
@@ -3617,8 +3024,6 @@
                               <w:cnfStyle w:val="100000000000" w:firstRow="1" w:lastRow="0" w:firstColumn="0" w:lastColumn="0" w:oddVBand="0" w:evenVBand="0" w:oddHBand="0" w:evenHBand="0" w:firstRowFirstColumn="0" w:firstRowLastColumn="0" w:lastRowFirstColumn="0" w:lastRowLastColumn="0"/>
                               <w:rPr>
                                 <w:rFonts w:ascii="Calibri" w:eastAsia="Noto Sans JP Regular" w:hAnsi="Calibri" w:cs="Calibri"/>
-                                <w:b w:val="0"/>
-                                <w:bCs w:val="0"/>
                                 <w:sz w:val="25"/>
                                 <w:szCs w:val="25"/>
                               </w:rPr>
@@ -3629,7 +3034,317 @@
                                 <w:sz w:val="25"/>
                                 <w:szCs w:val="25"/>
                               </w:rPr>
-                              <w:t>Ontdek elkaars kantoor DNA</w:t>
+                              <w:fldChar w:fldCharType="begin"/>
+                              <w:t xml:space="preserve">+++klanttitel+++</w:t>
+                            </w:r>
+                          </w:p>
+                        </w:tc>
+                      </w:tr>
+                      <w:tr>
+                        <w:trPr>
+                          <w:cnfStyle w:val="000000100000" w:firstRow="0" w:lastRow="0" w:firstColumn="0" w:lastColumn="0" w:oddVBand="0" w:evenVBand="0" w:oddHBand="1" w:evenHBand="0" w:firstRowFirstColumn="0" w:firstRowLastColumn="0" w:lastRowFirstColumn="0" w:lastRowLastColumn="0"/>
+                          <w:trHeight w:val="539"/>
+                        </w:trPr>
+                        <w:tc>
+                          <w:tcPr>
+                            <w:cnfStyle w:val="001000000000" w:firstRow="0" w:lastRow="0" w:firstColumn="1" w:lastColumn="0" w:oddVBand="0" w:evenVBand="0" w:oddHBand="0" w:evenHBand="0" w:firstRowFirstColumn="0" w:firstRowLastColumn="0" w:lastRowFirstColumn="0" w:lastRowLastColumn="0"/>
+                            <w:tcW w:w="2693" w:type="dxa"/>
+                            <w:tcBorders>
+                              <w:top w:val="single" w:sz="4" w:space="0" w:color="auto"/>
+                            </w:tcBorders>
+                            <w:vAlign w:val="center"/>
+                          </w:tcPr>
+                          <w:p>
+                            <w:pPr>
+                              <w:pStyle w:val="Geenafstand"/>
+                              <w:jc w:val="both"/>
+                              <w:rPr>
+                                <w:rFonts w:ascii="Calibri" w:eastAsia="Noto Sans JP Regular" w:hAnsi="Calibri" w:cs="Calibri"/>
+                                <w:sz w:val="25"/>
+                                <w:szCs w:val="25"/>
+                              </w:rPr>
+                            </w:pPr>
+                            <w:r>
+                              <w:rPr>
+                                <w:rFonts w:ascii="Calibri" w:eastAsia="Noto Sans JP Regular" w:hAnsi="Calibri" w:cs="Calibri"/>
+                                <w:sz w:val="25"/>
+                                <w:szCs w:val="25"/>
+                              </w:rPr>
+                              <w:t xml:space="preserve">Duur</w:t>
+                            </w:r>
+                          </w:p>
+                        </w:tc>
+                        <w:tc>
+                          <w:tcPr>
+                            <w:tcW w:w="6508" w:type="dxa"/>
+                            <w:tcBorders>
+                              <w:top w:val="single" w:sz="4" w:space="0" w:color="auto"/>
+                            </w:tcBorders>
+                            <w:shd w:val="clear" w:color="auto" w:fill="FFFFFF" w:themeFill="background1"/>
+                            <w:vAlign w:val="center"/>
+                          </w:tcPr>
+                          <w:p>
+                            <w:pPr>
+                              <w:pStyle w:val="Geenafstand"/>
+                              <w:jc w:val="both"/>
+                              <w:cnfStyle w:val="000000100000" w:firstRow="0" w:lastRow="0" w:firstColumn="0" w:lastColumn="0" w:oddVBand="0" w:evenVBand="0" w:oddHBand="1" w:evenHBand="0" w:firstRowFirstColumn="0" w:firstRowLastColumn="0" w:lastRowFirstColumn="0" w:lastRowLastColumn="0"/>
+                              <w:rPr>
+                                <w:rFonts w:ascii="Calibri" w:eastAsia="Noto Sans JP Regular" w:hAnsi="Calibri" w:cs="Calibri"/>
+                                <w:sz w:val="25"/>
+                                <w:szCs w:val="25"/>
+                              </w:rPr>
+                            </w:pPr>
+                            <w:r>
+                              <w:rPr>
+                                <w:rFonts w:ascii="Calibri" w:eastAsia="Noto Sans JP Regular" w:hAnsi="Calibri" w:cs="Calibri"/>
+                                <w:sz w:val="25"/>
+                                <w:szCs w:val="25"/>
+                              </w:rPr>
+                              <w:fldChar w:fldCharType="begin"/>
+                              <w:t xml:space="preserve">+++duur+++</w:t>
+                            </w:r>
+                          </w:p>
+                        </w:tc>
+                      </w:tr>
+                      <w:tr>
+                        <w:trPr>
+                          <w:trHeight w:val="539"/>
+                        </w:trPr>
+                        <w:tc>
+                          <w:tcPr>
+                            <w:cnfStyle w:val="001000000000" w:firstRow="0" w:lastRow="0" w:firstColumn="1" w:lastColumn="0" w:oddVBand="0" w:evenVBand="0" w:oddHBand="0" w:evenHBand="0" w:firstRowFirstColumn="0" w:firstRowLastColumn="0" w:lastRowFirstColumn="0" w:lastRowLastColumn="0"/>
+                            <w:tcW w:w="2693" w:type="dxa"/>
+                            <w:shd w:val="clear" w:color="auto" w:fill="F2F2F2" w:themeFill="background1" w:themeFillShade="F2"/>
+                            <w:vAlign w:val="center"/>
+                          </w:tcPr>
+                          <w:p>
+                            <w:pPr>
+                              <w:pStyle w:val="Geenafstand"/>
+                              <w:jc w:val="both"/>
+                              <w:rPr>
+                                <w:rFonts w:ascii="Calibri" w:eastAsia="Noto Sans JP Regular" w:hAnsi="Calibri" w:cs="Calibri"/>
+                                <w:sz w:val="25"/>
+                                <w:szCs w:val="25"/>
+                              </w:rPr>
+                            </w:pPr>
+                            <w:r>
+                              <w:rPr>
+                                <w:rFonts w:ascii="Calibri" w:eastAsia="Noto Sans JP Regular" w:hAnsi="Calibri" w:cs="Calibri"/>
+                                <w:sz w:val="25"/>
+                                <w:szCs w:val="25"/>
+                              </w:rPr>
+                              <w:t xml:space="preserve">Datum &amp; tijd</w:t>
+                            </w:r>
+                          </w:p>
+                        </w:tc>
+                        <w:tc>
+                          <w:tcPr>
+                            <w:tcW w:w="6508" w:type="dxa"/>
+                            <w:shd w:val="clear" w:color="auto" w:fill="FFFFFF" w:themeFill="background1"/>
+                            <w:vAlign w:val="center"/>
+                          </w:tcPr>
+                          <w:p>
+                            <w:pPr>
+                              <w:pStyle w:val="Geenafstand"/>
+                              <w:cnfStyle w:val="000000000000" w:firstRow="0" w:lastRow="0" w:firstColumn="0" w:lastColumn="0" w:oddVBand="0" w:evenVBand="0" w:oddHBand="0" w:evenHBand="0" w:firstRowFirstColumn="0" w:firstRowLastColumn="0" w:lastRowFirstColumn="0" w:lastRowLastColumn="0"/>
+                              <w:rPr>
+                                <w:rFonts w:ascii="Calibri" w:eastAsia="Noto Sans JP Regular" w:hAnsi="Calibri" w:cs="Calibri"/>
+                                <w:sz w:val="25"/>
+                                <w:szCs w:val="25"/>
+                              </w:rPr>
+                            </w:pPr>
+                            <w:r>
+                              <w:rPr>
+                                <w:rFonts w:ascii="Calibri" w:eastAsia="Noto Sans JP Regular" w:hAnsi="Calibri" w:cs="Calibri"/>
+                                <w:sz w:val="25"/>
+                                <w:szCs w:val="25"/>
+                              </w:rPr>
+                              <w:fldChar w:fldCharType="begin"/>
+                              <w:t xml:space="preserve">+++datumTijd+++</w:t>
+                            </w:r>
+                          </w:p>
+                        </w:tc>
+                      </w:tr>
+                      <w:tr>
+                        <w:trPr>
+                          <w:cnfStyle w:val="000000100000" w:firstRow="0" w:lastRow="0" w:firstColumn="0" w:lastColumn="0" w:oddVBand="0" w:evenVBand="0" w:oddHBand="1" w:evenHBand="0" w:firstRowFirstColumn="0" w:firstRowLastColumn="0" w:lastRowFirstColumn="0" w:lastRowLastColumn="0"/>
+                          <w:trHeight w:val="539"/>
+                        </w:trPr>
+                        <w:tc>
+                          <w:tcPr>
+                            <w:cnfStyle w:val="001000000000" w:firstRow="0" w:lastRow="0" w:firstColumn="1" w:lastColumn="0" w:oddVBand="0" w:evenVBand="0" w:oddHBand="0" w:evenHBand="0" w:firstRowFirstColumn="0" w:firstRowLastColumn="0" w:lastRowFirstColumn="0" w:lastRowLastColumn="0"/>
+                            <w:tcW w:w="2693" w:type="dxa"/>
+                            <w:vAlign w:val="center"/>
+                          </w:tcPr>
+                          <w:p>
+                            <w:pPr>
+                              <w:pStyle w:val="Geenafstand"/>
+                              <w:jc w:val="both"/>
+                              <w:rPr>
+                                <w:rFonts w:ascii="Calibri" w:eastAsia="Noto Sans JP Regular" w:hAnsi="Calibri" w:cs="Calibri"/>
+                                <w:sz w:val="25"/>
+                                <w:szCs w:val="25"/>
+                              </w:rPr>
+                            </w:pPr>
+                            <w:r>
+                              <w:rPr>
+                                <w:rFonts w:ascii="Calibri" w:eastAsia="Noto Sans JP Regular" w:hAnsi="Calibri" w:cs="Calibri"/>
+                                <w:sz w:val="25"/>
+                                <w:szCs w:val="25"/>
+                              </w:rPr>
+                              <w:t xml:space="preserve">Groepsgrootte</w:t>
+                            </w:r>
+                          </w:p>
+                        </w:tc>
+                        <w:tc>
+                          <w:tcPr>
+                            <w:tcW w:w="6508" w:type="dxa"/>
+                            <w:shd w:val="clear" w:color="auto" w:fill="FFFFFF" w:themeFill="background1"/>
+                            <w:vAlign w:val="center"/>
+                          </w:tcPr>
+                          <w:p>
+                            <w:pPr>
+                              <w:pStyle w:val="Geenafstand"/>
+                              <w:jc w:val="both"/>
+                              <w:cnfStyle w:val="000000100000" w:firstRow="0" w:lastRow="0" w:firstColumn="0" w:lastColumn="0" w:oddVBand="0" w:evenVBand="0" w:oddHBand="1" w:evenHBand="0" w:firstRowFirstColumn="0" w:firstRowLastColumn="0" w:lastRowFirstColumn="0" w:lastRowLastColumn="0"/>
+                              <w:rPr>
+                                <w:rFonts w:ascii="Calibri" w:eastAsia="Noto Sans JP Regular" w:hAnsi="Calibri" w:cs="Calibri"/>
+                                <w:sz w:val="25"/>
+                                <w:szCs w:val="25"/>
+                              </w:rPr>
+                            </w:pPr>
+                            <w:r>
+                              <w:rPr>
+                                <w:rFonts w:ascii="Calibri" w:eastAsia="Noto Sans JP Regular" w:hAnsi="Calibri" w:cs="Calibri"/>
+                                <w:sz w:val="25"/>
+                                <w:szCs w:val="25"/>
+                              </w:rPr>
+                              <w:fldChar w:fldCharType="begin"/>
+                              <w:t xml:space="preserve">+++groepsgrootte+++</w:t>
+                            </w:r>
+                          </w:p>
+                        </w:tc>
+                      </w:tr>
+                      <w:tr>
+                        <w:trPr>
+                          <w:trHeight w:val="539"/>
+                        </w:trPr>
+                        <w:tc>
+                          <w:tcPr>
+                            <w:cnfStyle w:val="001000000000" w:firstRow="0" w:lastRow="0" w:firstColumn="1" w:lastColumn="0" w:oddVBand="0" w:evenVBand="0" w:oddHBand="0" w:evenHBand="0" w:firstRowFirstColumn="0" w:firstRowLastColumn="0" w:lastRowFirstColumn="0" w:lastRowLastColumn="0"/>
+                            <w:tcW w:w="2693" w:type="dxa"/>
+                            <w:shd w:val="clear" w:color="auto" w:fill="F2F2F2" w:themeFill="background1" w:themeFillShade="F2"/>
+                            <w:vAlign w:val="center"/>
+                          </w:tcPr>
+                          <w:p>
+                            <w:pPr>
+                              <w:pStyle w:val="Geenafstand"/>
+                              <w:jc w:val="both"/>
+                              <w:rPr>
+                                <w:rFonts w:ascii="Calibri" w:eastAsia="Noto Sans JP Regular" w:hAnsi="Calibri" w:cs="Calibri"/>
+                                <w:sz w:val="25"/>
+                                <w:szCs w:val="25"/>
+                              </w:rPr>
+                            </w:pPr>
+                            <w:r>
+                              <w:rPr>
+                                <w:rFonts w:ascii="Calibri" w:eastAsia="Noto Sans JP Regular" w:hAnsi="Calibri" w:cs="Calibri"/>
+                                <w:sz w:val="25"/>
+                                <w:szCs w:val="25"/>
+                              </w:rPr>
+                              <w:t xml:space="preserve">Trainingslocatie</w:t>
+                            </w:r>
+                          </w:p>
+                        </w:tc>
+                        <w:tc>
+                          <w:tcPr>
+                            <w:tcW w:w="6508" w:type="dxa"/>
+                            <w:vAlign w:val="center"/>
+                          </w:tcPr>
+                          <w:p>
+                            <w:pPr>
+                              <w:pStyle w:val="Geenafstand"/>
+                              <w:jc w:val="both"/>
+                              <w:cnfStyle w:val="000000000000" w:firstRow="0" w:lastRow="0" w:firstColumn="0" w:lastColumn="0" w:oddVBand="0" w:evenVBand="0" w:oddHBand="0" w:evenHBand="0" w:firstRowFirstColumn="0" w:firstRowLastColumn="0" w:lastRowFirstColumn="0" w:lastRowLastColumn="0"/>
+                              <w:rPr>
+                                <w:rFonts w:ascii="Calibri" w:eastAsia="Noto Sans JP Regular" w:hAnsi="Calibri" w:cs="Calibri"/>
+                                <w:sz w:val="25"/>
+                                <w:szCs w:val="25"/>
+                              </w:rPr>
+                            </w:pPr>
+                            <w:r>
+                              <w:rPr>
+                                <w:rFonts w:ascii="Calibri" w:eastAsia="Noto Sans JP Regular" w:hAnsi="Calibri" w:cs="Calibri"/>
+                                <w:sz w:val="25"/>
+                                <w:szCs w:val="25"/>
+                              </w:rPr>
+                              <w:fldChar w:fldCharType="begin"/>
+                              <w:t xml:space="preserve">+++locatie+++</w:t>
+                            </w:r>
+                          </w:p>
+                        </w:tc>
+                      </w:tr>
+                      <w:tr>
+                        <w:trPr>
+                          <w:cnfStyle w:val="000000100000" w:firstRow="0" w:lastRow="0" w:firstColumn="0" w:lastColumn="0" w:oddVBand="0" w:evenVBand="0" w:oddHBand="1" w:evenHBand="0" w:firstRowFirstColumn="0" w:firstRowLastColumn="0" w:lastRowFirstColumn="0" w:lastRowLastColumn="0"/>
+                          <w:trHeight w:val="539"/>
+                        </w:trPr>
+                        <w:tc>
+                          <w:tcPr>
+                            <w:cnfStyle w:val="001000000000" w:firstRow="0" w:lastRow="0" w:firstColumn="1" w:lastColumn="0" w:oddVBand="0" w:evenVBand="0" w:oddHBand="0" w:evenHBand="0" w:firstRowFirstColumn="0" w:firstRowLastColumn="0" w:lastRowFirstColumn="0" w:lastRowLastColumn="0"/>
+                            <w:tcW w:w="2693" w:type="dxa"/>
+                            <w:tcBorders>
+                              <w:bottom w:val="single" w:sz="4" w:space="0" w:color="auto"/>
+                            </w:tcBorders>
+                            <w:vAlign w:val="center"/>
+                          </w:tcPr>
+                          <w:p>
+                            <w:pPr>
+                              <w:pStyle w:val="Geenafstand"/>
+                              <w:jc w:val="both"/>
+                              <w:rPr>
+                                <w:rFonts w:ascii="Calibri" w:eastAsia="Noto Sans JP Regular" w:hAnsi="Calibri" w:cs="Calibri"/>
+                                <w:sz w:val="25"/>
+                                <w:szCs w:val="25"/>
+                              </w:rPr>
+                            </w:pPr>
+                            <w:r>
+                              <w:rPr>
+                                <w:rFonts w:ascii="Calibri" w:eastAsia="Noto Sans JP Regular" w:hAnsi="Calibri" w:cs="Calibri"/>
+                                <w:sz w:val="25"/>
+                                <w:szCs w:val="25"/>
+                              </w:rPr>
+                              <w:t xml:space="preserve">Voertaal</w:t>
+                            </w:r>
+                          </w:p>
+                        </w:tc>
+                        <w:tc>
+                          <w:tcPr>
+                            <w:tcW w:w="6508" w:type="dxa"/>
+                            <w:tcBorders>
+                              <w:bottom w:val="single" w:sz="4" w:space="0" w:color="auto"/>
+                            </w:tcBorders>
+                            <w:vAlign w:val="center"/>
+                          </w:tcPr>
+                          <w:p>
+                            <w:pPr>
+                              <w:pStyle w:val="Geenafstand"/>
+                              <w:jc w:val="both"/>
+                              <w:cnfStyle w:val="000000100000" w:firstRow="0" w:lastRow="0" w:firstColumn="0" w:lastColumn="0" w:oddVBand="0" w:evenVBand="0" w:oddHBand="1" w:evenHBand="0" w:firstRowFirstColumn="0" w:firstRowLastColumn="0" w:lastRowFirstColumn="0" w:lastRowLastColumn="0"/>
+                              <w:rPr>
+                                <w:rFonts w:ascii="Calibri" w:eastAsia="Noto Sans JP Regular" w:hAnsi="Calibri" w:cs="Calibri"/>
+                                <w:sz w:val="25"/>
+                                <w:szCs w:val="25"/>
+                              </w:rPr>
+                            </w:pPr>
+                            <w:r>
+                              <w:rPr>
+                                <w:rFonts w:ascii="Calibri" w:eastAsia="Noto Sans JP Regular" w:hAnsi="Calibri" w:cs="Calibri"/>
+                                <w:sz w:val="25"/>
+                                <w:szCs w:val="25"/>
+                                <w:highlight w:val="yellow"/>
+                              </w:rPr>
+                              <w:t xml:space="preserve">+++voertaal+++</w:t>
                             </w:r>
                           </w:p>
                         </w:tc>
@@ -3665,7 +3380,7 @@
                                 <w:sz w:val="25"/>
                                 <w:szCs w:val="25"/>
                               </w:rPr>
-                              <w:t xml:space="preserve">Klanttitel</w:t>
+                              <w:t xml:space="preserve">Materialen uiterlijk op</w:t>
                             </w:r>
                           </w:p>
                         </w:tc>
@@ -3696,7 +3411,109 @@
                                 <w:szCs w:val="25"/>
                               </w:rPr>
                               <w:fldChar w:fldCharType="begin"/>
-                              <w:t xml:space="preserve">+++klanttitel+++</w:t>
+                              <w:t xml:space="preserve">+++materialenDeadline+++</w:t>
+                            </w:r>
+                          </w:p>
+                        </w:tc>
+                      </w:tr>
+                      <w:tr>
+                        <w:trPr>
+                          <w:trHeight w:val="539"/>
+                        </w:trPr>
+                        <w:tc>
+                          <w:tcPr>
+                            <w:cnfStyle w:val="001000000000" w:firstRow="0" w:lastRow="0" w:firstColumn="1" w:lastColumn="0" w:oddVBand="0" w:evenVBand="0" w:oddHBand="0" w:evenHBand="0" w:firstRowFirstColumn="0" w:firstRowLastColumn="0" w:lastRowFirstColumn="0" w:lastRowLastColumn="0"/>
+                            <w:tcW w:w="2693" w:type="dxa"/>
+                            <w:tcBorders>
+                              <w:top w:val="single" w:sz="4" w:space="0" w:color="auto"/>
+                            </w:tcBorders>
+                            <w:shd w:val="clear" w:color="auto" w:fill="F2F2F2" w:themeFill="background1" w:themeFillShade="F2"/>
+                            <w:vAlign w:val="center"/>
+                          </w:tcPr>
+                          <w:p>
+                            <w:pPr>
+                              <w:pStyle w:val="Geenafstand"/>
+                              <w:jc w:val="both"/>
+                              <w:rPr>
+                                <w:rFonts w:ascii="Calibri" w:eastAsia="Noto Sans JP Regular" w:hAnsi="Calibri" w:cs="Calibri"/>
+                                <w:sz w:val="25"/>
+                                <w:szCs w:val="25"/>
+                              </w:rPr>
+                            </w:pPr>
+                            <w:r>
+                              <w:rPr>
+                                <w:rFonts w:ascii="Calibri" w:eastAsia="Noto Sans JP Regular" w:hAnsi="Calibri" w:cs="Calibri"/>
+                                <w:sz w:val="25"/>
+                                <w:szCs w:val="25"/>
+                              </w:rPr>
+                              <w:t xml:space="preserve">Accountmanager</w:t>
+                            </w:r>
+                          </w:p>
+                        </w:tc>
+                        <w:tc>
+                          <w:tcPr>
+                            <w:tcW w:w="6508" w:type="dxa"/>
+                            <w:tcBorders>
+                              <w:top w:val="single" w:sz="4" w:space="0" w:color="auto"/>
+                            </w:tcBorders>
+                            <w:vAlign w:val="center"/>
+                          </w:tcPr>
+                          <w:p>
+                            <w:pPr>
+                              <w:pStyle w:val="Geenafstand"/>
+                              <w:jc w:val="both"/>
+                              <w:cnfStyle w:val="000000000000" w:firstRow="0" w:lastRow="0" w:firstColumn="0" w:lastColumn="0" w:oddVBand="0" w:evenVBand="0" w:oddHBand="0" w:evenHBand="0" w:firstRowFirstColumn="0" w:firstRowLastColumn="0" w:lastRowFirstColumn="0" w:lastRowLastColumn="0"/>
+                              <w:rPr>
+                                <w:rFonts w:eastAsia="Noto Sans JP Regular" w:cs="Calibri"/>
+                                <w:sz w:val="25"/>
+                                <w:szCs w:val="25"/>
+                                <w:highlight w:val="yellow"/>
+                                <w:lang w:val="en-US"/>
+                              </w:rPr>
+                            </w:pPr>
+                            <w:r>
+                              <w:rPr>
+                                <w:rFonts w:eastAsia="Noto Sans JP Regular" w:cs="Calibri"/>
+                                <w:sz w:val="25"/>
+                                <w:szCs w:val="25"/>
+                                <w:highlight w:val="yellow"/>
+                                <w:lang w:val="en-US"/>
+                              </w:rPr>
+                              <w:t xml:space="preserve">+++accountmanager+++</w:t>
+                            </w:r>
+                          </w:p>
+                        </w:tc>
+                      </w:tr>
+                      <w:tr>
+                        <w:trPr>
+                          <w:cnfStyle w:val="000000100000" w:firstRow="0" w:lastRow="0" w:firstColumn="0" w:lastColumn="0" w:oddVBand="0" w:evenVBand="0" w:oddHBand="1" w:evenHBand="0" w:firstRowFirstColumn="0" w:firstRowLastColumn="0" w:lastRowFirstColumn="0" w:lastRowLastColumn="0"/>
+                          <w:trHeight w:val="539"/>
+                        </w:trPr>
+                        <w:tc>
+                          <w:tcPr>
+                            <w:cnfStyle w:val="001000000000" w:firstRow="0" w:lastRow="0" w:firstColumn="1" w:lastColumn="0" w:oddVBand="0" w:evenVBand="0" w:oddHBand="0" w:evenHBand="0" w:firstRowFirstColumn="0" w:firstRowLastColumn="0" w:lastRowFirstColumn="0" w:lastRowLastColumn="0"/>
+                            <w:tcW w:w="2693" w:type="dxa"/>
+                            <w:tcBorders>
+                              <w:bottom w:val="single" w:sz="4" w:space="0" w:color="auto"/>
+                            </w:tcBorders>
+                            <w:vAlign w:val="center"/>
+                          </w:tcPr>
+                          <w:p>
+                            <w:pPr>
+                              <w:pStyle w:val="Geenafstand"/>
+                              <w:rPr>
+                                <w:rFonts w:ascii="Calibri" w:eastAsia="Noto Sans JP Regular" w:hAnsi="Calibri" w:cs="Calibri"/>
+                                <w:sz w:val="25"/>
+                                <w:szCs w:val="25"/>
+                              </w:rPr>
+                            </w:pPr>
+                            <w:r>
+                              <w:rPr>
+                                <w:rFonts w:ascii="Calibri" w:eastAsia="Noto Sans JP Regular" w:hAnsi="Calibri" w:cs="Calibri"/>
+                                <w:sz w:val="25"/>
+                                <w:szCs w:val="25"/>
+                              </w:rPr>
+                              <w:t xml:space="preserve">Km. / Reistijd</w:t>
                             </w:r>
                           </w:p>
                         </w:tc>
@@ -3713,22 +3530,149 @@
                             <w:pPr>
                               <w:pStyle w:val="Geenafstand"/>
                               <w:jc w:val="both"/>
-                              <w:cnfStyle w:val="100000000000" w:firstRow="1" w:lastRow="0" w:firstColumn="0" w:lastColumn="0" w:oddVBand="0" w:evenVBand="0" w:oddHBand="0" w:evenHBand="0" w:firstRowFirstColumn="0" w:firstRowLastColumn="0" w:lastRowFirstColumn="0" w:lastRowLastColumn="0"/>
-                              <w:rPr>
-                                <w:rFonts w:ascii="Calibri" w:eastAsia="Noto Sans JP Regular" w:hAnsi="Calibri" w:cs="Calibri"/>
-                                <w:b w:val="0"/>
-                                <w:bCs w:val="0"/>
-                                <w:sz w:val="25"/>
-                                <w:szCs w:val="25"/>
-                              </w:rPr>
-                            </w:pPr>
-                            <w:r>
+                              <w:cnfStyle w:val="000000100000" w:firstRow="0" w:lastRow="0" w:firstColumn="0" w:lastColumn="0" w:oddVBand="0" w:evenVBand="0" w:oddHBand="1" w:evenHBand="0" w:firstRowFirstColumn="0" w:firstRowLastColumn="0" w:lastRowFirstColumn="0" w:lastRowLastColumn="0"/>
                               <w:rPr>
                                 <w:rFonts w:ascii="Calibri" w:eastAsia="Noto Sans JP Regular" w:hAnsi="Calibri" w:cs="Calibri"/>
                                 <w:sz w:val="25"/>
                                 <w:szCs w:val="25"/>
                               </w:rPr>
-                              <w:t>Ontdek elkaars kantoor DNA</w:t>
+                            </w:pPr>
+                            <w:r>
+                              <w:rPr>
+                                <w:rFonts w:ascii="Calibri" w:eastAsia="Noto Sans JP Regular" w:hAnsi="Calibri" w:cs="Calibri"/>
+                                <w:sz w:val="25"/>
+                                <w:szCs w:val="25"/>
+                              </w:rPr>
+                              <w:t xml:space="preserve">+++reis+++</w:t>
+                            </w:r>
+                          </w:p>
+                        </w:tc>
+                      </w:tr>
+                      <w:tr>
+                        <w:trPr>
+                          <w:cnfStyle w:val="000000100000" w:firstRow="0" w:lastRow="0" w:firstColumn="0" w:lastColumn="0" w:oddVBand="0" w:evenVBand="0" w:oddHBand="1" w:evenHBand="0" w:firstRowFirstColumn="0" w:firstRowLastColumn="0" w:lastRowFirstColumn="0" w:lastRowLastColumn="0"/>
+                          <w:trHeight w:val="539"/>
+                        </w:trPr>
+                        <w:tc>
+                          <w:tcPr>
+                            <w:cnfStyle w:val="001000000000" w:firstRow="0" w:lastRow="0" w:firstColumn="1" w:lastColumn="0" w:oddVBand="0" w:evenVBand="0" w:oddHBand="0" w:evenHBand="0" w:firstRowFirstColumn="0" w:firstRowLastColumn="0" w:lastRowFirstColumn="0" w:lastRowLastColumn="0"/>
+                            <w:tcW w:w="2693" w:type="dxa"/>
+                            <w:tcBorders>
+                              <w:bottom w:val="single" w:sz="4" w:space="0" w:color="auto"/>
+                            </w:tcBorders>
+                            <w:vAlign w:val="center"/>
+                          </w:tcPr>
+                          <w:p>
+                            <w:pPr>
+                              <w:pStyle w:val="Geenafstand"/>
+                              <w:jc w:val="both"/>
+                              <w:rPr>
+                                <w:rFonts w:ascii="Calibri" w:eastAsia="Noto Sans JP Regular" w:hAnsi="Calibri" w:cs="Calibri"/>
+                                <w:sz w:val="25"/>
+                                <w:szCs w:val="25"/>
+                              </w:rPr>
+                            </w:pPr>
+                            <w:r>
+                              <w:rPr>
+                                <w:rFonts w:ascii="Calibri" w:eastAsia="Noto Sans JP Regular" w:hAnsi="Calibri" w:cs="Calibri"/>
+                                <w:sz w:val="25"/>
+                                <w:szCs w:val="25"/>
+                              </w:rPr>
+                              <w:t xml:space="preserve">Contactpersoon</w:t>
+                            </w:r>
+                          </w:p>
+                        </w:tc>
+                        <w:tc>
+                          <w:tcPr>
+                            <w:tcW w:w="6508" w:type="dxa"/>
+                            <w:tcBorders>
+                              <w:bottom w:val="single" w:sz="4" w:space="0" w:color="auto"/>
+                            </w:tcBorders>
+                            <w:shd w:val="clear" w:color="auto" w:fill="FFFFFF" w:themeFill="background1"/>
+                            <w:vAlign w:val="center"/>
+                          </w:tcPr>
+                          <w:p>
+                            <w:pPr>
+                              <w:pStyle w:val="Geenafstand"/>
+                              <w:jc w:val="both"/>
+                              <w:cnfStyle w:val="000000100000" w:firstRow="0" w:lastRow="0" w:firstColumn="0" w:lastColumn="0" w:oddVBand="0" w:evenVBand="0" w:oddHBand="1" w:evenHBand="0" w:firstRowFirstColumn="0" w:firstRowLastColumn="0" w:lastRowFirstColumn="0" w:lastRowLastColumn="0"/>
+                              <w:rPr>
+                                <w:rFonts w:ascii="Calibri" w:eastAsia="Noto Sans JP Regular" w:hAnsi="Calibri" w:cs="Calibri"/>
+                                <w:sz w:val="25"/>
+                                <w:szCs w:val="25"/>
+                              </w:rPr>
+                            </w:pPr>
+                            <w:r>
+                              <w:rPr>
+                                <w:rFonts w:ascii="Calibri" w:eastAsia="Noto Sans JP Regular" w:hAnsi="Calibri" w:cs="Calibri"/>
+                                <w:sz w:val="25"/>
+                                <w:szCs w:val="25"/>
+                              </w:rPr>
+                              <w:fldChar w:fldCharType="begin"/>
+                              <w:t xml:space="preserve">+++contactpersoon+++</w:t>
+                            </w:r>
+                          </w:p>
+                        </w:tc>
+                      </w:tr>
+                      <w:tr>
+                        <w:trPr>
+                          <w:trHeight w:val="539"/>
+                        </w:trPr>
+                        <w:tc>
+                          <w:tcPr>
+                            <w:cnfStyle w:val="001000000000" w:firstRow="0" w:lastRow="0" w:firstColumn="1" w:lastColumn="0" w:oddVBand="0" w:evenVBand="0" w:oddHBand="0" w:evenHBand="0" w:firstRowFirstColumn="0" w:firstRowLastColumn="0" w:lastRowFirstColumn="0" w:lastRowLastColumn="0"/>
+                            <w:tcW w:w="2693" w:type="dxa"/>
+                            <w:tcBorders>
+                              <w:bottom w:val="single" w:sz="4" w:space="0" w:color="auto"/>
+                            </w:tcBorders>
+                            <w:shd w:val="clear" w:color="auto" w:fill="F2F2F2" w:themeFill="background1" w:themeFillShade="F2"/>
+                            <w:vAlign w:val="center"/>
+                          </w:tcPr>
+                          <w:p>
+                            <w:pPr>
+                              <w:pStyle w:val="Geenafstand"/>
+                              <w:jc w:val="both"/>
+                              <w:rPr>
+                                <w:rFonts w:ascii="Calibri" w:eastAsia="Noto Sans JP Regular" w:hAnsi="Calibri" w:cs="Calibri"/>
+                                <w:sz w:val="25"/>
+                                <w:szCs w:val="25"/>
+                              </w:rPr>
+                            </w:pPr>
+                            <w:r>
+                              <w:rPr>
+                                <w:rFonts w:eastAsia="Noto Sans JP Regular" w:cs="Calibri"/>
+                                <w:sz w:val="25"/>
+                                <w:szCs w:val="25"/>
+                              </w:rPr>
+                              <w:t xml:space="preserve">Klantcontactmoment</w:t>
+                            </w:r>
+                          </w:p>
+                        </w:tc>
+                        <w:tc>
+                          <w:tcPr>
+                            <w:tcW w:w="6508" w:type="dxa"/>
+                            <w:tcBorders>
+                              <w:bottom w:val="single" w:sz="4" w:space="0" w:color="auto"/>
+                            </w:tcBorders>
+                            <w:shd w:val="clear" w:color="auto" w:fill="FFFFFF" w:themeFill="background1"/>
+                            <w:vAlign w:val="center"/>
+                          </w:tcPr>
+                          <w:p>
+                            <w:pPr>
+                              <w:cnfStyle w:val="000000000000" w:firstRow="0" w:lastRow="0" w:firstColumn="0" w:lastColumn="0" w:oddVBand="0" w:evenVBand="0" w:oddHBand="0" w:evenHBand="0" w:firstRowFirstColumn="0" w:firstRowLastColumn="0" w:lastRowFirstColumn="0" w:lastRowLastColumn="0"/>
+                              <w:rPr>
+                                <w:bCs/>
+                                <w:szCs w:val="25"/>
+                                <w:highlight w:val="yellow"/>
+                              </w:rPr>
+                            </w:pPr>
+                            <w:r>
+                              <w:rPr>
+                                <w:bCs/>
+                                <w:szCs w:val="25"/>
+                                <w:highlight w:val="yellow"/>
+                              </w:rPr>
+                              <w:t xml:space="preserve">+++klantcontactmoment+++</w:t>
                             </w:r>
                           </w:p>
                         </w:tc>
@@ -3763,7 +3707,7 @@
                                 <w:sz w:val="25"/>
                                 <w:szCs w:val="25"/>
                               </w:rPr>
-                              <w:t xml:space="preserve">Duur</w:t>
+                              <w:t xml:space="preserve">Evaluatie deelnemers</w:t>
                             </w:r>
                           </w:p>
                         </w:tc>
@@ -3779,7 +3723,6 @@
                           <w:p>
                             <w:pPr>
                               <w:pStyle w:val="Geenafstand"/>
-                              <w:jc w:val="both"/>
                               <w:cnfStyle w:val="000000100000" w:firstRow="0" w:lastRow="0" w:firstColumn="0" w:lastColumn="0" w:oddVBand="0" w:evenVBand="0" w:oddHBand="1" w:evenHBand="0" w:firstRowFirstColumn="0" w:firstRowLastColumn="0" w:lastRowFirstColumn="0" w:lastRowLastColumn="0"/>
                               <w:rPr>
                                 <w:rFonts w:ascii="Calibri" w:eastAsia="Noto Sans JP Regular" w:hAnsi="Calibri" w:cs="Calibri"/>
@@ -3792,851 +3735,9 @@
                                 <w:rFonts w:ascii="Calibri" w:eastAsia="Noto Sans JP Regular" w:hAnsi="Calibri" w:cs="Calibri"/>
                                 <w:sz w:val="25"/>
                                 <w:szCs w:val="25"/>
-                              </w:rPr>
-                              <w:fldChar w:fldCharType="begin"/>
-                              <w:t xml:space="preserve">+++duur+++</w:t>
-                            </w:r>
-                          </w:p>
-                        </w:tc>
-                        <w:tc>
-                          <w:tcPr>
-                            <w:tcW w:w="6508" w:type="dxa"/>
-                            <w:tcBorders>
-                              <w:top w:val="single" w:sz="4" w:space="0" w:color="auto"/>
-                            </w:tcBorders>
-                            <w:shd w:val="clear" w:color="auto" w:fill="FFFFFF" w:themeFill="background1"/>
-                            <w:vAlign w:val="center"/>
-                          </w:tcPr>
-                          <w:p>
-                            <w:pPr>
-                              <w:pStyle w:val="Geenafstand"/>
-                              <w:jc w:val="both"/>
-                              <w:cnfStyle w:val="000000100000" w:firstRow="0" w:lastRow="0" w:firstColumn="0" w:lastColumn="0" w:oddVBand="0" w:evenVBand="0" w:oddHBand="1" w:evenHBand="0" w:firstRowFirstColumn="0" w:firstRowLastColumn="0" w:lastRowFirstColumn="0" w:lastRowLastColumn="0"/>
-                              <w:rPr>
-                                <w:rFonts w:ascii="Calibri" w:eastAsia="Noto Sans JP Regular" w:hAnsi="Calibri" w:cs="Calibri"/>
-                                <w:sz w:val="25"/>
-                                <w:szCs w:val="25"/>
-                              </w:rPr>
-                            </w:pPr>
-                            <w:r>
-                              <w:rPr>
-                                <w:rFonts w:ascii="Calibri" w:eastAsia="Noto Sans JP Regular" w:hAnsi="Calibri" w:cs="Calibri"/>
-                                <w:sz w:val="25"/>
-                                <w:szCs w:val="25"/>
-                              </w:rPr>
-                              <w:t xml:space="preserve">Beide trainingen duren vier uur </w:t>
-                            </w:r>
-                          </w:p>
-                        </w:tc>
-                      </w:tr>
-                      <w:tr>
-                        <w:trPr>
-                          <w:trHeight w:val="539"/>
-                        </w:trPr>
-                        <w:tc>
-                          <w:tcPr>
-                            <w:cnfStyle w:val="001000000000" w:firstRow="0" w:lastRow="0" w:firstColumn="1" w:lastColumn="0" w:oddVBand="0" w:evenVBand="0" w:oddHBand="0" w:evenHBand="0" w:firstRowFirstColumn="0" w:firstRowLastColumn="0" w:lastRowFirstColumn="0" w:lastRowLastColumn="0"/>
-                            <w:tcW w:w="2693" w:type="dxa"/>
-                            <w:shd w:val="clear" w:color="auto" w:fill="F2F2F2" w:themeFill="background1" w:themeFillShade="F2"/>
-                            <w:vAlign w:val="center"/>
-                          </w:tcPr>
-                          <w:p>
-                            <w:pPr>
-                              <w:pStyle w:val="Geenafstand"/>
-                              <w:jc w:val="both"/>
-                              <w:rPr>
-                                <w:rFonts w:ascii="Calibri" w:eastAsia="Noto Sans JP Regular" w:hAnsi="Calibri" w:cs="Calibri"/>
-                                <w:sz w:val="25"/>
-                                <w:szCs w:val="25"/>
-                              </w:rPr>
-                            </w:pPr>
-                            <w:r>
-                              <w:rPr>
-                                <w:rFonts w:ascii="Calibri" w:eastAsia="Noto Sans JP Regular" w:hAnsi="Calibri" w:cs="Calibri"/>
-                                <w:sz w:val="25"/>
-                                <w:szCs w:val="25"/>
-                              </w:rPr>
-                              <w:t xml:space="preserve">Datum &amp; tijd</w:t>
-                            </w:r>
-                          </w:p>
-                        </w:tc>
-                        <w:tc>
-                          <w:tcPr>
-                            <w:tcW w:w="6508" w:type="dxa"/>
-                            <w:shd w:val="clear" w:color="auto" w:fill="FFFFFF" w:themeFill="background1"/>
-                            <w:vAlign w:val="center"/>
-                          </w:tcPr>
-                          <w:p>
-                            <w:pPr>
-                              <w:pStyle w:val="Geenafstand"/>
-                              <w:cnfStyle w:val="000000000000" w:firstRow="0" w:lastRow="0" w:firstColumn="0" w:lastColumn="0" w:oddVBand="0" w:evenVBand="0" w:oddHBand="0" w:evenHBand="0" w:firstRowFirstColumn="0" w:firstRowLastColumn="0" w:lastRowFirstColumn="0" w:lastRowLastColumn="0"/>
-                              <w:rPr>
-                                <w:rFonts w:ascii="Calibri" w:eastAsia="Noto Sans JP Regular" w:hAnsi="Calibri" w:cs="Calibri"/>
-                                <w:sz w:val="25"/>
-                                <w:szCs w:val="25"/>
-                              </w:rPr>
-                            </w:pPr>
-                            <w:r>
-                              <w:rPr>
-                                <w:rFonts w:ascii="Calibri" w:eastAsia="Noto Sans JP Regular" w:hAnsi="Calibri" w:cs="Calibri"/>
-                                <w:sz w:val="25"/>
-                                <w:szCs w:val="25"/>
-                              </w:rPr>
-                              <w:fldChar w:fldCharType="begin"/>
-                              <w:t xml:space="preserve">+++datumTijd+++</w:t>
-                            </w:r>
-                          </w:p>
-                        </w:tc>
-                        <w:tc>
-                          <w:tcPr>
-                            <w:tcW w:w="6508" w:type="dxa"/>
-                            <w:shd w:val="clear" w:color="auto" w:fill="FFFFFF" w:themeFill="background1"/>
-                            <w:vAlign w:val="center"/>
-                          </w:tcPr>
-                          <w:p>
-                            <w:pPr>
-                              <w:pStyle w:val="Geenafstand"/>
-                              <w:cnfStyle w:val="000000000000" w:firstRow="0" w:lastRow="0" w:firstColumn="0" w:lastColumn="0" w:oddVBand="0" w:evenVBand="0" w:oddHBand="0" w:evenHBand="0" w:firstRowFirstColumn="0" w:firstRowLastColumn="0" w:lastRowFirstColumn="0" w:lastRowLastColumn="0"/>
-                              <w:rPr>
-                                <w:rFonts w:ascii="Calibri" w:eastAsia="Noto Sans JP Regular" w:hAnsi="Calibri" w:cs="Calibri"/>
-                                <w:sz w:val="25"/>
-                                <w:szCs w:val="25"/>
-                              </w:rPr>
-                            </w:pPr>
-                            <w:r>
-                              <w:rPr>
-                                <w:rFonts w:ascii="Calibri" w:eastAsia="Noto Sans JP Regular" w:hAnsi="Calibri" w:cs="Calibri"/>
-                                <w:sz w:val="25"/>
-                                <w:szCs w:val="25"/>
-                              </w:rPr>
-                              <w:t>Sessie 1: 10 februari 2026 van 9:00 uur tot 13:00</w:t>
-                            </w:r>
-                            <w:r>
-                              <w:rPr>
-                                <w:rFonts w:ascii="Calibri" w:eastAsia="Noto Sans JP Regular" w:hAnsi="Calibri" w:cs="Calibri"/>
-                                <w:sz w:val="25"/>
-                                <w:szCs w:val="25"/>
-                              </w:rPr>
-                              <w:br/>
-                              <w:t>Sessie 2: 3 maart 2026 van 9:00 uur tot 13:00 uur</w:t>
-                            </w:r>
-                          </w:p>
-                        </w:tc>
-                      </w:tr>
-                      <w:tr>
-                        <w:trPr>
-                          <w:cnfStyle w:val="000000100000" w:firstRow="0" w:lastRow="0" w:firstColumn="0" w:lastColumn="0" w:oddVBand="0" w:evenVBand="0" w:oddHBand="1" w:evenHBand="0" w:firstRowFirstColumn="0" w:firstRowLastColumn="0" w:lastRowFirstColumn="0" w:lastRowLastColumn="0"/>
-                          <w:trHeight w:val="539"/>
-                        </w:trPr>
-                        <w:tc>
-                          <w:tcPr>
-                            <w:cnfStyle w:val="001000000000" w:firstRow="0" w:lastRow="0" w:firstColumn="1" w:lastColumn="0" w:oddVBand="0" w:evenVBand="0" w:oddHBand="0" w:evenHBand="0" w:firstRowFirstColumn="0" w:firstRowLastColumn="0" w:lastRowFirstColumn="0" w:lastRowLastColumn="0"/>
-                            <w:tcW w:w="2693" w:type="dxa"/>
-                            <w:vAlign w:val="center"/>
-                          </w:tcPr>
-                          <w:p>
-                            <w:pPr>
-                              <w:pStyle w:val="Geenafstand"/>
-                              <w:jc w:val="both"/>
-                              <w:rPr>
-                                <w:rFonts w:ascii="Calibri" w:eastAsia="Noto Sans JP Regular" w:hAnsi="Calibri" w:cs="Calibri"/>
-                                <w:sz w:val="25"/>
-                                <w:szCs w:val="25"/>
-                              </w:rPr>
-                            </w:pPr>
-                            <w:r>
-                              <w:rPr>
-                                <w:rFonts w:ascii="Calibri" w:eastAsia="Noto Sans JP Regular" w:hAnsi="Calibri" w:cs="Calibri"/>
-                                <w:sz w:val="25"/>
-                                <w:szCs w:val="25"/>
-                              </w:rPr>
-                              <w:t xml:space="preserve">Groepsgrootte</w:t>
-                            </w:r>
-                          </w:p>
-                        </w:tc>
-                        <w:tc>
-                          <w:tcPr>
-                            <w:tcW w:w="6508" w:type="dxa"/>
-                            <w:shd w:val="clear" w:color="auto" w:fill="FFFFFF" w:themeFill="background1"/>
-                            <w:vAlign w:val="center"/>
-                          </w:tcPr>
-                          <w:p>
-                            <w:pPr>
-                              <w:pStyle w:val="Geenafstand"/>
-                              <w:jc w:val="both"/>
-                              <w:cnfStyle w:val="000000100000" w:firstRow="0" w:lastRow="0" w:firstColumn="0" w:lastColumn="0" w:oddVBand="0" w:evenVBand="0" w:oddHBand="1" w:evenHBand="0" w:firstRowFirstColumn="0" w:firstRowLastColumn="0" w:lastRowFirstColumn="0" w:lastRowLastColumn="0"/>
-                              <w:rPr>
-                                <w:rFonts w:ascii="Calibri" w:eastAsia="Noto Sans JP Regular" w:hAnsi="Calibri" w:cs="Calibri"/>
-                                <w:sz w:val="25"/>
-                                <w:szCs w:val="25"/>
-                              </w:rPr>
-                            </w:pPr>
-                            <w:r>
-                              <w:rPr>
-                                <w:rFonts w:ascii="Calibri" w:eastAsia="Noto Sans JP Regular" w:hAnsi="Calibri" w:cs="Calibri"/>
-                                <w:sz w:val="25"/>
-                                <w:szCs w:val="25"/>
-                              </w:rPr>
-                              <w:fldChar w:fldCharType="begin"/>
-                              <w:t xml:space="preserve">+++groepsgrootte+++</w:t>
-                            </w:r>
-                          </w:p>
-                        </w:tc>
-                        <w:tc>
-                          <w:tcPr>
-                            <w:tcW w:w="6508" w:type="dxa"/>
-                            <w:shd w:val="clear" w:color="auto" w:fill="FFFFFF" w:themeFill="background1"/>
-                            <w:vAlign w:val="center"/>
-                          </w:tcPr>
-                          <w:p>
-                            <w:pPr>
-                              <w:pStyle w:val="Geenafstand"/>
-                              <w:jc w:val="both"/>
-                              <w:cnfStyle w:val="000000100000" w:firstRow="0" w:lastRow="0" w:firstColumn="0" w:lastColumn="0" w:oddVBand="0" w:evenVBand="0" w:oddHBand="1" w:evenHBand="0" w:firstRowFirstColumn="0" w:firstRowLastColumn="0" w:lastRowFirstColumn="0" w:lastRowLastColumn="0"/>
-                              <w:rPr>
-                                <w:rFonts w:ascii="Calibri" w:eastAsia="Noto Sans JP Regular" w:hAnsi="Calibri" w:cs="Calibri"/>
-                                <w:sz w:val="25"/>
-                                <w:szCs w:val="25"/>
-                              </w:rPr>
-                            </w:pPr>
-                            <w:r>
-                              <w:rPr>
-                                <w:rFonts w:ascii="Calibri" w:eastAsia="Noto Sans JP Regular" w:hAnsi="Calibri" w:cs="Calibri"/>
-                                <w:sz w:val="25"/>
-                                <w:szCs w:val="25"/>
-                              </w:rPr>
-                              <w:t xml:space="preserve">Beide trainingen hebben zes deelnemers </w:t>
-                            </w:r>
-                          </w:p>
-                        </w:tc>
-                      </w:tr>
-                      <w:tr>
-                        <w:trPr>
-                          <w:trHeight w:val="539"/>
-                        </w:trPr>
-                        <w:tc>
-                          <w:tcPr>
-                            <w:cnfStyle w:val="001000000000" w:firstRow="0" w:lastRow="0" w:firstColumn="1" w:lastColumn="0" w:oddVBand="0" w:evenVBand="0" w:oddHBand="0" w:evenHBand="0" w:firstRowFirstColumn="0" w:firstRowLastColumn="0" w:lastRowFirstColumn="0" w:lastRowLastColumn="0"/>
-                            <w:tcW w:w="2693" w:type="dxa"/>
-                            <w:shd w:val="clear" w:color="auto" w:fill="F2F2F2" w:themeFill="background1" w:themeFillShade="F2"/>
-                            <w:vAlign w:val="center"/>
-                          </w:tcPr>
-                          <w:p>
-                            <w:pPr>
-                              <w:pStyle w:val="Geenafstand"/>
-                              <w:jc w:val="both"/>
-                              <w:rPr>
-                                <w:rFonts w:ascii="Calibri" w:eastAsia="Noto Sans JP Regular" w:hAnsi="Calibri" w:cs="Calibri"/>
-                                <w:sz w:val="25"/>
-                                <w:szCs w:val="25"/>
-                              </w:rPr>
-                            </w:pPr>
-                            <w:r>
-                              <w:rPr>
-                                <w:rFonts w:ascii="Calibri" w:eastAsia="Noto Sans JP Regular" w:hAnsi="Calibri" w:cs="Calibri"/>
-                                <w:sz w:val="25"/>
-                                <w:szCs w:val="25"/>
-                              </w:rPr>
-                              <w:t xml:space="preserve">Trainingslocatie</w:t>
-                            </w:r>
-                          </w:p>
-                        </w:tc>
-                        <w:tc>
-                          <w:tcPr>
-                            <w:tcW w:w="6508" w:type="dxa"/>
-                            <w:vAlign w:val="center"/>
-                          </w:tcPr>
-                          <w:p>
-                            <w:pPr>
-                              <w:pStyle w:val="Geenafstand"/>
-                              <w:jc w:val="both"/>
-                              <w:cnfStyle w:val="000000000000" w:firstRow="0" w:lastRow="0" w:firstColumn="0" w:lastColumn="0" w:oddVBand="0" w:evenVBand="0" w:oddHBand="0" w:evenHBand="0" w:firstRowFirstColumn="0" w:firstRowLastColumn="0" w:lastRowFirstColumn="0" w:lastRowLastColumn="0"/>
-                              <w:rPr>
-                                <w:rFonts w:ascii="Calibri" w:eastAsia="Noto Sans JP Regular" w:hAnsi="Calibri" w:cs="Calibri"/>
-                                <w:sz w:val="25"/>
-                                <w:szCs w:val="25"/>
-                              </w:rPr>
-                            </w:pPr>
-                            <w:r>
-                              <w:rPr>
-                                <w:rFonts w:ascii="Calibri" w:eastAsia="Noto Sans JP Regular" w:hAnsi="Calibri" w:cs="Calibri"/>
-                                <w:sz w:val="25"/>
-                                <w:szCs w:val="25"/>
-                              </w:rPr>
-                              <w:fldChar w:fldCharType="begin"/>
-                              <w:t xml:space="preserve">+++locatie+++</w:t>
-                            </w:r>
-                          </w:p>
-                        </w:tc>
-                        <w:tc>
-                          <w:tcPr>
-                            <w:tcW w:w="6508" w:type="dxa"/>
-                            <w:vAlign w:val="center"/>
-                          </w:tcPr>
-                          <w:p>
-                            <w:pPr>
-                              <w:pStyle w:val="Geenafstand"/>
-                              <w:jc w:val="both"/>
-                              <w:cnfStyle w:val="000000000000" w:firstRow="0" w:lastRow="0" w:firstColumn="0" w:lastColumn="0" w:oddVBand="0" w:evenVBand="0" w:oddHBand="0" w:evenHBand="0" w:firstRowFirstColumn="0" w:firstRowLastColumn="0" w:lastRowFirstColumn="0" w:lastRowLastColumn="0"/>
-                              <w:rPr>
-                                <w:rFonts w:ascii="Calibri" w:eastAsia="Noto Sans JP Regular" w:hAnsi="Calibri" w:cs="Calibri"/>
-                                <w:sz w:val="25"/>
-                                <w:szCs w:val="25"/>
-                              </w:rPr>
-                            </w:pPr>
-                            <w:r>
-                              <w:rPr>
-                                <w:rFonts w:ascii="Calibri" w:eastAsia="Noto Sans JP Regular" w:hAnsi="Calibri" w:cs="Calibri"/>
-                                <w:sz w:val="25"/>
-                                <w:szCs w:val="25"/>
-                              </w:rPr>
-                              <w:t>Oude Stadsgracht 1, 5611 DD Eindhoven</w:t>
-                            </w:r>
-                          </w:p>
-                        </w:tc>
-                      </w:tr>
-                      <w:tr>
-                        <w:trPr>
-                          <w:cnfStyle w:val="000000100000" w:firstRow="0" w:lastRow="0" w:firstColumn="0" w:lastColumn="0" w:oddVBand="0" w:evenVBand="0" w:oddHBand="1" w:evenHBand="0" w:firstRowFirstColumn="0" w:firstRowLastColumn="0" w:lastRowFirstColumn="0" w:lastRowLastColumn="0"/>
-                          <w:trHeight w:val="539"/>
-                        </w:trPr>
-                        <w:tc>
-                          <w:tcPr>
-                            <w:cnfStyle w:val="001000000000" w:firstRow="0" w:lastRow="0" w:firstColumn="1" w:lastColumn="0" w:oddVBand="0" w:evenVBand="0" w:oddHBand="0" w:evenHBand="0" w:firstRowFirstColumn="0" w:firstRowLastColumn="0" w:lastRowFirstColumn="0" w:lastRowLastColumn="0"/>
-                            <w:tcW w:w="2693" w:type="dxa"/>
-                            <w:tcBorders>
-                              <w:bottom w:val="single" w:sz="4" w:space="0" w:color="auto"/>
-                            </w:tcBorders>
-                            <w:vAlign w:val="center"/>
-                          </w:tcPr>
-                          <w:p>
-                            <w:pPr>
-                              <w:pStyle w:val="Geenafstand"/>
-                              <w:jc w:val="both"/>
-                              <w:rPr>
-                                <w:rFonts w:ascii="Calibri" w:eastAsia="Noto Sans JP Regular" w:hAnsi="Calibri" w:cs="Calibri"/>
-                                <w:sz w:val="25"/>
-                                <w:szCs w:val="25"/>
-                              </w:rPr>
-                            </w:pPr>
-                            <w:r>
-                              <w:rPr>
-                                <w:rFonts w:ascii="Calibri" w:eastAsia="Noto Sans JP Regular" w:hAnsi="Calibri" w:cs="Calibri"/>
-                                <w:sz w:val="25"/>
-                                <w:szCs w:val="25"/>
-                              </w:rPr>
-                              <w:t xml:space="preserve">Voertaal</w:t>
-                            </w:r>
-                          </w:p>
-                        </w:tc>
-                        <w:tc>
-                          <w:tcPr>
-                            <w:tcW w:w="6508" w:type="dxa"/>
-                            <w:tcBorders>
-                              <w:bottom w:val="single" w:sz="4" w:space="0" w:color="auto"/>
-                            </w:tcBorders>
-                            <w:vAlign w:val="center"/>
-                          </w:tcPr>
-                          <w:p>
-                            <w:pPr>
-                              <w:pStyle w:val="Geenafstand"/>
-                              <w:jc w:val="both"/>
-                              <w:cnfStyle w:val="000000100000" w:firstRow="0" w:lastRow="0" w:firstColumn="0" w:lastColumn="0" w:oddVBand="0" w:evenVBand="0" w:oddHBand="1" w:evenHBand="0" w:firstRowFirstColumn="0" w:firstRowLastColumn="0" w:lastRowFirstColumn="0" w:lastRowLastColumn="0"/>
-                              <w:rPr>
-                                <w:rFonts w:ascii="Calibri" w:eastAsia="Noto Sans JP Regular" w:hAnsi="Calibri" w:cs="Calibri"/>
-                                <w:sz w:val="25"/>
-                                <w:szCs w:val="25"/>
-                              </w:rPr>
-                            </w:pPr>
-                            <w:r>
-                              <w:rPr>
-                                <w:rFonts w:ascii="Calibri" w:eastAsia="Noto Sans JP Regular" w:hAnsi="Calibri" w:cs="Calibri"/>
-                                <w:sz w:val="25"/>
-                                <w:szCs w:val="25"/>
                                 <w:highlight w:val="yellow"/>
                               </w:rPr>
-                              <w:t xml:space="preserve">+++voertaal+++</w:t>
-                            </w:r>
-                          </w:p>
-                        </w:tc>
-                        <w:tc>
-                          <w:tcPr>
-                            <w:tcW w:w="6508" w:type="dxa"/>
-                            <w:tcBorders>
-                              <w:bottom w:val="single" w:sz="4" w:space="0" w:color="auto"/>
-                            </w:tcBorders>
-                            <w:vAlign w:val="center"/>
-                          </w:tcPr>
-                          <w:p>
-                            <w:pPr>
-                              <w:pStyle w:val="Geenafstand"/>
-                              <w:jc w:val="both"/>
-                              <w:cnfStyle w:val="000000100000" w:firstRow="0" w:lastRow="0" w:firstColumn="0" w:lastColumn="0" w:oddVBand="0" w:evenVBand="0" w:oddHBand="1" w:evenHBand="0" w:firstRowFirstColumn="0" w:firstRowLastColumn="0" w:lastRowFirstColumn="0" w:lastRowLastColumn="0"/>
-                              <w:rPr>
-                                <w:rFonts w:ascii="Calibri" w:eastAsia="Noto Sans JP Regular" w:hAnsi="Calibri" w:cs="Calibri"/>
-                                <w:sz w:val="25"/>
-                                <w:szCs w:val="25"/>
-                              </w:rPr>
-                            </w:pPr>
-                            <w:r>
-                              <w:rPr>
-                                <w:rFonts w:ascii="Calibri" w:eastAsia="Noto Sans JP Regular" w:hAnsi="Calibri" w:cs="Calibri"/>
-                                <w:sz w:val="25"/>
-                                <w:szCs w:val="25"/>
-                              </w:rPr>
-                              <w:t xml:space="preserve">Nederlands </w:t>
-                            </w:r>
-                          </w:p>
-                        </w:tc>
-                      </w:tr>
-                      <w:tr>
-                        <w:trPr>
-                          <w:cnfStyle w:val="100000000000" w:firstRow="1" w:lastRow="0" w:firstColumn="0" w:lastColumn="0" w:oddVBand="0" w:evenVBand="0" w:oddHBand="0" w:evenHBand="0" w:firstRowFirstColumn="0" w:firstRowLastColumn="0" w:lastRowFirstColumn="0" w:lastRowLastColumn="0"/>
-                          <w:trHeight w:val="539"/>
-                        </w:trPr>
-                        <w:tc>
-                          <w:tcPr>
-                            <w:cnfStyle w:val="001000000000" w:firstRow="0" w:lastRow="0" w:firstColumn="1" w:lastColumn="0" w:oddVBand="0" w:evenVBand="0" w:oddHBand="0" w:evenHBand="0" w:firstRowFirstColumn="0" w:firstRowLastColumn="0" w:lastRowFirstColumn="0" w:lastRowLastColumn="0"/>
-                            <w:tcW w:w="2693" w:type="dxa"/>
-                            <w:tcBorders>
-                              <w:bottom w:val="single" w:sz="4" w:space="0" w:color="auto"/>
-                            </w:tcBorders>
-                            <w:shd w:val="clear" w:color="auto" w:fill="F2F2F2" w:themeFill="background1" w:themeFillShade="F2"/>
-                            <w:vAlign w:val="center"/>
-                          </w:tcPr>
-                          <w:p>
-                            <w:pPr>
-                              <w:pStyle w:val="Geenafstand"/>
-                              <w:jc w:val="both"/>
-                              <w:rPr>
-                                <w:rFonts w:ascii="Calibri" w:eastAsia="Noto Sans JP Regular" w:hAnsi="Calibri" w:cs="Calibri"/>
-                                <w:sz w:val="25"/>
-                                <w:szCs w:val="25"/>
-                              </w:rPr>
-                            </w:pPr>
-                            <w:r>
-                              <w:rPr>
-                                <w:rFonts w:ascii="Calibri" w:eastAsia="Noto Sans JP Regular" w:hAnsi="Calibri" w:cs="Calibri"/>
-                                <w:sz w:val="25"/>
-                                <w:szCs w:val="25"/>
-                              </w:rPr>
-                              <w:t xml:space="preserve">Materialen uiterlijk op</w:t>
-                            </w:r>
-                          </w:p>
-                        </w:tc>
-                        <w:tc>
-                          <w:tcPr>
-                            <w:tcW w:w="6508" w:type="dxa"/>
-                            <w:tcBorders>
-                              <w:bottom w:val="single" w:sz="4" w:space="0" w:color="auto"/>
-                            </w:tcBorders>
-                            <w:shd w:val="clear" w:color="auto" w:fill="FFFFFF" w:themeFill="background1"/>
-                            <w:vAlign w:val="center"/>
-                          </w:tcPr>
-                          <w:p>
-                            <w:pPr>
-                              <w:pStyle w:val="Geenafstand"/>
-                              <w:jc w:val="both"/>
-                              <w:cnfStyle w:val="100000000000" w:firstRow="1" w:lastRow="0" w:firstColumn="0" w:lastColumn="0" w:oddVBand="0" w:evenVBand="0" w:oddHBand="0" w:evenHBand="0" w:firstRowFirstColumn="0" w:firstRowLastColumn="0" w:lastRowFirstColumn="0" w:lastRowLastColumn="0"/>
-                              <w:rPr>
-                                <w:rFonts w:ascii="Calibri" w:eastAsia="Noto Sans JP Regular" w:hAnsi="Calibri" w:cs="Calibri"/>
-                                <w:sz w:val="25"/>
-                                <w:szCs w:val="25"/>
-                              </w:rPr>
-                            </w:pPr>
-                            <w:r>
-                              <w:rPr>
-                                <w:rFonts w:ascii="Calibri" w:eastAsia="Noto Sans JP Regular" w:hAnsi="Calibri" w:cs="Calibri"/>
-                                <w:sz w:val="25"/>
-                                <w:szCs w:val="25"/>
-                              </w:rPr>
-                              <w:fldChar w:fldCharType="begin"/>
-                              <w:t xml:space="preserve">+++materialenDeadline+++</w:t>
-                            </w:r>
-                          </w:p>
-                        </w:tc>
-                        <w:tc>
-                          <w:tcPr>
-                            <w:tcW w:w="6508" w:type="dxa"/>
-                            <w:tcBorders>
-                              <w:bottom w:val="single" w:sz="4" w:space="0" w:color="auto"/>
-                            </w:tcBorders>
-                            <w:shd w:val="clear" w:color="auto" w:fill="FFFFFF" w:themeFill="background1"/>
-                            <w:vAlign w:val="center"/>
-                          </w:tcPr>
-                          <w:p>
-                            <w:pPr>
-                              <w:pStyle w:val="Geenafstand"/>
-                              <w:jc w:val="both"/>
-                              <w:cnfStyle w:val="100000000000" w:firstRow="1" w:lastRow="0" w:firstColumn="0" w:lastColumn="0" w:oddVBand="0" w:evenVBand="0" w:oddHBand="0" w:evenHBand="0" w:firstRowFirstColumn="0" w:firstRowLastColumn="0" w:lastRowFirstColumn="0" w:lastRowLastColumn="0"/>
-                              <w:rPr>
-                                <w:rFonts w:ascii="Calibri" w:eastAsia="Noto Sans JP Regular" w:hAnsi="Calibri" w:cs="Calibri"/>
-                                <w:b w:val="0"/>
-                                <w:bCs w:val="0"/>
-                                <w:sz w:val="25"/>
-                                <w:szCs w:val="25"/>
-                              </w:rPr>
-                            </w:pPr>
-                            <w:r>
-                              <w:rPr>
-                                <w:rFonts w:ascii="Calibri" w:eastAsia="Noto Sans JP Regular" w:hAnsi="Calibri" w:cs="Calibri"/>
-                                <w:sz w:val="25"/>
-                                <w:szCs w:val="25"/>
-                              </w:rPr>
-                              <w:t>Ontdek elkaars kantoor DNA</w:t>
-                            </w:r>
-                          </w:p>
-                        </w:tc>
-                      </w:tr>
-                      <w:tr>
-                        <w:trPr>
-                          <w:trHeight w:val="539"/>
-                        </w:trPr>
-                        <w:tc>
-                          <w:tcPr>
-                            <w:cnfStyle w:val="001000000000" w:firstRow="0" w:lastRow="0" w:firstColumn="1" w:lastColumn="0" w:oddVBand="0" w:evenVBand="0" w:oddHBand="0" w:evenHBand="0" w:firstRowFirstColumn="0" w:firstRowLastColumn="0" w:lastRowFirstColumn="0" w:lastRowLastColumn="0"/>
-                            <w:tcW w:w="2693" w:type="dxa"/>
-                            <w:tcBorders>
-                              <w:top w:val="single" w:sz="4" w:space="0" w:color="auto"/>
-                            </w:tcBorders>
-                            <w:shd w:val="clear" w:color="auto" w:fill="F2F2F2" w:themeFill="background1" w:themeFillShade="F2"/>
-                            <w:vAlign w:val="center"/>
-                          </w:tcPr>
-                          <w:p>
-                            <w:pPr>
-                              <w:pStyle w:val="Geenafstand"/>
-                              <w:jc w:val="both"/>
-                              <w:rPr>
-                                <w:rFonts w:ascii="Calibri" w:eastAsia="Noto Sans JP Regular" w:hAnsi="Calibri" w:cs="Calibri"/>
-                                <w:sz w:val="25"/>
-                                <w:szCs w:val="25"/>
-                              </w:rPr>
-                            </w:pPr>
-                            <w:r>
-                              <w:rPr>
-                                <w:rFonts w:ascii="Calibri" w:eastAsia="Noto Sans JP Regular" w:hAnsi="Calibri" w:cs="Calibri"/>
-                                <w:sz w:val="25"/>
-                                <w:szCs w:val="25"/>
-                              </w:rPr>
-                              <w:t xml:space="preserve">Accountmanager</w:t>
-                            </w:r>
-                          </w:p>
-                        </w:tc>
-                        <w:tc>
-                          <w:tcPr>
-                            <w:tcW w:w="6508" w:type="dxa"/>
-                            <w:tcBorders>
-                              <w:top w:val="single" w:sz="4" w:space="0" w:color="auto"/>
-                            </w:tcBorders>
-                            <w:vAlign w:val="center"/>
-                          </w:tcPr>
-                          <w:p>
-                            <w:pPr>
-                              <w:pStyle w:val="Geenafstand"/>
-                              <w:jc w:val="both"/>
-                              <w:cnfStyle w:val="000000000000" w:firstRow="0" w:lastRow="0" w:firstColumn="0" w:lastColumn="0" w:oddVBand="0" w:evenVBand="0" w:oddHBand="0" w:evenHBand="0" w:firstRowFirstColumn="0" w:firstRowLastColumn="0" w:lastRowFirstColumn="0" w:lastRowLastColumn="0"/>
-                              <w:rPr>
-                                <w:rFonts w:eastAsia="Noto Sans JP Regular" w:cs="Calibri"/>
-                                <w:sz w:val="25"/>
-                                <w:szCs w:val="25"/>
-                                <w:highlight w:val="yellow"/>
-                                <w:lang w:val="en-US"/>
-                              </w:rPr>
-                            </w:pPr>
-                            <w:r>
-                              <w:rPr>
-                                <w:rFonts w:eastAsia="Noto Sans JP Regular" w:cs="Calibri"/>
-                                <w:sz w:val="25"/>
-                                <w:szCs w:val="25"/>
-                                <w:highlight w:val="yellow"/>
-                                <w:lang w:val="en-US"/>
-                              </w:rPr>
-                              <w:t xml:space="preserve">+++accountmanager+++</w:t>
-                            </w:r>
-                          </w:p>
-                        </w:tc>
-                        <w:tc>
-                          <w:tcPr>
-                            <w:tcW w:w="6508" w:type="dxa"/>
-                            <w:tcBorders>
-                              <w:top w:val="single" w:sz="4" w:space="0" w:color="auto"/>
-                            </w:tcBorders>
-                            <w:vAlign w:val="center"/>
-                          </w:tcPr>
-                          <w:p>
-                            <w:pPr>
-                              <w:pStyle w:val="Geenafstand"/>
-                              <w:jc w:val="both"/>
-                              <w:cnfStyle w:val="000000000000" w:firstRow="0" w:lastRow="0" w:firstColumn="0" w:lastColumn="0" w:oddVBand="0" w:evenVBand="0" w:oddHBand="0" w:evenHBand="0" w:firstRowFirstColumn="0" w:firstRowLastColumn="0" w:lastRowFirstColumn="0" w:lastRowLastColumn="0"/>
-                              <w:rPr>
-                                <w:rFonts w:eastAsia="Noto Sans JP Regular" w:cs="Calibri"/>
-                                <w:sz w:val="25"/>
-                                <w:szCs w:val="25"/>
-                              </w:rPr>
-                            </w:pPr>
-                            <w:r>
-                              <w:rPr>
-                                <w:rFonts w:eastAsia="Noto Sans JP Regular" w:cs="Calibri"/>
-                                <w:sz w:val="25"/>
-                                <w:szCs w:val="25"/>
-                              </w:rPr>
-                              <w:t>Susanne Claessen / 06-42843051</w:t>
-                            </w:r>
-                          </w:p>
-                        </w:tc>
-                      </w:tr>
-                      <w:tr>
-                        <w:trPr>
-                          <w:cnfStyle w:val="000000100000" w:firstRow="0" w:lastRow="0" w:firstColumn="0" w:lastColumn="0" w:oddVBand="0" w:evenVBand="0" w:oddHBand="1" w:evenHBand="0" w:firstRowFirstColumn="0" w:firstRowLastColumn="0" w:lastRowFirstColumn="0" w:lastRowLastColumn="0"/>
-                          <w:trHeight w:val="539"/>
-                        </w:trPr>
-                        <w:tc>
-                          <w:tcPr>
-                            <w:cnfStyle w:val="001000000000" w:firstRow="0" w:lastRow="0" w:firstColumn="1" w:lastColumn="0" w:oddVBand="0" w:evenVBand="0" w:oddHBand="0" w:evenHBand="0" w:firstRowFirstColumn="0" w:firstRowLastColumn="0" w:lastRowFirstColumn="0" w:lastRowLastColumn="0"/>
-                            <w:tcW w:w="2693" w:type="dxa"/>
-                            <w:tcBorders>
-                              <w:bottom w:val="single" w:sz="4" w:space="0" w:color="auto"/>
-                            </w:tcBorders>
-                            <w:vAlign w:val="center"/>
-                          </w:tcPr>
-                          <w:p>
-                            <w:pPr>
-                              <w:pStyle w:val="Geenafstand"/>
-                              <w:rPr>
-                                <w:rFonts w:ascii="Calibri" w:eastAsia="Noto Sans JP Regular" w:hAnsi="Calibri" w:cs="Calibri"/>
-                                <w:sz w:val="25"/>
-                                <w:szCs w:val="25"/>
-                              </w:rPr>
-                            </w:pPr>
-                            <w:r>
-                              <w:rPr>
-                                <w:rFonts w:ascii="Calibri" w:eastAsia="Noto Sans JP Regular" w:hAnsi="Calibri" w:cs="Calibri"/>
-                                <w:sz w:val="25"/>
-                                <w:szCs w:val="25"/>
-                              </w:rPr>
-                              <w:t xml:space="preserve">Km. / Reistijd</w:t>
-                            </w:r>
-                          </w:p>
-                        </w:tc>
-                        <w:tc>
-                          <w:tcPr>
-                            <w:tcW w:w="6508" w:type="dxa"/>
-                            <w:tcBorders>
-                              <w:bottom w:val="single" w:sz="4" w:space="0" w:color="auto"/>
-                            </w:tcBorders>
-                            <w:shd w:val="clear" w:color="auto" w:fill="FFFFFF" w:themeFill="background1"/>
-                            <w:vAlign w:val="center"/>
-                          </w:tcPr>
-                          <w:p>
-                            <w:pPr>
-                              <w:pStyle w:val="Geenafstand"/>
-                              <w:jc w:val="both"/>
-                              <w:cnfStyle w:val="000000100000" w:firstRow="0" w:lastRow="0" w:firstColumn="0" w:lastColumn="0" w:oddVBand="0" w:evenVBand="0" w:oddHBand="1" w:evenHBand="0" w:firstRowFirstColumn="0" w:firstRowLastColumn="0" w:lastRowFirstColumn="0" w:lastRowLastColumn="0"/>
-                              <w:rPr>
-                                <w:rFonts w:ascii="Calibri" w:eastAsia="Noto Sans JP Regular" w:hAnsi="Calibri" w:cs="Calibri"/>
-                                <w:sz w:val="25"/>
-                                <w:szCs w:val="25"/>
-                              </w:rPr>
-                            </w:pPr>
-                            <w:r>
-                              <w:rPr>
-                                <w:rFonts w:ascii="Calibri" w:eastAsia="Noto Sans JP Regular" w:hAnsi="Calibri" w:cs="Calibri"/>
-                                <w:sz w:val="25"/>
-                                <w:szCs w:val="25"/>
-                              </w:rPr>
-                              <w:t xml:space="preserve">+++reis+++</w:t>
-                            </w:r>
-                          </w:p>
-                        </w:tc>
-                        <w:tc>
-                          <w:tcPr>
-                            <w:tcW w:w="6508" w:type="dxa"/>
-                            <w:tcBorders>
-                              <w:bottom w:val="single" w:sz="4" w:space="0" w:color="auto"/>
-                            </w:tcBorders>
-                            <w:shd w:val="clear" w:color="auto" w:fill="FFFFFF" w:themeFill="background1"/>
-                            <w:vAlign w:val="center"/>
-                          </w:tcPr>
-                          <w:p>
-                            <w:pPr>
-                              <w:pStyle w:val="Geenafstand"/>
-                              <w:jc w:val="both"/>
-                              <w:cnfStyle w:val="000000100000" w:firstRow="0" w:lastRow="0" w:firstColumn="0" w:lastColumn="0" w:oddVBand="0" w:evenVBand="0" w:oddHBand="1" w:evenHBand="0" w:firstRowFirstColumn="0" w:firstRowLastColumn="0" w:lastRowFirstColumn="0" w:lastRowLastColumn="0"/>
-                              <w:rPr>
-                                <w:rFonts w:ascii="Calibri" w:eastAsia="Noto Sans JP Regular" w:hAnsi="Calibri" w:cs="Calibri"/>
-                                <w:sz w:val="25"/>
-                                <w:szCs w:val="25"/>
-                              </w:rPr>
-                            </w:pPr>
-                            <w:r>
-                              <w:rPr>
-                                <w:rFonts w:ascii="Calibri" w:eastAsia="Noto Sans JP Regular" w:hAnsi="Calibri" w:cs="Calibri"/>
-                                <w:sz w:val="25"/>
-                                <w:szCs w:val="25"/>
-                              </w:rPr>
-                              <w:t xml:space="preserve">Totaal: </w:t>
-                            </w:r>
-                            <w:r>
-                              <w:rPr>
-                                <w:rFonts w:ascii="Calibri" w:eastAsia="Noto Sans JP Regular" w:hAnsi="Calibri" w:cs="Calibri"/>
-                                <w:sz w:val="25"/>
-                                <w:szCs w:val="25"/>
-                              </w:rPr>
-                              <w:t>178</w:t>
-                            </w:r>
-                            <w:r>
-                              <w:rPr>
-                                <w:rFonts w:ascii="Calibri" w:eastAsia="Noto Sans JP Regular" w:hAnsi="Calibri" w:cs="Calibri"/>
-                                <w:sz w:val="25"/>
-                                <w:szCs w:val="25"/>
-                              </w:rPr>
-                              <w:t xml:space="preserve"> km. / Totaal: </w:t>
-                            </w:r>
-                            <w:r>
-                              <w:rPr>
-                                <w:rFonts w:ascii="Calibri" w:eastAsia="Noto Sans JP Regular" w:hAnsi="Calibri" w:cs="Calibri"/>
-                                <w:sz w:val="25"/>
-                                <w:szCs w:val="25"/>
-                              </w:rPr>
-                              <w:t>190</w:t>
-                            </w:r>
-                            <w:r>
-                              <w:rPr>
-                                <w:rFonts w:ascii="Calibri" w:eastAsia="Noto Sans JP Regular" w:hAnsi="Calibri" w:cs="Calibri"/>
-                                <w:sz w:val="25"/>
-                                <w:szCs w:val="25"/>
-                              </w:rPr>
-                              <w:t xml:space="preserve"> min. (</w:t>
-                            </w:r>
-                            <w:r>
-                              <w:rPr>
-                                <w:rFonts w:ascii="Calibri" w:eastAsia="Noto Sans JP Regular" w:hAnsi="Calibri" w:cs="Calibri"/>
-                                <w:sz w:val="25"/>
-                                <w:szCs w:val="25"/>
-                              </w:rPr>
-                              <w:t>100</w:t>
-                            </w:r>
-                            <w:r>
-                              <w:rPr>
-                                <w:rFonts w:ascii="Calibri" w:eastAsia="Noto Sans JP Regular" w:hAnsi="Calibri" w:cs="Calibri"/>
-                                <w:sz w:val="25"/>
-                                <w:szCs w:val="25"/>
-                              </w:rPr>
-                              <w:t xml:space="preserve"> min. factureren)</w:t>
-                            </w:r>
-                          </w:p>
-                        </w:tc>
-                      </w:tr>
-                      <w:tr>
-                        <w:trPr>
-                          <w:cnfStyle w:val="000000100000" w:firstRow="0" w:lastRow="0" w:firstColumn="0" w:lastColumn="0" w:oddVBand="0" w:evenVBand="0" w:oddHBand="1" w:evenHBand="0" w:firstRowFirstColumn="0" w:firstRowLastColumn="0" w:lastRowFirstColumn="0" w:lastRowLastColumn="0"/>
-                          <w:trHeight w:val="539"/>
-                        </w:trPr>
-                        <w:tc>
-                          <w:tcPr>
-                            <w:cnfStyle w:val="001000000000" w:firstRow="0" w:lastRow="0" w:firstColumn="1" w:lastColumn="0" w:oddVBand="0" w:evenVBand="0" w:oddHBand="0" w:evenHBand="0" w:firstRowFirstColumn="0" w:firstRowLastColumn="0" w:lastRowFirstColumn="0" w:lastRowLastColumn="0"/>
-                            <w:tcW w:w="2693" w:type="dxa"/>
-                            <w:tcBorders>
-                              <w:bottom w:val="single" w:sz="4" w:space="0" w:color="auto"/>
-                            </w:tcBorders>
-                            <w:vAlign w:val="center"/>
-                          </w:tcPr>
-                          <w:p>
-                            <w:pPr>
-                              <w:pStyle w:val="Geenafstand"/>
-                              <w:jc w:val="both"/>
-                              <w:rPr>
-                                <w:rFonts w:ascii="Calibri" w:eastAsia="Noto Sans JP Regular" w:hAnsi="Calibri" w:cs="Calibri"/>
-                                <w:sz w:val="25"/>
-                                <w:szCs w:val="25"/>
-                              </w:rPr>
-                            </w:pPr>
-                            <w:r>
-                              <w:rPr>
-                                <w:rFonts w:ascii="Calibri" w:eastAsia="Noto Sans JP Regular" w:hAnsi="Calibri" w:cs="Calibri"/>
-                                <w:sz w:val="25"/>
-                                <w:szCs w:val="25"/>
-                              </w:rPr>
-                              <w:t xml:space="preserve">Contactpersoon</w:t>
-                            </w:r>
-                          </w:p>
-                        </w:tc>
-                        <w:tc>
-                          <w:tcPr>
-                            <w:tcW w:w="6508" w:type="dxa"/>
-                            <w:tcBorders>
-                              <w:bottom w:val="single" w:sz="4" w:space="0" w:color="auto"/>
-                            </w:tcBorders>
-                            <w:shd w:val="clear" w:color="auto" w:fill="FFFFFF" w:themeFill="background1"/>
-                            <w:vAlign w:val="center"/>
-                          </w:tcPr>
-                          <w:p>
-                            <w:pPr>
-                              <w:pStyle w:val="Geenafstand"/>
-                              <w:jc w:val="both"/>
-                              <w:cnfStyle w:val="000000100000" w:firstRow="0" w:lastRow="0" w:firstColumn="0" w:lastColumn="0" w:oddVBand="0" w:evenVBand="0" w:oddHBand="1" w:evenHBand="0" w:firstRowFirstColumn="0" w:firstRowLastColumn="0" w:lastRowFirstColumn="0" w:lastRowLastColumn="0"/>
-                              <w:rPr>
-                                <w:rFonts w:ascii="Calibri" w:eastAsia="Noto Sans JP Regular" w:hAnsi="Calibri" w:cs="Calibri"/>
-                                <w:sz w:val="25"/>
-                                <w:szCs w:val="25"/>
-                              </w:rPr>
-                            </w:pPr>
-                            <w:r>
-                              <w:rPr>
-                                <w:rFonts w:ascii="Calibri" w:eastAsia="Noto Sans JP Regular" w:hAnsi="Calibri" w:cs="Calibri"/>
-                                <w:sz w:val="25"/>
-                                <w:szCs w:val="25"/>
-                              </w:rPr>
-                              <w:fldChar w:fldCharType="begin"/>
-                              <w:t xml:space="preserve">+++contactpersoon+++</w:t>
-                            </w:r>
-                          </w:p>
-                        </w:tc>
-                        <w:tc>
-                          <w:tcPr>
-                            <w:tcW w:w="6508" w:type="dxa"/>
-                            <w:tcBorders>
-                              <w:bottom w:val="single" w:sz="4" w:space="0" w:color="auto"/>
-                            </w:tcBorders>
-                            <w:shd w:val="clear" w:color="auto" w:fill="FFFFFF" w:themeFill="background1"/>
-                            <w:vAlign w:val="center"/>
-                          </w:tcPr>
-                          <w:p>
-                            <w:pPr>
-                              <w:pStyle w:val="Geenafstand"/>
-                              <w:jc w:val="both"/>
-                              <w:cnfStyle w:val="000000100000" w:firstRow="0" w:lastRow="0" w:firstColumn="0" w:lastColumn="0" w:oddVBand="0" w:evenVBand="0" w:oddHBand="1" w:evenHBand="0" w:firstRowFirstColumn="0" w:firstRowLastColumn="0" w:lastRowFirstColumn="0" w:lastRowLastColumn="0"/>
-                              <w:rPr>
-                                <w:rFonts w:ascii="Calibri" w:eastAsia="Noto Sans JP Regular" w:hAnsi="Calibri" w:cs="Calibri"/>
-                                <w:sz w:val="25"/>
-                                <w:szCs w:val="25"/>
-                                <w:highlight w:val="yellow"/>
-                              </w:rPr>
-                            </w:pPr>
-                            <w:r>
-                              <w:rPr>
-                                <w:rFonts w:ascii="Calibri" w:eastAsia="Noto Sans JP Regular" w:hAnsi="Calibri" w:cs="Calibri"/>
-                                <w:sz w:val="25"/>
-                                <w:szCs w:val="25"/>
-                              </w:rPr>
-                              <w:t xml:space="preserve">Kim Sanders / </w:t>
-                            </w:r>
-                            <w:r>
-                              <w:rPr>
-                                <w:rFonts w:ascii="Calibri" w:eastAsia="Noto Sans JP Regular" w:hAnsi="Calibri" w:cs="Calibri"/>
-                                <w:sz w:val="25"/>
-                                <w:szCs w:val="25"/>
-                                <w:highlight w:val="yellow"/>
-                              </w:rPr>
-                              <w:t>telefoonnummer</w:t>
-                            </w:r>
-                            <w:r>
-                              <w:rPr>
-                                <w:rFonts w:ascii="Calibri" w:eastAsia="Noto Sans JP Regular" w:hAnsi="Calibri" w:cs="Calibri"/>
-                                <w:sz w:val="25"/>
-                                <w:szCs w:val="25"/>
-                              </w:rPr>
-                              <w:t xml:space="preserve"> </w:t>
+                              <w:t xml:space="preserve">+++evaluatie+++</w:t>
                             </w:r>
                           </w:p>
                         </w:tc>
@@ -4667,11 +3768,11 @@
                             </w:pPr>
                             <w:r>
                               <w:rPr>
-                                <w:rFonts w:eastAsia="Noto Sans JP Regular" w:cs="Calibri"/>
+                                <w:rFonts w:ascii="Calibri" w:eastAsia="Noto Sans JP Regular" w:hAnsi="Calibri" w:cs="Calibri"/>
                                 <w:sz w:val="25"/>
                                 <w:szCs w:val="25"/>
                               </w:rPr>
-                              <w:t xml:space="preserve">Klantcontactmoment</w:t>
+                              <w:t xml:space="preserve">IE-code</w:t>
                             </w:r>
                           </w:p>
                         </w:tc>
@@ -4686,47 +3787,22 @@
                           </w:tcPr>
                           <w:p>
                             <w:pPr>
+                              <w:pStyle w:val="Geenafstand"/>
                               <w:cnfStyle w:val="000000000000" w:firstRow="0" w:lastRow="0" w:firstColumn="0" w:lastColumn="0" w:oddVBand="0" w:evenVBand="0" w:oddHBand="0" w:evenHBand="0" w:firstRowFirstColumn="0" w:firstRowLastColumn="0" w:lastRowFirstColumn="0" w:lastRowLastColumn="0"/>
                               <w:rPr>
-                                <w:bCs/>
-                                <w:szCs w:val="25"/>
-                                <w:highlight w:val="yellow"/>
+                                <w:rFonts w:ascii="Calibri" w:eastAsia="Noto Sans JP Regular" w:hAnsi="Calibri" w:cs="Calibri"/>
+                                <w:sz w:val="25"/>
+                                <w:szCs w:val="25"/>
                               </w:rPr>
                             </w:pPr>
                             <w:r>
                               <w:rPr>
-                                <w:bCs/>
-                                <w:szCs w:val="25"/>
-                                <w:highlight w:val="yellow"/>
-                              </w:rPr>
-                              <w:t xml:space="preserve">+++klantcontactmoment+++</w:t>
-                            </w:r>
-                          </w:p>
-                        </w:tc>
-                        <w:tc>
-                          <w:tcPr>
-                            <w:tcW w:w="6508" w:type="dxa"/>
-                            <w:tcBorders>
-                              <w:bottom w:val="single" w:sz="4" w:space="0" w:color="auto"/>
-                            </w:tcBorders>
-                            <w:shd w:val="clear" w:color="auto" w:fill="FFFFFF" w:themeFill="background1"/>
-                            <w:vAlign w:val="center"/>
-                          </w:tcPr>
-                          <w:p>
-                            <w:pPr>
-                              <w:cnfStyle w:val="000000000000" w:firstRow="0" w:lastRow="0" w:firstColumn="0" w:lastColumn="0" w:oddVBand="0" w:evenVBand="0" w:oddHBand="0" w:evenHBand="0" w:firstRowFirstColumn="0" w:firstRowLastColumn="0" w:lastRowFirstColumn="0" w:lastRowLastColumn="0"/>
-                              <w:rPr>
-                                <w:bCs/>
-                                <w:szCs w:val="25"/>
-                                <w:highlight w:val="yellow"/>
-                              </w:rPr>
-                            </w:pPr>
-                            <w:r>
-                              <w:rPr>
-                                <w:bCs/>
-                                <w:szCs w:val="25"/>
-                              </w:rPr>
-                              <w:t>Contact via MS Teams</w:t>
+                                <w:rFonts w:ascii="Calibri" w:eastAsia="Noto Sans JP Regular" w:hAnsi="Calibri" w:cs="Calibri"/>
+                                <w:sz w:val="25"/>
+                                <w:szCs w:val="25"/>
+                              </w:rPr>
+                              <w:fldChar w:fldCharType="begin"/>
+                              <w:t xml:space="preserve">+++iecode+++</w:t>
                             </w:r>
                           </w:p>
                         </w:tc>
@@ -4761,211 +3837,6 @@
                                 <w:sz w:val="25"/>
                                 <w:szCs w:val="25"/>
                               </w:rPr>
-                              <w:t xml:space="preserve">Evaluatie deelnemers</w:t>
-                            </w:r>
-                          </w:p>
-                        </w:tc>
-                        <w:tc>
-                          <w:tcPr>
-                            <w:tcW w:w="6508" w:type="dxa"/>
-                            <w:tcBorders>
-                              <w:top w:val="single" w:sz="4" w:space="0" w:color="auto"/>
-                            </w:tcBorders>
-                            <w:shd w:val="clear" w:color="auto" w:fill="FFFFFF" w:themeFill="background1"/>
-                            <w:vAlign w:val="center"/>
-                          </w:tcPr>
-                          <w:p>
-                            <w:pPr>
-                              <w:pStyle w:val="Geenafstand"/>
-                              <w:cnfStyle w:val="000000100000" w:firstRow="0" w:lastRow="0" w:firstColumn="0" w:lastColumn="0" w:oddVBand="0" w:evenVBand="0" w:oddHBand="1" w:evenHBand="0" w:firstRowFirstColumn="0" w:firstRowLastColumn="0" w:lastRowFirstColumn="0" w:lastRowLastColumn="0"/>
-                              <w:rPr>
-                                <w:rFonts w:ascii="Calibri" w:eastAsia="Noto Sans JP Regular" w:hAnsi="Calibri" w:cs="Calibri"/>
-                                <w:sz w:val="25"/>
-                                <w:szCs w:val="25"/>
-                              </w:rPr>
-                            </w:pPr>
-                            <w:r>
-                              <w:rPr>
-                                <w:rFonts w:ascii="Calibri" w:eastAsia="Noto Sans JP Regular" w:hAnsi="Calibri" w:cs="Calibri"/>
-                                <w:sz w:val="25"/>
-                                <w:szCs w:val="25"/>
-                                <w:highlight w:val="yellow"/>
-                              </w:rPr>
-                              <w:t xml:space="preserve">+++evaluatie+++</w:t>
-                            </w:r>
-                          </w:p>
-                        </w:tc>
-                        <w:tc>
-                          <w:tcPr>
-                            <w:tcW w:w="6508" w:type="dxa"/>
-                            <w:tcBorders>
-                              <w:top w:val="single" w:sz="4" w:space="0" w:color="auto"/>
-                            </w:tcBorders>
-                            <w:shd w:val="clear" w:color="auto" w:fill="FFFFFF" w:themeFill="background1"/>
-                            <w:vAlign w:val="center"/>
-                          </w:tcPr>
-                          <w:p>
-                            <w:pPr>
-                              <w:pStyle w:val="Geenafstand"/>
-                              <w:cnfStyle w:val="000000100000" w:firstRow="0" w:lastRow="0" w:firstColumn="0" w:lastColumn="0" w:oddVBand="0" w:evenVBand="0" w:oddHBand="1" w:evenHBand="0" w:firstRowFirstColumn="0" w:firstRowLastColumn="0" w:lastRowFirstColumn="0" w:lastRowLastColumn="0"/>
-                              <w:rPr>
-                                <w:rFonts w:ascii="Calibri" w:eastAsia="Noto Sans JP Regular" w:hAnsi="Calibri" w:cs="Calibri"/>
-                                <w:sz w:val="25"/>
-                                <w:szCs w:val="25"/>
-                              </w:rPr>
-                            </w:pPr>
-                            <w:r>
-                              <w:rPr>
-                                <w:rFonts w:ascii="Calibri" w:eastAsia="Noto Sans JP Regular" w:hAnsi="Calibri" w:cs="Calibri"/>
-                                <w:sz w:val="25"/>
-                                <w:szCs w:val="25"/>
-                              </w:rPr>
-                              <w:t>Ja, gebruik de QR code</w:t>
-                            </w:r>
-                          </w:p>
-                        </w:tc>
-                      </w:tr>
-                      <w:tr>
-                        <w:trPr>
-                          <w:trHeight w:val="539"/>
-                        </w:trPr>
-                        <w:tc>
-                          <w:tcPr>
-                            <w:cnfStyle w:val="001000000000" w:firstRow="0" w:lastRow="0" w:firstColumn="1" w:lastColumn="0" w:oddVBand="0" w:evenVBand="0" w:oddHBand="0" w:evenHBand="0" w:firstRowFirstColumn="0" w:firstRowLastColumn="0" w:lastRowFirstColumn="0" w:lastRowLastColumn="0"/>
-                            <w:tcW w:w="2693" w:type="dxa"/>
-                            <w:tcBorders>
-                              <w:bottom w:val="single" w:sz="4" w:space="0" w:color="auto"/>
-                            </w:tcBorders>
-                            <w:shd w:val="clear" w:color="auto" w:fill="F2F2F2" w:themeFill="background1" w:themeFillShade="F2"/>
-                            <w:vAlign w:val="center"/>
-                          </w:tcPr>
-                          <w:p>
-                            <w:pPr>
-                              <w:pStyle w:val="Geenafstand"/>
-                              <w:jc w:val="both"/>
-                              <w:rPr>
-                                <w:rFonts w:ascii="Calibri" w:eastAsia="Noto Sans JP Regular" w:hAnsi="Calibri" w:cs="Calibri"/>
-                                <w:sz w:val="25"/>
-                                <w:szCs w:val="25"/>
-                              </w:rPr>
-                            </w:pPr>
-                            <w:r>
-                              <w:rPr>
-                                <w:rFonts w:ascii="Calibri" w:eastAsia="Noto Sans JP Regular" w:hAnsi="Calibri" w:cs="Calibri"/>
-                                <w:sz w:val="25"/>
-                                <w:szCs w:val="25"/>
-                              </w:rPr>
-                              <w:t xml:space="preserve">IE-code</w:t>
-                            </w:r>
-                          </w:p>
-                        </w:tc>
-                        <w:tc>
-                          <w:tcPr>
-                            <w:tcW w:w="6508" w:type="dxa"/>
-                            <w:tcBorders>
-                              <w:bottom w:val="single" w:sz="4" w:space="0" w:color="auto"/>
-                            </w:tcBorders>
-                            <w:shd w:val="clear" w:color="auto" w:fill="FFFFFF" w:themeFill="background1"/>
-                            <w:vAlign w:val="center"/>
-                          </w:tcPr>
-                          <w:p>
-                            <w:pPr>
-                              <w:pStyle w:val="Geenafstand"/>
-                              <w:cnfStyle w:val="000000000000" w:firstRow="0" w:lastRow="0" w:firstColumn="0" w:lastColumn="0" w:oddVBand="0" w:evenVBand="0" w:oddHBand="0" w:evenHBand="0" w:firstRowFirstColumn="0" w:firstRowLastColumn="0" w:lastRowFirstColumn="0" w:lastRowLastColumn="0"/>
-                              <w:rPr>
-                                <w:rFonts w:ascii="Calibri" w:eastAsia="Noto Sans JP Regular" w:hAnsi="Calibri" w:cs="Calibri"/>
-                                <w:sz w:val="25"/>
-                                <w:szCs w:val="25"/>
-                              </w:rPr>
-                            </w:pPr>
-                            <w:r>
-                              <w:rPr>
-                                <w:rFonts w:ascii="Calibri" w:eastAsia="Noto Sans JP Regular" w:hAnsi="Calibri" w:cs="Calibri"/>
-                                <w:sz w:val="25"/>
-                                <w:szCs w:val="25"/>
-                              </w:rPr>
-                              <w:fldChar w:fldCharType="begin"/>
-                              <w:t xml:space="preserve">+++iecode+++</w:t>
-                            </w:r>
-                          </w:p>
-                        </w:tc>
-                        <w:tc>
-                          <w:tcPr>
-                            <w:tcW w:w="6508" w:type="dxa"/>
-                            <w:tcBorders>
-                              <w:bottom w:val="single" w:sz="4" w:space="0" w:color="auto"/>
-                            </w:tcBorders>
-                            <w:shd w:val="clear" w:color="auto" w:fill="FFFFFF" w:themeFill="background1"/>
-                            <w:vAlign w:val="center"/>
-                          </w:tcPr>
-                          <w:p>
-                            <w:pPr>
-                              <w:pStyle w:val="Geenafstand"/>
-                              <w:cnfStyle w:val="000000000000" w:firstRow="0" w:lastRow="0" w:firstColumn="0" w:lastColumn="0" w:oddVBand="0" w:evenVBand="0" w:oddHBand="0" w:evenHBand="0" w:firstRowFirstColumn="0" w:firstRowLastColumn="0" w:lastRowFirstColumn="0" w:lastRowLastColumn="0"/>
-                              <w:rPr>
-                                <w:rFonts w:ascii="Calibri" w:eastAsia="Noto Sans JP Regular" w:hAnsi="Calibri" w:cs="Calibri"/>
-                                <w:sz w:val="25"/>
-                                <w:szCs w:val="25"/>
-                              </w:rPr>
-                            </w:pPr>
-                            <w:r>
-                              <w:rPr>
-                                <w:rFonts w:ascii="Calibri" w:eastAsia="Noto Sans JP Regular" w:hAnsi="Calibri" w:cs="Calibri"/>
-                                <w:sz w:val="25"/>
-                                <w:szCs w:val="25"/>
-                              </w:rPr>
-                              <w:t xml:space="preserve">Sessie 1: </w:t>
-                            </w:r>
-                            <w:r>
-                              <w:rPr>
-                                <w:rFonts w:ascii="Calibri" w:eastAsia="Noto Sans JP Regular" w:hAnsi="Calibri" w:cs="Calibri"/>
-                                <w:sz w:val="25"/>
-                                <w:szCs w:val="25"/>
-                              </w:rPr>
-                              <w:t>260220</w:t>
-                            </w:r>
-                            <w:r>
-                              <w:rPr>
-                                <w:rFonts w:ascii="Calibri" w:eastAsia="Noto Sans JP Regular" w:hAnsi="Calibri" w:cs="Calibri"/>
-                                <w:sz w:val="25"/>
-                                <w:szCs w:val="25"/>
-                              </w:rPr>
-                              <w:br/>
-                              <w:t>Sessie 2: 260322</w:t>
-                            </w:r>
-                          </w:p>
-                        </w:tc>
-                      </w:tr>
-                      <w:tr>
-                        <w:trPr>
-                          <w:cnfStyle w:val="000000100000" w:firstRow="0" w:lastRow="0" w:firstColumn="0" w:lastColumn="0" w:oddVBand="0" w:evenVBand="0" w:oddHBand="1" w:evenHBand="0" w:firstRowFirstColumn="0" w:firstRowLastColumn="0" w:lastRowFirstColumn="0" w:lastRowLastColumn="0"/>
-                          <w:trHeight w:val="539"/>
-                        </w:trPr>
-                        <w:tc>
-                          <w:tcPr>
-                            <w:cnfStyle w:val="001000000000" w:firstRow="0" w:lastRow="0" w:firstColumn="1" w:lastColumn="0" w:oddVBand="0" w:evenVBand="0" w:oddHBand="0" w:evenHBand="0" w:firstRowFirstColumn="0" w:firstRowLastColumn="0" w:lastRowFirstColumn="0" w:lastRowLastColumn="0"/>
-                            <w:tcW w:w="2693" w:type="dxa"/>
-                            <w:tcBorders>
-                              <w:top w:val="single" w:sz="4" w:space="0" w:color="auto"/>
-                            </w:tcBorders>
-                            <w:vAlign w:val="center"/>
-                          </w:tcPr>
-                          <w:p>
-                            <w:pPr>
-                              <w:pStyle w:val="Geenafstand"/>
-                              <w:jc w:val="both"/>
-                              <w:rPr>
-                                <w:rFonts w:ascii="Calibri" w:eastAsia="Noto Sans JP Regular" w:hAnsi="Calibri" w:cs="Calibri"/>
-                                <w:sz w:val="25"/>
-                                <w:szCs w:val="25"/>
-                              </w:rPr>
-                            </w:pPr>
-                            <w:r>
-                              <w:rPr>
-                                <w:rFonts w:ascii="Calibri" w:eastAsia="Noto Sans JP Regular" w:hAnsi="Calibri" w:cs="Calibri"/>
-                                <w:sz w:val="25"/>
-                                <w:szCs w:val="25"/>
-                              </w:rPr>
                               <w:t xml:space="preserve">Trainingscode MC</w:t>
                             </w:r>
                           </w:p>
@@ -4996,35 +3867,6 @@
                               </w:rPr>
                               <w:fldChar w:fldCharType="begin"/>
                               <w:t xml:space="preserve">+++trainingscodeMc+++ &lt;-- Vergeet de Monday Challenges niet!</w:t>
-                            </w:r>
-                          </w:p>
-                        </w:tc>
-                        <w:tc>
-                          <w:tcPr>
-                            <w:tcW w:w="6508" w:type="dxa"/>
-                            <w:tcBorders>
-                              <w:top w:val="single" w:sz="4" w:space="0" w:color="auto"/>
-                            </w:tcBorders>
-                            <w:shd w:val="clear" w:color="auto" w:fill="FFFFFF" w:themeFill="background1"/>
-                            <w:vAlign w:val="center"/>
-                          </w:tcPr>
-                          <w:p>
-                            <w:pPr>
-                              <w:spacing w:line="240" w:lineRule="auto"/>
-                              <w:jc w:val="both"/>
-                              <w:cnfStyle w:val="000000100000" w:firstRow="0" w:lastRow="0" w:firstColumn="0" w:lastColumn="0" w:oddVBand="0" w:evenVBand="0" w:oddHBand="1" w:evenHBand="0" w:firstRowFirstColumn="0" w:firstRowLastColumn="0" w:lastRowFirstColumn="0" w:lastRowLastColumn="0"/>
-                              <w:rPr>
-                                <w:rFonts w:ascii="Aptos Narrow" w:hAnsi="Aptos Narrow"/>
-                                <w:color w:val="000000"/>
-                                <w:sz w:val="24"/>
-                              </w:rPr>
-                            </w:pPr>
-                            <w:r>
-                              <w:rPr>
-                                <w:rFonts w:eastAsia="Noto Sans JP Regular" w:cs="Calibri"/>
-                                <w:szCs w:val="25"/>
-                              </w:rPr>
-                              <w:t>IT-57 &lt;-- Vergeet de Monday Challenges niet!</w:t>
                             </w:r>
                           </w:p>
                         </w:tc>

</xml_diff>